<commit_message>
update script jump button
</commit_message>
<xml_diff>
--- a/Supplementary/文档/FA2SP HDM Edition说明文档.docx
+++ b/Supplementary/文档/FA2SP HDM Edition说明文档.docx
@@ -167,7 +167,14 @@
           <w:rFonts w:ascii="宋体" w:eastAsia="宋体" w:hAnsi="宋体" w:hint="eastAsia"/>
           <w:sz w:val="24"/>
         </w:rPr>
-        <w:t>11</w:t>
+        <w:t>1</w:t>
+      </w:r>
+      <w:r>
+        <w:rPr>
+          <w:rFonts w:ascii="宋体" w:eastAsia="宋体" w:hAnsi="宋体" w:hint="eastAsia"/>
+          <w:sz w:val="24"/>
+        </w:rPr>
+        <w:t>2</w:t>
       </w:r>
     </w:p>
     <w:p>
@@ -229,7 +236,7 @@
           <w:sz w:val="28"/>
           <w:szCs w:val="32"/>
         </w:rPr>
-        <w:t>11</w:t>
+        <w:t>1</w:t>
       </w:r>
       <w:r>
         <w:rPr>
@@ -239,6 +246,16 @@
           <w:sz w:val="28"/>
           <w:szCs w:val="32"/>
         </w:rPr>
+        <w:t>2</w:t>
+      </w:r>
+      <w:r>
+        <w:rPr>
+          <w:rFonts w:ascii="Times New Roman" w:eastAsia="宋体" w:hAnsi="Times New Roman" w:cs="Times New Roman" w:hint="eastAsia"/>
+          <w:b/>
+          <w:bCs/>
+          <w:sz w:val="28"/>
+          <w:szCs w:val="32"/>
+        </w:rPr>
         <w:t>)</w:t>
       </w:r>
     </w:p>
@@ -383,7 +400,19 @@
         <w:rPr>
           <w:rFonts w:ascii="Times New Roman" w:eastAsia="宋体" w:hAnsi="Times New Roman" w:cs="Times New Roman" w:hint="eastAsia"/>
         </w:rPr>
-        <w:t>可以在触发编辑器中预览音效、</w:t>
+        <w:t>可以在触发编辑器</w:t>
+      </w:r>
+      <w:r>
+        <w:rPr>
+          <w:rFonts w:ascii="Times New Roman" w:eastAsia="宋体" w:hAnsi="Times New Roman" w:cs="Times New Roman" w:hint="eastAsia"/>
+        </w:rPr>
+        <w:t>、脚本编辑器</w:t>
+      </w:r>
+      <w:r>
+        <w:rPr>
+          <w:rFonts w:ascii="Times New Roman" w:eastAsia="宋体" w:hAnsi="Times New Roman" w:cs="Times New Roman" w:hint="eastAsia"/>
+        </w:rPr>
+        <w:t>中预览音效、</w:t>
       </w:r>
       <w:r>
         <w:rPr>
@@ -50653,7 +50682,7 @@
         <v:path o:extrusionok="f" gradientshapeok="t" o:connecttype="rect"/>
         <o:lock v:ext="edit" aspectratio="t"/>
       </v:shapetype>
-      <v:shape id="_x0000_i1030" type="#_x0000_t75" style="width:11.55pt;height:11.55pt" o:bullet="t">
+      <v:shape id="_x0000_i1031" type="#_x0000_t75" style="width:11.55pt;height:11.55pt" o:bullet="t">
         <v:imagedata r:id="rId1" o:title="mso9A9A"/>
       </v:shape>
     </w:pict>

</xml_diff>

<commit_message>
add expand & collapse button in viewobjects
</commit_message>
<xml_diff>
--- a/Supplementary/文档/FA2SP HDM Edition说明文档.docx
+++ b/Supplementary/文档/FA2SP HDM Edition说明文档.docx
@@ -432,6 +432,36 @@
         <w:pStyle w:val="a9"/>
         <w:numPr>
           <w:ilvl w:val="0"/>
+          <w:numId w:val="11"/>
+        </w:numPr>
+        <w:rPr>
+          <w:rFonts w:ascii="Times New Roman" w:eastAsia="宋体" w:hAnsi="Times New Roman" w:cs="Times New Roman"/>
+        </w:rPr>
+      </w:pPr>
+      <w:r>
+        <w:rPr>
+          <w:rFonts w:ascii="Times New Roman" w:eastAsia="宋体" w:hAnsi="Times New Roman" w:cs="Times New Roman" w:hint="eastAsia"/>
+        </w:rPr>
+        <w:t>物品浏览器新增右键菜单，可以展开</w:t>
+      </w:r>
+      <w:r>
+        <w:rPr>
+          <w:rFonts w:ascii="Times New Roman" w:eastAsia="宋体" w:hAnsi="Times New Roman" w:cs="Times New Roman" w:hint="eastAsia"/>
+        </w:rPr>
+        <w:t>/</w:t>
+      </w:r>
+      <w:r>
+        <w:rPr>
+          <w:rFonts w:ascii="Times New Roman" w:eastAsia="宋体" w:hAnsi="Times New Roman" w:cs="Times New Roman" w:hint="eastAsia"/>
+        </w:rPr>
+        <w:t>收起全部节点，或滚动到最上或最下</w:t>
+      </w:r>
+    </w:p>
+    <w:p>
+      <w:pPr>
+        <w:pStyle w:val="a9"/>
+        <w:numPr>
+          <w:ilvl w:val="0"/>
           <w:numId w:val="10"/>
         </w:numPr>
         <w:rPr>
@@ -868,14 +898,8 @@
         <w:rPr>
           <w:rFonts w:ascii="Times New Roman" w:eastAsia="宋体" w:hAnsi="Times New Roman" w:cs="Times New Roman" w:hint="eastAsia"/>
         </w:rPr>
-        <w:t>增加“地图单位”菜单，可以显示所有地图上科技类型的基本属性，单击跳</w:t>
-      </w:r>
-      <w:r>
-        <w:rPr>
-          <w:rFonts w:ascii="Times New Roman" w:eastAsia="宋体" w:hAnsi="Times New Roman" w:cs="Times New Roman" w:hint="eastAsia"/>
-        </w:rPr>
         <w:lastRenderedPageBreak/>
-        <w:t>转，双击打开属性窗口（作者：</w:t>
+        <w:t>增加“地图单位”菜单，可以显示所有地图上科技类型的基本属性，单击跳转，双击打开属性窗口（作者：</w:t>
       </w:r>
       <w:r>
         <w:rPr>
@@ -2083,6 +2107,7 @@
         <w:rPr>
           <w:rFonts w:ascii="Times New Roman" w:eastAsia="宋体" w:hAnsi="Times New Roman" w:cs="Times New Roman" w:hint="eastAsia"/>
         </w:rPr>
+        <w:lastRenderedPageBreak/>
         <w:t>修复启用建筑筛选时无法隐藏阴影的</w:t>
       </w:r>
       <w:r>
@@ -2107,903 +2132,896 @@
         <w:rPr>
           <w:rFonts w:ascii="Times New Roman" w:eastAsia="宋体" w:hAnsi="Times New Roman" w:cs="Times New Roman" w:hint="eastAsia"/>
         </w:rPr>
+        <w:t>查找引用窗口增加</w:t>
+      </w:r>
+      <w:r>
+        <w:rPr>
+          <w:rFonts w:ascii="Times New Roman" w:eastAsia="宋体" w:hAnsi="Times New Roman" w:cs="Times New Roman" w:hint="eastAsia"/>
+        </w:rPr>
+        <w:t>跟随活动窗口</w:t>
+      </w:r>
+      <w:r>
+        <w:rPr>
+          <w:rFonts w:ascii="Times New Roman" w:eastAsia="宋体" w:hAnsi="Times New Roman" w:cs="Times New Roman" w:hint="eastAsia"/>
+        </w:rPr>
+        <w:t>选项，勾选后可以实时根据活动窗口切换内容</w:t>
+      </w:r>
+    </w:p>
+    <w:p>
+      <w:pPr>
+        <w:pStyle w:val="a9"/>
+        <w:numPr>
+          <w:ilvl w:val="0"/>
+          <w:numId w:val="50"/>
+        </w:numPr>
+        <w:rPr>
+          <w:rFonts w:ascii="Times New Roman" w:eastAsia="宋体" w:hAnsi="Times New Roman" w:cs="Times New Roman"/>
+        </w:rPr>
+      </w:pPr>
+      <w:r>
+        <w:rPr>
+          <w:rFonts w:ascii="Times New Roman" w:eastAsia="宋体" w:hAnsi="Times New Roman" w:cs="Times New Roman" w:hint="eastAsia"/>
+        </w:rPr>
+        <w:t>修复修改作战小队名称后，</w:t>
+      </w:r>
+      <w:r>
+        <w:rPr>
+          <w:rFonts w:ascii="Times New Roman" w:eastAsia="宋体" w:hAnsi="Times New Roman" w:cs="Times New Roman" w:hint="eastAsia"/>
+        </w:rPr>
+        <w:t>ai</w:t>
+      </w:r>
+      <w:r>
+        <w:rPr>
+          <w:rFonts w:ascii="Times New Roman" w:eastAsia="宋体" w:hAnsi="Times New Roman" w:cs="Times New Roman" w:hint="eastAsia"/>
+        </w:rPr>
+        <w:t>触发编辑器的小队</w:t>
+      </w:r>
+      <w:r>
+        <w:rPr>
+          <w:rFonts w:ascii="Times New Roman" w:eastAsia="宋体" w:hAnsi="Times New Roman" w:cs="Times New Roman" w:hint="eastAsia"/>
+        </w:rPr>
+        <w:t>#2</w:t>
+      </w:r>
+      <w:r>
+        <w:rPr>
+          <w:rFonts w:ascii="Times New Roman" w:eastAsia="宋体" w:hAnsi="Times New Roman" w:cs="Times New Roman" w:hint="eastAsia"/>
+        </w:rPr>
+        <w:t>显示错误的</w:t>
+      </w:r>
+      <w:r>
+        <w:rPr>
+          <w:rFonts w:ascii="Times New Roman" w:eastAsia="宋体" w:hAnsi="Times New Roman" w:cs="Times New Roman" w:hint="eastAsia"/>
+        </w:rPr>
+        <w:t>bug</w:t>
+      </w:r>
+    </w:p>
+    <w:p>
+      <w:pPr>
+        <w:pStyle w:val="a9"/>
+        <w:numPr>
+          <w:ilvl w:val="0"/>
+          <w:numId w:val="50"/>
+        </w:numPr>
+        <w:rPr>
+          <w:rFonts w:ascii="Times New Roman" w:eastAsia="宋体" w:hAnsi="Times New Roman" w:cs="Times New Roman"/>
+        </w:rPr>
+      </w:pPr>
+      <w:r>
+        <w:rPr>
+          <w:rFonts w:ascii="Times New Roman" w:eastAsia="宋体" w:hAnsi="Times New Roman" w:cs="Times New Roman" w:hint="eastAsia"/>
+        </w:rPr>
+        <w:t>触发、小队等编辑器支持为</w:t>
+      </w:r>
+      <w:r>
+        <w:rPr>
+          <w:rFonts w:ascii="Times New Roman" w:eastAsia="宋体" w:hAnsi="Times New Roman" w:cs="Times New Roman" w:hint="eastAsia"/>
+        </w:rPr>
+        <w:t>ID</w:t>
+      </w:r>
+      <w:r>
+        <w:rPr>
+          <w:rFonts w:ascii="Times New Roman" w:eastAsia="宋体" w:hAnsi="Times New Roman" w:cs="Times New Roman" w:hint="eastAsia"/>
+        </w:rPr>
+        <w:t>染色，双击拖拽小点即可设置颜色</w:t>
+      </w:r>
+    </w:p>
+    <w:p>
+      <w:pPr>
+        <w:pStyle w:val="a9"/>
+        <w:numPr>
+          <w:ilvl w:val="0"/>
+          <w:numId w:val="50"/>
+        </w:numPr>
+        <w:rPr>
+          <w:rFonts w:ascii="Times New Roman" w:eastAsia="宋体" w:hAnsi="Times New Roman" w:cs="Times New Roman"/>
+        </w:rPr>
+      </w:pPr>
+      <w:r>
+        <w:rPr>
+          <w:rFonts w:ascii="Times New Roman" w:eastAsia="宋体" w:hAnsi="Times New Roman" w:cs="Times New Roman" w:hint="eastAsia"/>
+        </w:rPr>
+        <w:t>单元标记支持笔刷大小放置</w:t>
+      </w:r>
+    </w:p>
+    <w:p>
+      <w:pPr>
+        <w:pStyle w:val="a9"/>
+        <w:numPr>
+          <w:ilvl w:val="0"/>
+          <w:numId w:val="50"/>
+        </w:numPr>
+        <w:rPr>
+          <w:rFonts w:ascii="Times New Roman" w:eastAsia="宋体" w:hAnsi="Times New Roman" w:cs="Times New Roman"/>
+        </w:rPr>
+      </w:pPr>
+      <w:r>
+        <w:rPr>
+          <w:rFonts w:ascii="Times New Roman" w:eastAsia="宋体" w:hAnsi="Times New Roman" w:cs="Times New Roman" w:hint="eastAsia"/>
+        </w:rPr>
+        <w:t>增加新的</w:t>
+      </w:r>
+      <w:r>
+        <w:rPr>
+          <w:rFonts w:ascii="Times New Roman" w:eastAsia="宋体" w:hAnsi="Times New Roman" w:cs="Times New Roman" w:hint="eastAsia"/>
+        </w:rPr>
+        <w:t>lua</w:t>
+      </w:r>
+      <w:r>
+        <w:rPr>
+          <w:rFonts w:ascii="Times New Roman" w:eastAsia="宋体" w:hAnsi="Times New Roman" w:cs="Times New Roman" w:hint="eastAsia"/>
+        </w:rPr>
+        <w:t>脚本，由</w:t>
+      </w:r>
+      <w:r>
+        <w:rPr>
+          <w:rFonts w:ascii="Times New Roman" w:eastAsia="宋体" w:hAnsi="Times New Roman" w:cs="Times New Roman" w:hint="eastAsia"/>
+        </w:rPr>
+        <w:t>AUY</w:t>
+      </w:r>
+      <w:r>
+        <w:rPr>
+          <w:rFonts w:ascii="Times New Roman" w:eastAsia="宋体" w:hAnsi="Times New Roman" w:cs="Times New Roman" w:hint="eastAsia"/>
+        </w:rPr>
+        <w:t>制作</w:t>
+      </w:r>
+    </w:p>
+    <w:p>
+      <w:pPr>
+        <w:pStyle w:val="a9"/>
+        <w:numPr>
+          <w:ilvl w:val="0"/>
+          <w:numId w:val="50"/>
+        </w:numPr>
+        <w:rPr>
+          <w:rFonts w:ascii="Times New Roman" w:eastAsia="宋体" w:hAnsi="Times New Roman" w:cs="Times New Roman"/>
+        </w:rPr>
+      </w:pPr>
+      <w:r>
+        <w:rPr>
+          <w:rFonts w:ascii="Times New Roman" w:eastAsia="宋体" w:hAnsi="Times New Roman" w:cs="Times New Roman" w:hint="eastAsia"/>
+        </w:rPr>
+        <w:t>修复跨地图类型粘贴时地形转换部分失效的</w:t>
+      </w:r>
+      <w:r>
+        <w:rPr>
+          <w:rFonts w:ascii="Times New Roman" w:eastAsia="宋体" w:hAnsi="Times New Roman" w:cs="Times New Roman" w:hint="eastAsia"/>
+        </w:rPr>
+        <w:t>bug</w:t>
+      </w:r>
+    </w:p>
+    <w:p>
+      <w:pPr>
+        <w:pStyle w:val="a9"/>
+        <w:numPr>
+          <w:ilvl w:val="0"/>
+          <w:numId w:val="50"/>
+        </w:numPr>
+        <w:rPr>
+          <w:rFonts w:ascii="Times New Roman" w:eastAsia="宋体" w:hAnsi="Times New Roman" w:cs="Times New Roman"/>
+        </w:rPr>
+      </w:pPr>
+      <w:r>
+        <w:rPr>
+          <w:rFonts w:ascii="Times New Roman" w:eastAsia="宋体" w:hAnsi="Times New Roman" w:cs="Times New Roman" w:hint="eastAsia"/>
+        </w:rPr>
+        <w:t>可以记录不同鼠标操作的笔刷大小，并在切换时自动还原，详见</w:t>
+      </w:r>
+      <w:r>
+        <w:rPr>
+          <w:rFonts w:ascii="Times New Roman" w:eastAsia="宋体" w:hAnsi="Times New Roman" w:cs="Times New Roman" w:hint="eastAsia"/>
+        </w:rPr>
+        <w:t>RecordBrushSizeHistory</w:t>
+      </w:r>
+    </w:p>
+    <w:p>
+      <w:pPr>
+        <w:pStyle w:val="a9"/>
+        <w:numPr>
+          <w:ilvl w:val="0"/>
+          <w:numId w:val="50"/>
+        </w:numPr>
+        <w:rPr>
+          <w:rFonts w:ascii="Times New Roman" w:eastAsia="宋体" w:hAnsi="Times New Roman" w:cs="Times New Roman"/>
+        </w:rPr>
+      </w:pPr>
+      <w:r>
+        <w:rPr>
+          <w:rFonts w:ascii="Times New Roman" w:eastAsia="宋体" w:hAnsi="Times New Roman" w:cs="Times New Roman" w:hint="eastAsia"/>
+        </w:rPr>
+        <w:t>增加</w:t>
+      </w:r>
+      <w:r>
+        <w:rPr>
+          <w:rFonts w:ascii="Times New Roman" w:eastAsia="宋体" w:hAnsi="Times New Roman" w:cs="Times New Roman" w:hint="eastAsia"/>
+        </w:rPr>
+        <w:t>/</w:t>
+      </w:r>
+      <w:r>
+        <w:rPr>
+          <w:rFonts w:ascii="Times New Roman" w:eastAsia="宋体" w:hAnsi="Times New Roman" w:cs="Times New Roman" w:hint="eastAsia"/>
+        </w:rPr>
+        <w:t>减少矿石支持调整笔刷大小</w:t>
+      </w:r>
+    </w:p>
+    <w:p>
+      <w:pPr>
+        <w:pStyle w:val="a9"/>
+        <w:numPr>
+          <w:ilvl w:val="0"/>
+          <w:numId w:val="50"/>
+        </w:numPr>
+        <w:rPr>
+          <w:rFonts w:ascii="Times New Roman" w:eastAsia="宋体" w:hAnsi="Times New Roman" w:cs="Times New Roman"/>
+        </w:rPr>
+      </w:pPr>
+      <w:r>
+        <w:rPr>
+          <w:rFonts w:ascii="Times New Roman" w:eastAsia="宋体" w:hAnsi="Times New Roman" w:cs="Times New Roman" w:hint="eastAsia"/>
+        </w:rPr>
+        <w:t>新增</w:t>
+      </w:r>
+      <w:r>
+        <w:rPr>
+          <w:rFonts w:ascii="Times New Roman" w:eastAsia="宋体" w:hAnsi="Times New Roman" w:cs="Times New Roman" w:hint="eastAsia"/>
+        </w:rPr>
+        <w:t>LuaDialog</w:t>
+      </w:r>
+      <w:r>
+        <w:rPr>
+          <w:rFonts w:ascii="Times New Roman" w:eastAsia="宋体" w:hAnsi="Times New Roman" w:cs="Times New Roman" w:hint="eastAsia"/>
+        </w:rPr>
+        <w:t>，可以在</w:t>
+      </w:r>
+      <w:r>
+        <w:rPr>
+          <w:rFonts w:ascii="Times New Roman" w:eastAsia="宋体" w:hAnsi="Times New Roman" w:cs="Times New Roman" w:hint="eastAsia"/>
+        </w:rPr>
+        <w:t>lua</w:t>
+      </w:r>
+      <w:r>
+        <w:rPr>
+          <w:rFonts w:ascii="Times New Roman" w:eastAsia="宋体" w:hAnsi="Times New Roman" w:cs="Times New Roman" w:hint="eastAsia"/>
+        </w:rPr>
+        <w:t>脚本内动态创建自定义窗口</w:t>
+      </w:r>
+    </w:p>
+    <w:p>
+      <w:pPr>
+        <w:pStyle w:val="a9"/>
+        <w:numPr>
+          <w:ilvl w:val="0"/>
+          <w:numId w:val="50"/>
+        </w:numPr>
+        <w:rPr>
+          <w:rFonts w:ascii="Times New Roman" w:eastAsia="宋体" w:hAnsi="Times New Roman" w:cs="Times New Roman"/>
+        </w:rPr>
+      </w:pPr>
+      <w:r>
+        <w:rPr>
+          <w:rFonts w:ascii="Times New Roman" w:eastAsia="宋体" w:hAnsi="Times New Roman" w:cs="Times New Roman" w:hint="eastAsia"/>
+        </w:rPr>
+        <w:t>修复改变地图大小后建筑灯光没有刷新的</w:t>
+      </w:r>
+      <w:r>
+        <w:rPr>
+          <w:rFonts w:ascii="Times New Roman" w:eastAsia="宋体" w:hAnsi="Times New Roman" w:cs="Times New Roman" w:hint="eastAsia"/>
+        </w:rPr>
+        <w:t>bug</w:t>
+      </w:r>
+    </w:p>
+    <w:p>
+      <w:pPr>
+        <w:pStyle w:val="a9"/>
+        <w:numPr>
+          <w:ilvl w:val="0"/>
+          <w:numId w:val="50"/>
+        </w:numPr>
+        <w:rPr>
+          <w:rFonts w:ascii="Times New Roman" w:eastAsia="宋体" w:hAnsi="Times New Roman" w:cs="Times New Roman"/>
+        </w:rPr>
+      </w:pPr>
+      <w:r>
+        <w:rPr>
+          <w:rFonts w:ascii="Times New Roman" w:eastAsia="宋体" w:hAnsi="Times New Roman" w:cs="Times New Roman" w:hint="eastAsia"/>
+        </w:rPr>
+        <w:t>多选模式可以显示不同矿石类型的价格</w:t>
+      </w:r>
+    </w:p>
+    <w:p>
+      <w:pPr>
+        <w:pStyle w:val="a9"/>
+        <w:numPr>
+          <w:ilvl w:val="0"/>
+          <w:numId w:val="50"/>
+        </w:numPr>
+        <w:rPr>
+          <w:rFonts w:ascii="Times New Roman" w:eastAsia="宋体" w:hAnsi="Times New Roman" w:cs="Times New Roman"/>
+        </w:rPr>
+      </w:pPr>
+      <w:r>
+        <w:rPr>
+          <w:rFonts w:ascii="Times New Roman" w:eastAsia="宋体" w:hAnsi="Times New Roman" w:cs="Times New Roman" w:hint="eastAsia"/>
+        </w:rPr>
+        <w:t>优化了绘图界面缩小时的渲染性能</w:t>
+      </w:r>
+    </w:p>
+    <w:p>
+      <w:pPr>
+        <w:pStyle w:val="a9"/>
+        <w:numPr>
+          <w:ilvl w:val="0"/>
+          <w:numId w:val="50"/>
+        </w:numPr>
+        <w:rPr>
+          <w:rFonts w:ascii="Times New Roman" w:eastAsia="宋体" w:hAnsi="Times New Roman" w:cs="Times New Roman"/>
+        </w:rPr>
+      </w:pPr>
+      <w:r>
+        <w:rPr>
+          <w:rFonts w:ascii="Times New Roman" w:eastAsia="宋体" w:hAnsi="Times New Roman" w:cs="Times New Roman" w:hint="eastAsia"/>
+        </w:rPr>
+        <w:t>修复使用触发编辑器拖拽小点为步兵关联标签时，已关联标记没有依据步兵子单元格显示的</w:t>
+      </w:r>
+      <w:r>
+        <w:rPr>
+          <w:rFonts w:ascii="Times New Roman" w:eastAsia="宋体" w:hAnsi="Times New Roman" w:cs="Times New Roman" w:hint="eastAsia"/>
+        </w:rPr>
+        <w:t>bug</w:t>
+      </w:r>
+    </w:p>
+    <w:p>
+      <w:pPr>
+        <w:pStyle w:val="a9"/>
+        <w:numPr>
+          <w:ilvl w:val="0"/>
+          <w:numId w:val="50"/>
+        </w:numPr>
+        <w:rPr>
+          <w:rFonts w:ascii="Times New Roman" w:eastAsia="宋体" w:hAnsi="Times New Roman" w:cs="Times New Roman"/>
+        </w:rPr>
+      </w:pPr>
+      <w:r>
+        <w:rPr>
+          <w:rFonts w:ascii="Times New Roman" w:eastAsia="宋体" w:hAnsi="Times New Roman" w:cs="Times New Roman" w:hint="eastAsia"/>
+        </w:rPr>
+        <w:t>Lua</w:t>
+      </w:r>
+      <w:r>
+        <w:rPr>
+          <w:rFonts w:ascii="Times New Roman" w:eastAsia="宋体" w:hAnsi="Times New Roman" w:cs="Times New Roman" w:hint="eastAsia"/>
+        </w:rPr>
+        <w:t>脚本终端可以开启</w:t>
+      </w:r>
+      <w:r>
+        <w:rPr>
+          <w:rFonts w:ascii="Times New Roman" w:eastAsia="宋体" w:hAnsi="Times New Roman" w:cs="Times New Roman" w:hint="eastAsia"/>
+        </w:rPr>
+        <w:t>MCP</w:t>
+      </w:r>
+      <w:r>
+        <w:rPr>
+          <w:rFonts w:ascii="Times New Roman" w:eastAsia="宋体" w:hAnsi="Times New Roman" w:cs="Times New Roman" w:hint="eastAsia"/>
+        </w:rPr>
+        <w:t>服务器，接入大语言模型调用</w:t>
+      </w:r>
+      <w:r>
+        <w:rPr>
+          <w:rFonts w:ascii="Times New Roman" w:eastAsia="宋体" w:hAnsi="Times New Roman" w:cs="Times New Roman" w:hint="eastAsia"/>
+        </w:rPr>
+        <w:t>lua</w:t>
+      </w:r>
+      <w:r>
+        <w:rPr>
+          <w:rFonts w:ascii="Times New Roman" w:eastAsia="宋体" w:hAnsi="Times New Roman" w:cs="Times New Roman" w:hint="eastAsia"/>
+        </w:rPr>
+        <w:t>脚本</w:t>
+      </w:r>
+      <w:r>
+        <w:rPr>
+          <w:rFonts w:ascii="Times New Roman" w:eastAsia="宋体" w:hAnsi="Times New Roman" w:cs="Times New Roman" w:hint="eastAsia"/>
+        </w:rPr>
+        <w:t>。详见</w:t>
+      </w:r>
+      <w:r>
+        <w:rPr>
+          <w:rFonts w:ascii="Times New Roman" w:eastAsia="宋体" w:hAnsi="Times New Roman" w:cs="Times New Roman" w:hint="eastAsia"/>
+        </w:rPr>
+        <w:t>MCP.Enable</w:t>
+      </w:r>
+    </w:p>
+    <w:p>
+      <w:pPr>
+        <w:pStyle w:val="a9"/>
+        <w:numPr>
+          <w:ilvl w:val="0"/>
+          <w:numId w:val="50"/>
+        </w:numPr>
+        <w:rPr>
+          <w:rFonts w:ascii="Times New Roman" w:eastAsia="宋体" w:hAnsi="Times New Roman" w:cs="Times New Roman"/>
+        </w:rPr>
+      </w:pPr>
+      <w:r>
+        <w:rPr>
+          <w:rFonts w:ascii="Times New Roman" w:eastAsia="宋体" w:hAnsi="Times New Roman" w:cs="Times New Roman" w:hint="eastAsia"/>
+        </w:rPr>
+        <w:t>修复渲染部分</w:t>
+      </w:r>
+      <w:r>
+        <w:rPr>
+          <w:rFonts w:ascii="Times New Roman" w:eastAsia="宋体" w:hAnsi="Times New Roman" w:cs="Times New Roman" w:hint="eastAsia"/>
+        </w:rPr>
+        <w:t>vxl</w:t>
+      </w:r>
+      <w:r>
+        <w:rPr>
+          <w:rFonts w:ascii="Times New Roman" w:eastAsia="宋体" w:hAnsi="Times New Roman" w:cs="Times New Roman" w:hint="eastAsia"/>
+        </w:rPr>
+        <w:t>时崩溃的</w:t>
+      </w:r>
+      <w:r>
+        <w:rPr>
+          <w:rFonts w:ascii="Times New Roman" w:eastAsia="宋体" w:hAnsi="Times New Roman" w:cs="Times New Roman" w:hint="eastAsia"/>
+        </w:rPr>
+        <w:t>bug</w:t>
+      </w:r>
+    </w:p>
+    <w:p>
+      <w:pPr>
+        <w:pStyle w:val="a9"/>
+        <w:numPr>
+          <w:ilvl w:val="0"/>
+          <w:numId w:val="50"/>
+        </w:numPr>
+        <w:rPr>
+          <w:rFonts w:ascii="Times New Roman" w:eastAsia="宋体" w:hAnsi="Times New Roman" w:cs="Times New Roman"/>
+        </w:rPr>
+      </w:pPr>
+      <w:r>
+        <w:rPr>
+          <w:rFonts w:ascii="Times New Roman" w:eastAsia="宋体" w:hAnsi="Times New Roman" w:cs="Times New Roman" w:hint="eastAsia"/>
+        </w:rPr>
+        <w:t>基本设置窗口增加背景音乐和载入界面背景音乐选项</w:t>
+      </w:r>
+    </w:p>
+    <w:p>
+      <w:pPr>
+        <w:pStyle w:val="a9"/>
+        <w:numPr>
+          <w:ilvl w:val="0"/>
+          <w:numId w:val="50"/>
+        </w:numPr>
+        <w:rPr>
+          <w:rFonts w:ascii="Times New Roman" w:eastAsia="宋体" w:hAnsi="Times New Roman" w:cs="Times New Roman"/>
+        </w:rPr>
+      </w:pPr>
+      <w:r>
+        <w:rPr>
+          <w:rFonts w:ascii="Times New Roman" w:eastAsia="宋体" w:hAnsi="Times New Roman" w:cs="Times New Roman" w:hint="eastAsia"/>
+        </w:rPr>
+        <w:t>单人任务设置</w:t>
+      </w:r>
+      <w:r>
+        <w:rPr>
+          <w:rFonts w:ascii="Times New Roman" w:eastAsia="宋体" w:hAnsi="Times New Roman" w:cs="Times New Roman" w:hint="eastAsia"/>
+        </w:rPr>
+        <w:t>-</w:t>
+      </w:r>
+      <w:r>
+        <w:rPr>
+          <w:rFonts w:ascii="Times New Roman" w:eastAsia="宋体" w:hAnsi="Times New Roman" w:cs="Times New Roman" w:hint="eastAsia"/>
+        </w:rPr>
+        <w:t>幻影伪装树木可以使用绘制随机树木窗口进行选择</w:t>
+      </w:r>
+    </w:p>
+    <w:p>
+      <w:pPr>
+        <w:pStyle w:val="a9"/>
+        <w:numPr>
+          <w:ilvl w:val="0"/>
+          <w:numId w:val="50"/>
+        </w:numPr>
+        <w:rPr>
+          <w:rFonts w:ascii="Times New Roman" w:eastAsia="宋体" w:hAnsi="Times New Roman" w:cs="Times New Roman"/>
+        </w:rPr>
+      </w:pPr>
+      <w:r>
+        <w:rPr>
+          <w:rFonts w:ascii="Times New Roman" w:eastAsia="宋体" w:hAnsi="Times New Roman" w:cs="Times New Roman" w:hint="eastAsia"/>
+        </w:rPr>
+        <w:t>放置高架桥头时，可以显示辅助参考线</w:t>
+      </w:r>
+    </w:p>
+    <w:p>
+      <w:pPr>
+        <w:pStyle w:val="a9"/>
+        <w:numPr>
+          <w:ilvl w:val="0"/>
+          <w:numId w:val="50"/>
+        </w:numPr>
+        <w:rPr>
+          <w:rFonts w:ascii="Times New Roman" w:eastAsia="宋体" w:hAnsi="Times New Roman" w:cs="Times New Roman"/>
+        </w:rPr>
+      </w:pPr>
+      <w:r>
+        <w:rPr>
+          <w:rFonts w:ascii="Times New Roman" w:eastAsia="宋体" w:hAnsi="Times New Roman" w:cs="Times New Roman" w:hint="eastAsia"/>
+        </w:rPr>
+        <w:t>为触发编辑器检查下级触发是否是自身添加开关，详见</w:t>
+      </w:r>
+      <w:r>
+        <w:rPr>
+          <w:rFonts w:ascii="Times New Roman" w:eastAsia="宋体" w:hAnsi="Times New Roman" w:cs="Times New Roman" w:hint="eastAsia"/>
+        </w:rPr>
+        <w:t>AttachedTriggerIsSelfCheck</w:t>
+      </w:r>
+    </w:p>
+    <w:p>
+      <w:pPr>
+        <w:pStyle w:val="a9"/>
+        <w:numPr>
+          <w:ilvl w:val="0"/>
+          <w:numId w:val="50"/>
+        </w:numPr>
+        <w:rPr>
+          <w:rFonts w:ascii="Times New Roman" w:eastAsia="宋体" w:hAnsi="Times New Roman" w:cs="Times New Roman"/>
+        </w:rPr>
+      </w:pPr>
+      <w:r>
+        <w:rPr>
+          <w:rFonts w:ascii="Times New Roman" w:eastAsia="宋体" w:hAnsi="Times New Roman" w:cs="Times New Roman" w:hint="eastAsia"/>
+        </w:rPr>
+        <w:t>修复遭遇战地图预览渲染时没有正确标记高架桥的</w:t>
+      </w:r>
+      <w:r>
+        <w:rPr>
+          <w:rFonts w:ascii="Times New Roman" w:eastAsia="宋体" w:hAnsi="Times New Roman" w:cs="Times New Roman" w:hint="eastAsia"/>
+        </w:rPr>
+        <w:t>bug</w:t>
+      </w:r>
+    </w:p>
+    <w:p>
+      <w:pPr>
+        <w:pStyle w:val="a9"/>
+        <w:numPr>
+          <w:ilvl w:val="0"/>
+          <w:numId w:val="50"/>
+        </w:numPr>
+        <w:rPr>
+          <w:rFonts w:ascii="Times New Roman" w:eastAsia="宋体" w:hAnsi="Times New Roman" w:cs="Times New Roman"/>
+        </w:rPr>
+      </w:pPr>
+      <w:r>
+        <w:rPr>
+          <w:rFonts w:ascii="Times New Roman" w:eastAsia="宋体" w:hAnsi="Times New Roman" w:cs="Times New Roman" w:hint="eastAsia"/>
+        </w:rPr>
+        <w:t>为</w:t>
+      </w:r>
+      <w:r>
+        <w:rPr>
+          <w:rFonts w:ascii="Times New Roman" w:eastAsia="宋体" w:hAnsi="Times New Roman" w:cs="Times New Roman" w:hint="eastAsia"/>
+        </w:rPr>
+        <w:t>Lua</w:t>
+      </w:r>
+      <w:r>
+        <w:rPr>
+          <w:rFonts w:ascii="Times New Roman" w:eastAsia="宋体" w:hAnsi="Times New Roman" w:cs="Times New Roman" w:hint="eastAsia"/>
+        </w:rPr>
+        <w:t>脚本终端添加安全检查，会在执行前静态检查高危操作，详见</w:t>
+      </w:r>
+      <w:r>
+        <w:rPr>
+          <w:rFonts w:ascii="Times New Roman" w:eastAsia="宋体" w:hAnsi="Times New Roman" w:cs="Times New Roman" w:hint="eastAsia"/>
+        </w:rPr>
+        <w:t>DisableLuaConsoleSafetyCheck</w:t>
+      </w:r>
+    </w:p>
+    <w:p>
+      <w:pPr>
+        <w:pStyle w:val="a9"/>
+        <w:numPr>
+          <w:ilvl w:val="0"/>
+          <w:numId w:val="50"/>
+        </w:numPr>
+        <w:rPr>
+          <w:rFonts w:ascii="Times New Roman" w:eastAsia="宋体" w:hAnsi="Times New Roman" w:cs="Times New Roman"/>
+        </w:rPr>
+      </w:pPr>
+      <w:r>
+        <w:rPr>
+          <w:rFonts w:ascii="Times New Roman" w:eastAsia="宋体" w:hAnsi="Times New Roman" w:cs="Times New Roman" w:hint="eastAsia"/>
+        </w:rPr>
+        <w:t>可以在地图视图内按方向键调节视角，同时按住</w:t>
+      </w:r>
+      <w:r>
+        <w:rPr>
+          <w:rFonts w:ascii="Times New Roman" w:eastAsia="宋体" w:hAnsi="Times New Roman" w:cs="Times New Roman" w:hint="eastAsia"/>
+        </w:rPr>
+        <w:t>ctrl</w:t>
+      </w:r>
+      <w:r>
+        <w:rPr>
+          <w:rFonts w:ascii="Times New Roman" w:eastAsia="宋体" w:hAnsi="Times New Roman" w:cs="Times New Roman" w:hint="eastAsia"/>
+        </w:rPr>
+        <w:t>键加速移动</w:t>
+      </w:r>
+    </w:p>
+    <w:p>
+      <w:pPr>
+        <w:pStyle w:val="a9"/>
+        <w:numPr>
+          <w:ilvl w:val="0"/>
+          <w:numId w:val="50"/>
+        </w:numPr>
+        <w:rPr>
+          <w:rFonts w:ascii="Times New Roman" w:eastAsia="宋体" w:hAnsi="Times New Roman" w:cs="Times New Roman"/>
+        </w:rPr>
+      </w:pPr>
+      <w:r>
+        <w:rPr>
+          <w:rFonts w:ascii="Times New Roman" w:eastAsia="宋体" w:hAnsi="Times New Roman" w:cs="Times New Roman" w:hint="eastAsia"/>
+        </w:rPr>
+        <w:t>修复部分遭遇战地图所属方选项重复的</w:t>
+      </w:r>
+      <w:r>
+        <w:rPr>
+          <w:rFonts w:ascii="Times New Roman" w:eastAsia="宋体" w:hAnsi="Times New Roman" w:cs="Times New Roman" w:hint="eastAsia"/>
+        </w:rPr>
+        <w:t>bug</w:t>
+      </w:r>
+    </w:p>
+    <w:p>
+      <w:pPr>
+        <w:pStyle w:val="a9"/>
+        <w:numPr>
+          <w:ilvl w:val="0"/>
+          <w:numId w:val="50"/>
+        </w:numPr>
+        <w:rPr>
+          <w:rFonts w:ascii="Times New Roman" w:eastAsia="宋体" w:hAnsi="Times New Roman" w:cs="Times New Roman"/>
+        </w:rPr>
+      </w:pPr>
+      <w:r>
+        <w:rPr>
+          <w:rFonts w:ascii="Times New Roman" w:eastAsia="宋体" w:hAnsi="Times New Roman" w:cs="Times New Roman" w:hint="eastAsia"/>
+        </w:rPr>
+        <w:t>重写单位属性对话框，标签支持搜索，所属方可以显示颜色</w:t>
+      </w:r>
+    </w:p>
+    <w:p>
+      <w:pPr>
+        <w:pStyle w:val="a9"/>
+        <w:numPr>
+          <w:ilvl w:val="0"/>
+          <w:numId w:val="50"/>
+        </w:numPr>
+        <w:rPr>
+          <w:rFonts w:ascii="Times New Roman" w:eastAsia="宋体" w:hAnsi="Times New Roman" w:cs="Times New Roman"/>
+        </w:rPr>
+      </w:pPr>
+      <w:r>
+        <w:rPr>
+          <w:rFonts w:ascii="Times New Roman" w:eastAsia="宋体" w:hAnsi="Times New Roman" w:cs="Times New Roman" w:hint="eastAsia"/>
+        </w:rPr>
+        <w:t>支持将</w:t>
+      </w:r>
+      <w:r>
+        <w:rPr>
+          <w:rFonts w:ascii="Times New Roman" w:eastAsia="宋体" w:hAnsi="Times New Roman" w:cs="Times New Roman" w:hint="eastAsia"/>
+        </w:rPr>
+        <w:t>物品浏览器和</w:t>
+      </w:r>
+      <w:r>
+        <w:rPr>
+          <w:rFonts w:ascii="Times New Roman" w:eastAsia="宋体" w:hAnsi="Times New Roman" w:cs="Times New Roman" w:hint="eastAsia"/>
+        </w:rPr>
+        <w:t>地形浏览器作为一个独立窗口显示</w:t>
+      </w:r>
+      <w:r>
+        <w:rPr>
+          <w:rFonts w:ascii="Times New Roman" w:eastAsia="宋体" w:hAnsi="Times New Roman" w:cs="Times New Roman" w:hint="eastAsia"/>
+        </w:rPr>
+        <w:t>，可以调节透明度</w:t>
+      </w:r>
+      <w:r>
+        <w:rPr>
+          <w:rFonts w:ascii="Times New Roman" w:eastAsia="宋体" w:hAnsi="Times New Roman" w:cs="Times New Roman" w:hint="eastAsia"/>
+        </w:rPr>
+        <w:t>，详见</w:t>
+      </w:r>
+      <w:r>
+        <w:rPr>
+          <w:rFonts w:ascii="Times New Roman" w:eastAsia="宋体" w:hAnsi="Times New Roman" w:cs="Times New Roman" w:hint="eastAsia"/>
+        </w:rPr>
+        <w:t>ViewObjectsFloating</w:t>
+      </w:r>
+      <w:r>
+        <w:rPr>
+          <w:rFonts w:ascii="Times New Roman" w:eastAsia="宋体" w:hAnsi="Times New Roman" w:cs="Times New Roman" w:hint="eastAsia"/>
+        </w:rPr>
+        <w:t>和</w:t>
+      </w:r>
+      <w:r>
+        <w:rPr>
+          <w:rFonts w:ascii="Times New Roman" w:eastAsia="宋体" w:hAnsi="Times New Roman" w:cs="Times New Roman" w:hint="eastAsia"/>
+        </w:rPr>
+        <w:t>TileSetBrowserFloating</w:t>
+      </w:r>
+    </w:p>
+    <w:p>
+      <w:pPr>
+        <w:pStyle w:val="a9"/>
+        <w:numPr>
+          <w:ilvl w:val="0"/>
+          <w:numId w:val="50"/>
+        </w:numPr>
+        <w:rPr>
+          <w:rFonts w:ascii="Times New Roman" w:eastAsia="宋体" w:hAnsi="Times New Roman" w:cs="Times New Roman"/>
+        </w:rPr>
+      </w:pPr>
+      <w:r>
+        <w:rPr>
+          <w:rFonts w:ascii="Times New Roman" w:eastAsia="宋体" w:hAnsi="Times New Roman" w:cs="Times New Roman" w:hint="eastAsia"/>
+        </w:rPr>
+        <w:t>绝大多数窗口可以调节透明度</w:t>
+      </w:r>
+    </w:p>
+    <w:p>
+      <w:pPr>
+        <w:pStyle w:val="a9"/>
+        <w:numPr>
+          <w:ilvl w:val="0"/>
+          <w:numId w:val="50"/>
+        </w:numPr>
+        <w:rPr>
+          <w:rFonts w:ascii="Times New Roman" w:eastAsia="宋体" w:hAnsi="Times New Roman" w:cs="Times New Roman"/>
+        </w:rPr>
+      </w:pPr>
+      <w:r>
+        <w:rPr>
+          <w:rFonts w:ascii="Times New Roman" w:eastAsia="宋体" w:hAnsi="Times New Roman" w:cs="Times New Roman" w:hint="eastAsia"/>
+        </w:rPr>
+        <w:t>修复部分情况下按工具栏擦除覆盖物等按钮不生效的</w:t>
+      </w:r>
+      <w:r>
+        <w:rPr>
+          <w:rFonts w:ascii="Times New Roman" w:eastAsia="宋体" w:hAnsi="Times New Roman" w:cs="Times New Roman" w:hint="eastAsia"/>
+        </w:rPr>
+        <w:t>bug</w:t>
+      </w:r>
+    </w:p>
+    <w:p>
+      <w:pPr>
+        <w:pStyle w:val="a9"/>
+        <w:numPr>
+          <w:ilvl w:val="0"/>
+          <w:numId w:val="50"/>
+        </w:numPr>
+        <w:rPr>
+          <w:rFonts w:ascii="Times New Roman" w:eastAsia="宋体" w:hAnsi="Times New Roman" w:cs="Times New Roman"/>
+        </w:rPr>
+      </w:pPr>
+      <w:r>
+        <w:rPr>
+          <w:rFonts w:ascii="Times New Roman" w:eastAsia="宋体" w:hAnsi="Times New Roman" w:cs="Times New Roman" w:hint="eastAsia"/>
+        </w:rPr>
+        <w:t>修复暗色模式下非主程序菜单的背景色被错误填充的</w:t>
+      </w:r>
+      <w:r>
+        <w:rPr>
+          <w:rFonts w:ascii="Times New Roman" w:eastAsia="宋体" w:hAnsi="Times New Roman" w:cs="Times New Roman" w:hint="eastAsia"/>
+        </w:rPr>
+        <w:t>bug</w:t>
+      </w:r>
+    </w:p>
+    <w:p>
+      <w:pPr>
+        <w:pStyle w:val="a9"/>
+        <w:numPr>
+          <w:ilvl w:val="0"/>
+          <w:numId w:val="50"/>
+        </w:numPr>
+        <w:rPr>
+          <w:rFonts w:ascii="Times New Roman" w:eastAsia="宋体" w:hAnsi="Times New Roman" w:cs="Times New Roman"/>
+        </w:rPr>
+      </w:pPr>
+      <w:r>
+        <w:rPr>
+          <w:rFonts w:ascii="Times New Roman" w:eastAsia="宋体" w:hAnsi="Times New Roman" w:cs="Times New Roman" w:hint="eastAsia"/>
+        </w:rPr>
+        <w:t>为触发编辑器、</w:t>
+      </w:r>
+      <w:r>
+        <w:rPr>
+          <w:rFonts w:ascii="Times New Roman" w:eastAsia="宋体" w:hAnsi="Times New Roman" w:cs="Times New Roman" w:hint="eastAsia"/>
+        </w:rPr>
+        <w:t>AI</w:t>
+      </w:r>
+      <w:r>
+        <w:rPr>
+          <w:rFonts w:ascii="Times New Roman" w:eastAsia="宋体" w:hAnsi="Times New Roman" w:cs="Times New Roman" w:hint="eastAsia"/>
+        </w:rPr>
+        <w:t>触发编辑器增加跳转按钮，可以跳转到参数对应的路径点、小队等位置</w:t>
+      </w:r>
+    </w:p>
+    <w:p>
+      <w:pPr>
+        <w:pStyle w:val="a9"/>
+        <w:numPr>
+          <w:ilvl w:val="0"/>
+          <w:numId w:val="50"/>
+        </w:numPr>
+        <w:rPr>
+          <w:rFonts w:ascii="Times New Roman" w:eastAsia="宋体" w:hAnsi="Times New Roman" w:cs="Times New Roman"/>
+        </w:rPr>
+      </w:pPr>
+      <w:r>
+        <w:rPr>
+          <w:rFonts w:ascii="Times New Roman" w:eastAsia="宋体" w:hAnsi="Times New Roman" w:cs="Times New Roman" w:hint="eastAsia"/>
+        </w:rPr>
+        <w:t>受损火焰能正确被其他单位遮挡</w:t>
+      </w:r>
+      <w:r>
+        <w:rPr>
+          <w:rFonts w:ascii="Times New Roman" w:eastAsia="宋体" w:hAnsi="Times New Roman" w:cs="Times New Roman" w:hint="eastAsia"/>
+        </w:rPr>
+        <w:t>，可以读取</w:t>
+      </w:r>
+      <w:r>
+        <w:rPr>
+          <w:rFonts w:ascii="Times New Roman" w:eastAsia="宋体" w:hAnsi="Times New Roman" w:cs="Times New Roman" w:hint="eastAsia"/>
+        </w:rPr>
+        <w:t>Next=</w:t>
+      </w:r>
+      <w:r>
+        <w:rPr>
+          <w:rFonts w:ascii="Times New Roman" w:eastAsia="宋体" w:hAnsi="Times New Roman" w:cs="Times New Roman" w:hint="eastAsia"/>
+        </w:rPr>
+        <w:t>最终的</w:t>
+      </w:r>
+      <w:r>
+        <w:rPr>
+          <w:rFonts w:ascii="Times New Roman" w:eastAsia="宋体" w:hAnsi="Times New Roman" w:cs="Times New Roman" w:hint="eastAsia"/>
+        </w:rPr>
+        <w:t>图像</w:t>
+      </w:r>
+    </w:p>
+    <w:p>
+      <w:pPr>
+        <w:pStyle w:val="a9"/>
+        <w:numPr>
+          <w:ilvl w:val="0"/>
+          <w:numId w:val="50"/>
+        </w:numPr>
+        <w:rPr>
+          <w:rFonts w:ascii="Times New Roman" w:eastAsia="宋体" w:hAnsi="Times New Roman" w:cs="Times New Roman"/>
+        </w:rPr>
+      </w:pPr>
+      <w:r>
+        <w:rPr>
+          <w:rFonts w:ascii="Times New Roman" w:eastAsia="宋体" w:hAnsi="Times New Roman" w:cs="Times New Roman" w:hint="eastAsia"/>
+        </w:rPr>
         <w:lastRenderedPageBreak/>
-        <w:t>查找引用窗口增加</w:t>
-      </w:r>
-      <w:r>
-        <w:rPr>
-          <w:rFonts w:ascii="Times New Roman" w:eastAsia="宋体" w:hAnsi="Times New Roman" w:cs="Times New Roman" w:hint="eastAsia"/>
-        </w:rPr>
-        <w:t>跟随活动窗口</w:t>
-      </w:r>
-      <w:r>
-        <w:rPr>
-          <w:rFonts w:ascii="Times New Roman" w:eastAsia="宋体" w:hAnsi="Times New Roman" w:cs="Times New Roman" w:hint="eastAsia"/>
-        </w:rPr>
-        <w:t>选项，勾选后可以实时根据活动窗口切换内容</w:t>
-      </w:r>
-    </w:p>
-    <w:p>
-      <w:pPr>
-        <w:pStyle w:val="a9"/>
-        <w:numPr>
-          <w:ilvl w:val="0"/>
-          <w:numId w:val="50"/>
-        </w:numPr>
-        <w:rPr>
-          <w:rFonts w:ascii="Times New Roman" w:eastAsia="宋体" w:hAnsi="Times New Roman" w:cs="Times New Roman"/>
-        </w:rPr>
-      </w:pPr>
-      <w:r>
-        <w:rPr>
-          <w:rFonts w:ascii="Times New Roman" w:eastAsia="宋体" w:hAnsi="Times New Roman" w:cs="Times New Roman" w:hint="eastAsia"/>
-        </w:rPr>
-        <w:t>修复修改作战小队名称后，</w:t>
-      </w:r>
-      <w:r>
-        <w:rPr>
-          <w:rFonts w:ascii="Times New Roman" w:eastAsia="宋体" w:hAnsi="Times New Roman" w:cs="Times New Roman" w:hint="eastAsia"/>
-        </w:rPr>
-        <w:t>ai</w:t>
-      </w:r>
-      <w:r>
-        <w:rPr>
-          <w:rFonts w:ascii="Times New Roman" w:eastAsia="宋体" w:hAnsi="Times New Roman" w:cs="Times New Roman" w:hint="eastAsia"/>
-        </w:rPr>
-        <w:t>触发编辑器的小队</w:t>
-      </w:r>
-      <w:r>
-        <w:rPr>
-          <w:rFonts w:ascii="Times New Roman" w:eastAsia="宋体" w:hAnsi="Times New Roman" w:cs="Times New Roman" w:hint="eastAsia"/>
-        </w:rPr>
-        <w:t>#2</w:t>
-      </w:r>
-      <w:r>
-        <w:rPr>
-          <w:rFonts w:ascii="Times New Roman" w:eastAsia="宋体" w:hAnsi="Times New Roman" w:cs="Times New Roman" w:hint="eastAsia"/>
-        </w:rPr>
-        <w:t>显示错误的</w:t>
-      </w:r>
-      <w:r>
-        <w:rPr>
-          <w:rFonts w:ascii="Times New Roman" w:eastAsia="宋体" w:hAnsi="Times New Roman" w:cs="Times New Roman" w:hint="eastAsia"/>
-        </w:rPr>
-        <w:t>bug</w:t>
-      </w:r>
-    </w:p>
-    <w:p>
-      <w:pPr>
-        <w:pStyle w:val="a9"/>
-        <w:numPr>
-          <w:ilvl w:val="0"/>
-          <w:numId w:val="50"/>
-        </w:numPr>
-        <w:rPr>
-          <w:rFonts w:ascii="Times New Roman" w:eastAsia="宋体" w:hAnsi="Times New Roman" w:cs="Times New Roman"/>
-        </w:rPr>
-      </w:pPr>
-      <w:r>
-        <w:rPr>
-          <w:rFonts w:ascii="Times New Roman" w:eastAsia="宋体" w:hAnsi="Times New Roman" w:cs="Times New Roman" w:hint="eastAsia"/>
-        </w:rPr>
-        <w:t>触发、小队等编辑器支持为</w:t>
-      </w:r>
-      <w:r>
-        <w:rPr>
-          <w:rFonts w:ascii="Times New Roman" w:eastAsia="宋体" w:hAnsi="Times New Roman" w:cs="Times New Roman" w:hint="eastAsia"/>
-        </w:rPr>
-        <w:t>ID</w:t>
-      </w:r>
-      <w:r>
-        <w:rPr>
-          <w:rFonts w:ascii="Times New Roman" w:eastAsia="宋体" w:hAnsi="Times New Roman" w:cs="Times New Roman" w:hint="eastAsia"/>
-        </w:rPr>
-        <w:t>染色，双击拖拽小点即可设置颜色</w:t>
-      </w:r>
-    </w:p>
-    <w:p>
-      <w:pPr>
-        <w:pStyle w:val="a9"/>
-        <w:numPr>
-          <w:ilvl w:val="0"/>
-          <w:numId w:val="50"/>
-        </w:numPr>
-        <w:rPr>
-          <w:rFonts w:ascii="Times New Roman" w:eastAsia="宋体" w:hAnsi="Times New Roman" w:cs="Times New Roman"/>
-        </w:rPr>
-      </w:pPr>
-      <w:r>
-        <w:rPr>
-          <w:rFonts w:ascii="Times New Roman" w:eastAsia="宋体" w:hAnsi="Times New Roman" w:cs="Times New Roman" w:hint="eastAsia"/>
-        </w:rPr>
-        <w:t>单元标记支持笔刷大小放置</w:t>
-      </w:r>
-    </w:p>
-    <w:p>
-      <w:pPr>
-        <w:pStyle w:val="a9"/>
-        <w:numPr>
-          <w:ilvl w:val="0"/>
-          <w:numId w:val="50"/>
-        </w:numPr>
-        <w:rPr>
-          <w:rFonts w:ascii="Times New Roman" w:eastAsia="宋体" w:hAnsi="Times New Roman" w:cs="Times New Roman"/>
-        </w:rPr>
-      </w:pPr>
-      <w:r>
-        <w:rPr>
-          <w:rFonts w:ascii="Times New Roman" w:eastAsia="宋体" w:hAnsi="Times New Roman" w:cs="Times New Roman" w:hint="eastAsia"/>
-        </w:rPr>
-        <w:t>增加新的</w:t>
-      </w:r>
-      <w:r>
-        <w:rPr>
-          <w:rFonts w:ascii="Times New Roman" w:eastAsia="宋体" w:hAnsi="Times New Roman" w:cs="Times New Roman" w:hint="eastAsia"/>
-        </w:rPr>
-        <w:t>lua</w:t>
-      </w:r>
-      <w:r>
-        <w:rPr>
-          <w:rFonts w:ascii="Times New Roman" w:eastAsia="宋体" w:hAnsi="Times New Roman" w:cs="Times New Roman" w:hint="eastAsia"/>
-        </w:rPr>
-        <w:t>脚本，由</w:t>
-      </w:r>
-      <w:r>
-        <w:rPr>
-          <w:rFonts w:ascii="Times New Roman" w:eastAsia="宋体" w:hAnsi="Times New Roman" w:cs="Times New Roman" w:hint="eastAsia"/>
-        </w:rPr>
-        <w:t>AUY</w:t>
-      </w:r>
-      <w:r>
-        <w:rPr>
-          <w:rFonts w:ascii="Times New Roman" w:eastAsia="宋体" w:hAnsi="Times New Roman" w:cs="Times New Roman" w:hint="eastAsia"/>
-        </w:rPr>
-        <w:t>制作</w:t>
-      </w:r>
-    </w:p>
-    <w:p>
-      <w:pPr>
-        <w:pStyle w:val="a9"/>
-        <w:numPr>
-          <w:ilvl w:val="0"/>
-          <w:numId w:val="50"/>
-        </w:numPr>
-        <w:rPr>
-          <w:rFonts w:ascii="Times New Roman" w:eastAsia="宋体" w:hAnsi="Times New Roman" w:cs="Times New Roman"/>
-        </w:rPr>
-      </w:pPr>
-      <w:r>
-        <w:rPr>
-          <w:rFonts w:ascii="Times New Roman" w:eastAsia="宋体" w:hAnsi="Times New Roman" w:cs="Times New Roman" w:hint="eastAsia"/>
-        </w:rPr>
-        <w:t>修复跨地图类型粘贴时地形转换部分失效的</w:t>
-      </w:r>
-      <w:r>
-        <w:rPr>
-          <w:rFonts w:ascii="Times New Roman" w:eastAsia="宋体" w:hAnsi="Times New Roman" w:cs="Times New Roman" w:hint="eastAsia"/>
-        </w:rPr>
-        <w:t>bug</w:t>
-      </w:r>
-    </w:p>
-    <w:p>
-      <w:pPr>
-        <w:pStyle w:val="a9"/>
-        <w:numPr>
-          <w:ilvl w:val="0"/>
-          <w:numId w:val="50"/>
-        </w:numPr>
-        <w:rPr>
-          <w:rFonts w:ascii="Times New Roman" w:eastAsia="宋体" w:hAnsi="Times New Roman" w:cs="Times New Roman"/>
-        </w:rPr>
-      </w:pPr>
-      <w:r>
-        <w:rPr>
-          <w:rFonts w:ascii="Times New Roman" w:eastAsia="宋体" w:hAnsi="Times New Roman" w:cs="Times New Roman" w:hint="eastAsia"/>
-        </w:rPr>
-        <w:t>可以记录不同鼠标操作的笔刷大小，并在切换时自动还原，详见</w:t>
-      </w:r>
-      <w:r>
-        <w:rPr>
-          <w:rFonts w:ascii="Times New Roman" w:eastAsia="宋体" w:hAnsi="Times New Roman" w:cs="Times New Roman" w:hint="eastAsia"/>
-        </w:rPr>
-        <w:t>RecordBrushSizeHistory</w:t>
-      </w:r>
-    </w:p>
-    <w:p>
-      <w:pPr>
-        <w:pStyle w:val="a9"/>
-        <w:numPr>
-          <w:ilvl w:val="0"/>
-          <w:numId w:val="50"/>
-        </w:numPr>
-        <w:rPr>
-          <w:rFonts w:ascii="Times New Roman" w:eastAsia="宋体" w:hAnsi="Times New Roman" w:cs="Times New Roman"/>
-        </w:rPr>
-      </w:pPr>
-      <w:r>
-        <w:rPr>
-          <w:rFonts w:ascii="Times New Roman" w:eastAsia="宋体" w:hAnsi="Times New Roman" w:cs="Times New Roman" w:hint="eastAsia"/>
-        </w:rPr>
-        <w:t>增加</w:t>
-      </w:r>
-      <w:r>
-        <w:rPr>
-          <w:rFonts w:ascii="Times New Roman" w:eastAsia="宋体" w:hAnsi="Times New Roman" w:cs="Times New Roman" w:hint="eastAsia"/>
-        </w:rPr>
-        <w:t>/</w:t>
-      </w:r>
-      <w:r>
-        <w:rPr>
-          <w:rFonts w:ascii="Times New Roman" w:eastAsia="宋体" w:hAnsi="Times New Roman" w:cs="Times New Roman" w:hint="eastAsia"/>
-        </w:rPr>
-        <w:t>减少矿石支持调整笔刷大小</w:t>
-      </w:r>
-    </w:p>
-    <w:p>
-      <w:pPr>
-        <w:pStyle w:val="a9"/>
-        <w:numPr>
-          <w:ilvl w:val="0"/>
-          <w:numId w:val="50"/>
-        </w:numPr>
-        <w:rPr>
-          <w:rFonts w:ascii="Times New Roman" w:eastAsia="宋体" w:hAnsi="Times New Roman" w:cs="Times New Roman"/>
-        </w:rPr>
-      </w:pPr>
-      <w:r>
-        <w:rPr>
-          <w:rFonts w:ascii="Times New Roman" w:eastAsia="宋体" w:hAnsi="Times New Roman" w:cs="Times New Roman" w:hint="eastAsia"/>
-        </w:rPr>
-        <w:t>新增</w:t>
-      </w:r>
-      <w:r>
-        <w:rPr>
-          <w:rFonts w:ascii="Times New Roman" w:eastAsia="宋体" w:hAnsi="Times New Roman" w:cs="Times New Roman" w:hint="eastAsia"/>
-        </w:rPr>
-        <w:t>LuaDialog</w:t>
-      </w:r>
-      <w:r>
-        <w:rPr>
-          <w:rFonts w:ascii="Times New Roman" w:eastAsia="宋体" w:hAnsi="Times New Roman" w:cs="Times New Roman" w:hint="eastAsia"/>
-        </w:rPr>
-        <w:t>，可以在</w:t>
-      </w:r>
-      <w:r>
-        <w:rPr>
-          <w:rFonts w:ascii="Times New Roman" w:eastAsia="宋体" w:hAnsi="Times New Roman" w:cs="Times New Roman" w:hint="eastAsia"/>
-        </w:rPr>
-        <w:t>lua</w:t>
-      </w:r>
-      <w:r>
-        <w:rPr>
-          <w:rFonts w:ascii="Times New Roman" w:eastAsia="宋体" w:hAnsi="Times New Roman" w:cs="Times New Roman" w:hint="eastAsia"/>
-        </w:rPr>
-        <w:t>脚本内动态创建自定义窗口</w:t>
-      </w:r>
-    </w:p>
-    <w:p>
-      <w:pPr>
-        <w:pStyle w:val="a9"/>
-        <w:numPr>
-          <w:ilvl w:val="0"/>
-          <w:numId w:val="50"/>
-        </w:numPr>
-        <w:rPr>
-          <w:rFonts w:ascii="Times New Roman" w:eastAsia="宋体" w:hAnsi="Times New Roman" w:cs="Times New Roman"/>
-        </w:rPr>
-      </w:pPr>
-      <w:r>
-        <w:rPr>
-          <w:rFonts w:ascii="Times New Roman" w:eastAsia="宋体" w:hAnsi="Times New Roman" w:cs="Times New Roman" w:hint="eastAsia"/>
-        </w:rPr>
-        <w:t>修复改变地图大小后建筑灯光没有刷新的</w:t>
-      </w:r>
-      <w:r>
-        <w:rPr>
-          <w:rFonts w:ascii="Times New Roman" w:eastAsia="宋体" w:hAnsi="Times New Roman" w:cs="Times New Roman" w:hint="eastAsia"/>
-        </w:rPr>
-        <w:t>bug</w:t>
-      </w:r>
-    </w:p>
-    <w:p>
-      <w:pPr>
-        <w:pStyle w:val="a9"/>
-        <w:numPr>
-          <w:ilvl w:val="0"/>
-          <w:numId w:val="50"/>
-        </w:numPr>
-        <w:rPr>
-          <w:rFonts w:ascii="Times New Roman" w:eastAsia="宋体" w:hAnsi="Times New Roman" w:cs="Times New Roman"/>
-        </w:rPr>
-      </w:pPr>
-      <w:r>
-        <w:rPr>
-          <w:rFonts w:ascii="Times New Roman" w:eastAsia="宋体" w:hAnsi="Times New Roman" w:cs="Times New Roman" w:hint="eastAsia"/>
-        </w:rPr>
-        <w:t>多选模式可以显示不同矿石类型的价格</w:t>
-      </w:r>
-    </w:p>
-    <w:p>
-      <w:pPr>
-        <w:pStyle w:val="a9"/>
-        <w:numPr>
-          <w:ilvl w:val="0"/>
-          <w:numId w:val="50"/>
-        </w:numPr>
-        <w:rPr>
-          <w:rFonts w:ascii="Times New Roman" w:eastAsia="宋体" w:hAnsi="Times New Roman" w:cs="Times New Roman"/>
-        </w:rPr>
-      </w:pPr>
-      <w:r>
-        <w:rPr>
-          <w:rFonts w:ascii="Times New Roman" w:eastAsia="宋体" w:hAnsi="Times New Roman" w:cs="Times New Roman" w:hint="eastAsia"/>
-        </w:rPr>
-        <w:t>优化了绘图界面缩小时的渲染性能</w:t>
-      </w:r>
-    </w:p>
-    <w:p>
-      <w:pPr>
-        <w:pStyle w:val="a9"/>
-        <w:numPr>
-          <w:ilvl w:val="0"/>
-          <w:numId w:val="50"/>
-        </w:numPr>
-        <w:rPr>
-          <w:rFonts w:ascii="Times New Roman" w:eastAsia="宋体" w:hAnsi="Times New Roman" w:cs="Times New Roman"/>
-        </w:rPr>
-      </w:pPr>
-      <w:r>
-        <w:rPr>
-          <w:rFonts w:ascii="Times New Roman" w:eastAsia="宋体" w:hAnsi="Times New Roman" w:cs="Times New Roman" w:hint="eastAsia"/>
-        </w:rPr>
-        <w:t>修复使用触发编辑器拖拽小点为步兵关联标签时，已关联标记没有依据步兵子单元格显示的</w:t>
-      </w:r>
-      <w:r>
-        <w:rPr>
-          <w:rFonts w:ascii="Times New Roman" w:eastAsia="宋体" w:hAnsi="Times New Roman" w:cs="Times New Roman" w:hint="eastAsia"/>
-        </w:rPr>
-        <w:t>bug</w:t>
-      </w:r>
-    </w:p>
-    <w:p>
-      <w:pPr>
-        <w:pStyle w:val="a9"/>
-        <w:numPr>
-          <w:ilvl w:val="0"/>
-          <w:numId w:val="50"/>
-        </w:numPr>
-        <w:rPr>
-          <w:rFonts w:ascii="Times New Roman" w:eastAsia="宋体" w:hAnsi="Times New Roman" w:cs="Times New Roman"/>
-        </w:rPr>
-      </w:pPr>
-      <w:r>
-        <w:rPr>
-          <w:rFonts w:ascii="Times New Roman" w:eastAsia="宋体" w:hAnsi="Times New Roman" w:cs="Times New Roman" w:hint="eastAsia"/>
-        </w:rPr>
-        <w:t>Lua</w:t>
-      </w:r>
-      <w:r>
-        <w:rPr>
-          <w:rFonts w:ascii="Times New Roman" w:eastAsia="宋体" w:hAnsi="Times New Roman" w:cs="Times New Roman" w:hint="eastAsia"/>
-        </w:rPr>
-        <w:t>脚本终端可以开启</w:t>
-      </w:r>
-      <w:r>
-        <w:rPr>
-          <w:rFonts w:ascii="Times New Roman" w:eastAsia="宋体" w:hAnsi="Times New Roman" w:cs="Times New Roman" w:hint="eastAsia"/>
-        </w:rPr>
-        <w:t>MCP</w:t>
-      </w:r>
-      <w:r>
-        <w:rPr>
-          <w:rFonts w:ascii="Times New Roman" w:eastAsia="宋体" w:hAnsi="Times New Roman" w:cs="Times New Roman" w:hint="eastAsia"/>
-        </w:rPr>
-        <w:t>服务器，接入大语言模型调用</w:t>
-      </w:r>
-      <w:r>
-        <w:rPr>
-          <w:rFonts w:ascii="Times New Roman" w:eastAsia="宋体" w:hAnsi="Times New Roman" w:cs="Times New Roman" w:hint="eastAsia"/>
-        </w:rPr>
-        <w:t>lua</w:t>
-      </w:r>
-      <w:r>
-        <w:rPr>
-          <w:rFonts w:ascii="Times New Roman" w:eastAsia="宋体" w:hAnsi="Times New Roman" w:cs="Times New Roman" w:hint="eastAsia"/>
-        </w:rPr>
-        <w:t>脚本</w:t>
-      </w:r>
-      <w:r>
-        <w:rPr>
-          <w:rFonts w:ascii="Times New Roman" w:eastAsia="宋体" w:hAnsi="Times New Roman" w:cs="Times New Roman" w:hint="eastAsia"/>
-        </w:rPr>
-        <w:t>。详见</w:t>
-      </w:r>
-      <w:r>
-        <w:rPr>
-          <w:rFonts w:ascii="Times New Roman" w:eastAsia="宋体" w:hAnsi="Times New Roman" w:cs="Times New Roman" w:hint="eastAsia"/>
-        </w:rPr>
-        <w:t>MCP.Enable</w:t>
-      </w:r>
-    </w:p>
-    <w:p>
-      <w:pPr>
-        <w:pStyle w:val="a9"/>
-        <w:numPr>
-          <w:ilvl w:val="0"/>
-          <w:numId w:val="50"/>
-        </w:numPr>
-        <w:rPr>
-          <w:rFonts w:ascii="Times New Roman" w:eastAsia="宋体" w:hAnsi="Times New Roman" w:cs="Times New Roman"/>
-        </w:rPr>
-      </w:pPr>
-      <w:r>
-        <w:rPr>
-          <w:rFonts w:ascii="Times New Roman" w:eastAsia="宋体" w:hAnsi="Times New Roman" w:cs="Times New Roman" w:hint="eastAsia"/>
-        </w:rPr>
-        <w:t>修复渲染部分</w:t>
-      </w:r>
-      <w:r>
-        <w:rPr>
-          <w:rFonts w:ascii="Times New Roman" w:eastAsia="宋体" w:hAnsi="Times New Roman" w:cs="Times New Roman" w:hint="eastAsia"/>
-        </w:rPr>
-        <w:t>vxl</w:t>
-      </w:r>
-      <w:r>
-        <w:rPr>
-          <w:rFonts w:ascii="Times New Roman" w:eastAsia="宋体" w:hAnsi="Times New Roman" w:cs="Times New Roman" w:hint="eastAsia"/>
-        </w:rPr>
-        <w:t>时崩溃的</w:t>
-      </w:r>
-      <w:r>
-        <w:rPr>
-          <w:rFonts w:ascii="Times New Roman" w:eastAsia="宋体" w:hAnsi="Times New Roman" w:cs="Times New Roman" w:hint="eastAsia"/>
-        </w:rPr>
-        <w:t>bug</w:t>
-      </w:r>
-    </w:p>
-    <w:p>
-      <w:pPr>
-        <w:pStyle w:val="a9"/>
-        <w:numPr>
-          <w:ilvl w:val="0"/>
-          <w:numId w:val="50"/>
-        </w:numPr>
-        <w:rPr>
-          <w:rFonts w:ascii="Times New Roman" w:eastAsia="宋体" w:hAnsi="Times New Roman" w:cs="Times New Roman"/>
-        </w:rPr>
-      </w:pPr>
-      <w:r>
-        <w:rPr>
-          <w:rFonts w:ascii="Times New Roman" w:eastAsia="宋体" w:hAnsi="Times New Roman" w:cs="Times New Roman" w:hint="eastAsia"/>
-        </w:rPr>
-        <w:t>基本设置窗口增加背景音乐和载入界面背景音乐选项</w:t>
-      </w:r>
-    </w:p>
-    <w:p>
-      <w:pPr>
-        <w:pStyle w:val="a9"/>
-        <w:numPr>
-          <w:ilvl w:val="0"/>
-          <w:numId w:val="50"/>
-        </w:numPr>
-        <w:rPr>
-          <w:rFonts w:ascii="Times New Roman" w:eastAsia="宋体" w:hAnsi="Times New Roman" w:cs="Times New Roman"/>
-        </w:rPr>
-      </w:pPr>
-      <w:r>
-        <w:rPr>
-          <w:rFonts w:ascii="Times New Roman" w:eastAsia="宋体" w:hAnsi="Times New Roman" w:cs="Times New Roman" w:hint="eastAsia"/>
-        </w:rPr>
-        <w:t>单人任务设置</w:t>
-      </w:r>
-      <w:r>
-        <w:rPr>
-          <w:rFonts w:ascii="Times New Roman" w:eastAsia="宋体" w:hAnsi="Times New Roman" w:cs="Times New Roman" w:hint="eastAsia"/>
-        </w:rPr>
-        <w:t>-</w:t>
-      </w:r>
-      <w:r>
-        <w:rPr>
-          <w:rFonts w:ascii="Times New Roman" w:eastAsia="宋体" w:hAnsi="Times New Roman" w:cs="Times New Roman" w:hint="eastAsia"/>
-        </w:rPr>
-        <w:t>幻影伪装树木可以使用绘制随机树木窗口进行选择</w:t>
-      </w:r>
-    </w:p>
-    <w:p>
-      <w:pPr>
-        <w:pStyle w:val="a9"/>
-        <w:numPr>
-          <w:ilvl w:val="0"/>
-          <w:numId w:val="50"/>
-        </w:numPr>
-        <w:rPr>
-          <w:rFonts w:ascii="Times New Roman" w:eastAsia="宋体" w:hAnsi="Times New Roman" w:cs="Times New Roman"/>
-        </w:rPr>
-      </w:pPr>
-      <w:r>
-        <w:rPr>
-          <w:rFonts w:ascii="Times New Roman" w:eastAsia="宋体" w:hAnsi="Times New Roman" w:cs="Times New Roman" w:hint="eastAsia"/>
-        </w:rPr>
-        <w:t>放置高架桥头时，可以显示辅助参考线</w:t>
-      </w:r>
-    </w:p>
-    <w:p>
-      <w:pPr>
-        <w:pStyle w:val="a9"/>
-        <w:numPr>
-          <w:ilvl w:val="0"/>
-          <w:numId w:val="50"/>
-        </w:numPr>
-        <w:rPr>
-          <w:rFonts w:ascii="Times New Roman" w:eastAsia="宋体" w:hAnsi="Times New Roman" w:cs="Times New Roman"/>
-        </w:rPr>
-      </w:pPr>
-      <w:r>
-        <w:rPr>
-          <w:rFonts w:ascii="Times New Roman" w:eastAsia="宋体" w:hAnsi="Times New Roman" w:cs="Times New Roman" w:hint="eastAsia"/>
-        </w:rPr>
-        <w:t>为触发编辑器检查下级触发是否是自身添加开关，详见</w:t>
-      </w:r>
-      <w:r>
-        <w:rPr>
-          <w:rFonts w:ascii="Times New Roman" w:eastAsia="宋体" w:hAnsi="Times New Roman" w:cs="Times New Roman" w:hint="eastAsia"/>
-        </w:rPr>
-        <w:t>AttachedTriggerIsSelfCheck</w:t>
-      </w:r>
-    </w:p>
-    <w:p>
-      <w:pPr>
-        <w:pStyle w:val="a9"/>
-        <w:numPr>
-          <w:ilvl w:val="0"/>
-          <w:numId w:val="50"/>
-        </w:numPr>
-        <w:rPr>
-          <w:rFonts w:ascii="Times New Roman" w:eastAsia="宋体" w:hAnsi="Times New Roman" w:cs="Times New Roman"/>
-        </w:rPr>
-      </w:pPr>
-      <w:r>
-        <w:rPr>
-          <w:rFonts w:ascii="Times New Roman" w:eastAsia="宋体" w:hAnsi="Times New Roman" w:cs="Times New Roman" w:hint="eastAsia"/>
-        </w:rPr>
-        <w:t>修复遭遇战地图预览渲染时没有正确标记高架桥的</w:t>
-      </w:r>
-      <w:r>
-        <w:rPr>
-          <w:rFonts w:ascii="Times New Roman" w:eastAsia="宋体" w:hAnsi="Times New Roman" w:cs="Times New Roman" w:hint="eastAsia"/>
-        </w:rPr>
-        <w:t>bug</w:t>
-      </w:r>
-    </w:p>
-    <w:p>
-      <w:pPr>
-        <w:pStyle w:val="a9"/>
-        <w:numPr>
-          <w:ilvl w:val="0"/>
-          <w:numId w:val="50"/>
-        </w:numPr>
-        <w:rPr>
-          <w:rFonts w:ascii="Times New Roman" w:eastAsia="宋体" w:hAnsi="Times New Roman" w:cs="Times New Roman"/>
-        </w:rPr>
-      </w:pPr>
-      <w:r>
-        <w:rPr>
-          <w:rFonts w:ascii="Times New Roman" w:eastAsia="宋体" w:hAnsi="Times New Roman" w:cs="Times New Roman" w:hint="eastAsia"/>
-        </w:rPr>
-        <w:t>为</w:t>
-      </w:r>
-      <w:r>
-        <w:rPr>
-          <w:rFonts w:ascii="Times New Roman" w:eastAsia="宋体" w:hAnsi="Times New Roman" w:cs="Times New Roman" w:hint="eastAsia"/>
-        </w:rPr>
-        <w:t>Lua</w:t>
-      </w:r>
-      <w:r>
-        <w:rPr>
-          <w:rFonts w:ascii="Times New Roman" w:eastAsia="宋体" w:hAnsi="Times New Roman" w:cs="Times New Roman" w:hint="eastAsia"/>
-        </w:rPr>
-        <w:t>脚本终端添加安全检查，会在执行前静态检查高危操作，详见</w:t>
-      </w:r>
-      <w:r>
-        <w:rPr>
-          <w:rFonts w:ascii="Times New Roman" w:eastAsia="宋体" w:hAnsi="Times New Roman" w:cs="Times New Roman" w:hint="eastAsia"/>
-        </w:rPr>
-        <w:t>DisableLuaConsoleSafetyCheck</w:t>
-      </w:r>
-    </w:p>
-    <w:p>
-      <w:pPr>
-        <w:pStyle w:val="a9"/>
-        <w:numPr>
-          <w:ilvl w:val="0"/>
-          <w:numId w:val="50"/>
-        </w:numPr>
-        <w:rPr>
-          <w:rFonts w:ascii="Times New Roman" w:eastAsia="宋体" w:hAnsi="Times New Roman" w:cs="Times New Roman"/>
-        </w:rPr>
-      </w:pPr>
-      <w:r>
-        <w:rPr>
-          <w:rFonts w:ascii="Times New Roman" w:eastAsia="宋体" w:hAnsi="Times New Roman" w:cs="Times New Roman" w:hint="eastAsia"/>
-        </w:rPr>
-        <w:t>可以在地图视图内按方向键调节视角，同时按住</w:t>
-      </w:r>
-      <w:r>
-        <w:rPr>
-          <w:rFonts w:ascii="Times New Roman" w:eastAsia="宋体" w:hAnsi="Times New Roman" w:cs="Times New Roman" w:hint="eastAsia"/>
-        </w:rPr>
-        <w:t>ctrl</w:t>
-      </w:r>
-      <w:r>
-        <w:rPr>
-          <w:rFonts w:ascii="Times New Roman" w:eastAsia="宋体" w:hAnsi="Times New Roman" w:cs="Times New Roman" w:hint="eastAsia"/>
-        </w:rPr>
-        <w:t>键加速移动</w:t>
-      </w:r>
-    </w:p>
-    <w:p>
-      <w:pPr>
-        <w:pStyle w:val="a9"/>
-        <w:numPr>
-          <w:ilvl w:val="0"/>
-          <w:numId w:val="50"/>
-        </w:numPr>
-        <w:rPr>
-          <w:rFonts w:ascii="Times New Roman" w:eastAsia="宋体" w:hAnsi="Times New Roman" w:cs="Times New Roman"/>
-        </w:rPr>
-      </w:pPr>
-      <w:r>
-        <w:rPr>
-          <w:rFonts w:ascii="Times New Roman" w:eastAsia="宋体" w:hAnsi="Times New Roman" w:cs="Times New Roman" w:hint="eastAsia"/>
-        </w:rPr>
-        <w:t>修复部分遭遇战地图所属方选项重复的</w:t>
-      </w:r>
-      <w:r>
-        <w:rPr>
-          <w:rFonts w:ascii="Times New Roman" w:eastAsia="宋体" w:hAnsi="Times New Roman" w:cs="Times New Roman" w:hint="eastAsia"/>
-        </w:rPr>
-        <w:t>bug</w:t>
-      </w:r>
-    </w:p>
-    <w:p>
-      <w:pPr>
-        <w:pStyle w:val="a9"/>
-        <w:numPr>
-          <w:ilvl w:val="0"/>
-          <w:numId w:val="50"/>
-        </w:numPr>
-        <w:rPr>
-          <w:rFonts w:ascii="Times New Roman" w:eastAsia="宋体" w:hAnsi="Times New Roman" w:cs="Times New Roman"/>
-        </w:rPr>
-      </w:pPr>
-      <w:r>
-        <w:rPr>
-          <w:rFonts w:ascii="Times New Roman" w:eastAsia="宋体" w:hAnsi="Times New Roman" w:cs="Times New Roman" w:hint="eastAsia"/>
-        </w:rPr>
-        <w:t>重写单位属性对话框，标签支持搜索，所属方可以显示颜色</w:t>
-      </w:r>
-    </w:p>
-    <w:p>
-      <w:pPr>
-        <w:pStyle w:val="a9"/>
-        <w:numPr>
-          <w:ilvl w:val="0"/>
-          <w:numId w:val="50"/>
-        </w:numPr>
-        <w:rPr>
-          <w:rFonts w:ascii="Times New Roman" w:eastAsia="宋体" w:hAnsi="Times New Roman" w:cs="Times New Roman"/>
-        </w:rPr>
-      </w:pPr>
-      <w:r>
-        <w:rPr>
-          <w:rFonts w:ascii="Times New Roman" w:eastAsia="宋体" w:hAnsi="Times New Roman" w:cs="Times New Roman" w:hint="eastAsia"/>
-        </w:rPr>
-        <w:t>支持将</w:t>
-      </w:r>
-      <w:r>
-        <w:rPr>
-          <w:rFonts w:ascii="Times New Roman" w:eastAsia="宋体" w:hAnsi="Times New Roman" w:cs="Times New Roman" w:hint="eastAsia"/>
-        </w:rPr>
-        <w:t>物品浏览器和</w:t>
-      </w:r>
-      <w:r>
-        <w:rPr>
-          <w:rFonts w:ascii="Times New Roman" w:eastAsia="宋体" w:hAnsi="Times New Roman" w:cs="Times New Roman" w:hint="eastAsia"/>
-        </w:rPr>
-        <w:t>地形浏览器作为一个独立窗口显示</w:t>
-      </w:r>
-      <w:r>
-        <w:rPr>
-          <w:rFonts w:ascii="Times New Roman" w:eastAsia="宋体" w:hAnsi="Times New Roman" w:cs="Times New Roman" w:hint="eastAsia"/>
-        </w:rPr>
-        <w:t>，可以调节透明度</w:t>
-      </w:r>
-      <w:r>
-        <w:rPr>
-          <w:rFonts w:ascii="Times New Roman" w:eastAsia="宋体" w:hAnsi="Times New Roman" w:cs="Times New Roman" w:hint="eastAsia"/>
-        </w:rPr>
-        <w:t>，详见</w:t>
-      </w:r>
-      <w:r>
-        <w:rPr>
-          <w:rFonts w:ascii="Times New Roman" w:eastAsia="宋体" w:hAnsi="Times New Roman" w:cs="Times New Roman" w:hint="eastAsia"/>
-        </w:rPr>
-        <w:t>ViewObjectsFloating</w:t>
-      </w:r>
-      <w:r>
-        <w:rPr>
-          <w:rFonts w:ascii="Times New Roman" w:eastAsia="宋体" w:hAnsi="Times New Roman" w:cs="Times New Roman" w:hint="eastAsia"/>
-        </w:rPr>
-        <w:t>和</w:t>
-      </w:r>
-      <w:r>
-        <w:rPr>
-          <w:rFonts w:ascii="Times New Roman" w:eastAsia="宋体" w:hAnsi="Times New Roman" w:cs="Times New Roman" w:hint="eastAsia"/>
-        </w:rPr>
-        <w:t>TileSetBrowserFloating</w:t>
-      </w:r>
-    </w:p>
-    <w:p>
-      <w:pPr>
-        <w:pStyle w:val="a9"/>
-        <w:numPr>
-          <w:ilvl w:val="0"/>
-          <w:numId w:val="50"/>
-        </w:numPr>
-        <w:rPr>
-          <w:rFonts w:ascii="Times New Roman" w:eastAsia="宋体" w:hAnsi="Times New Roman" w:cs="Times New Roman"/>
-        </w:rPr>
-      </w:pPr>
-      <w:r>
-        <w:rPr>
-          <w:rFonts w:ascii="Times New Roman" w:eastAsia="宋体" w:hAnsi="Times New Roman" w:cs="Times New Roman" w:hint="eastAsia"/>
-        </w:rPr>
-        <w:t>绝大多数窗口可以调节透明度</w:t>
-      </w:r>
-    </w:p>
-    <w:p>
-      <w:pPr>
-        <w:pStyle w:val="a9"/>
-        <w:numPr>
-          <w:ilvl w:val="0"/>
-          <w:numId w:val="50"/>
-        </w:numPr>
-        <w:rPr>
-          <w:rFonts w:ascii="Times New Roman" w:eastAsia="宋体" w:hAnsi="Times New Roman" w:cs="Times New Roman"/>
-        </w:rPr>
-      </w:pPr>
-      <w:r>
-        <w:rPr>
-          <w:rFonts w:ascii="Times New Roman" w:eastAsia="宋体" w:hAnsi="Times New Roman" w:cs="Times New Roman" w:hint="eastAsia"/>
-        </w:rPr>
-        <w:t>修复部分情况下按工具栏擦除覆盖物等按钮不生效的</w:t>
-      </w:r>
-      <w:r>
-        <w:rPr>
-          <w:rFonts w:ascii="Times New Roman" w:eastAsia="宋体" w:hAnsi="Times New Roman" w:cs="Times New Roman" w:hint="eastAsia"/>
-        </w:rPr>
-        <w:t>bug</w:t>
-      </w:r>
-    </w:p>
-    <w:p>
-      <w:pPr>
-        <w:pStyle w:val="a9"/>
-        <w:numPr>
-          <w:ilvl w:val="0"/>
-          <w:numId w:val="50"/>
-        </w:numPr>
-        <w:rPr>
-          <w:rFonts w:ascii="Times New Roman" w:eastAsia="宋体" w:hAnsi="Times New Roman" w:cs="Times New Roman"/>
-        </w:rPr>
-      </w:pPr>
-      <w:r>
-        <w:rPr>
-          <w:rFonts w:ascii="Times New Roman" w:eastAsia="宋体" w:hAnsi="Times New Roman" w:cs="Times New Roman" w:hint="eastAsia"/>
-        </w:rPr>
-        <w:t>修复暗色模式下非主程序菜单的背景色被错误填充的</w:t>
-      </w:r>
-      <w:r>
-        <w:rPr>
-          <w:rFonts w:ascii="Times New Roman" w:eastAsia="宋体" w:hAnsi="Times New Roman" w:cs="Times New Roman" w:hint="eastAsia"/>
-        </w:rPr>
-        <w:t>bug</w:t>
-      </w:r>
-    </w:p>
-    <w:p>
-      <w:pPr>
-        <w:pStyle w:val="a9"/>
-        <w:numPr>
-          <w:ilvl w:val="0"/>
-          <w:numId w:val="50"/>
-        </w:numPr>
-        <w:rPr>
-          <w:rFonts w:ascii="Times New Roman" w:eastAsia="宋体" w:hAnsi="Times New Roman" w:cs="Times New Roman"/>
-        </w:rPr>
-      </w:pPr>
-      <w:r>
-        <w:rPr>
-          <w:rFonts w:ascii="Times New Roman" w:eastAsia="宋体" w:hAnsi="Times New Roman" w:cs="Times New Roman" w:hint="eastAsia"/>
-        </w:rPr>
-        <w:t>为触发编辑器、</w:t>
-      </w:r>
-      <w:r>
-        <w:rPr>
-          <w:rFonts w:ascii="Times New Roman" w:eastAsia="宋体" w:hAnsi="Times New Roman" w:cs="Times New Roman" w:hint="eastAsia"/>
-        </w:rPr>
-        <w:t>AI</w:t>
-      </w:r>
-      <w:r>
-        <w:rPr>
-          <w:rFonts w:ascii="Times New Roman" w:eastAsia="宋体" w:hAnsi="Times New Roman" w:cs="Times New Roman" w:hint="eastAsia"/>
-        </w:rPr>
-        <w:t>触发编辑器增加跳转按钮，可以跳转到参数对应的路径点、小队等位置</w:t>
-      </w:r>
-    </w:p>
-    <w:p>
-      <w:pPr>
-        <w:pStyle w:val="a9"/>
-        <w:numPr>
-          <w:ilvl w:val="0"/>
-          <w:numId w:val="50"/>
-        </w:numPr>
-        <w:rPr>
-          <w:rFonts w:ascii="Times New Roman" w:eastAsia="宋体" w:hAnsi="Times New Roman" w:cs="Times New Roman"/>
-        </w:rPr>
-      </w:pPr>
-      <w:r>
-        <w:rPr>
-          <w:rFonts w:ascii="Times New Roman" w:eastAsia="宋体" w:hAnsi="Times New Roman" w:cs="Times New Roman" w:hint="eastAsia"/>
-        </w:rPr>
-        <w:t>受损火焰能正确被其他单位遮挡</w:t>
-      </w:r>
-      <w:r>
-        <w:rPr>
-          <w:rFonts w:ascii="Times New Roman" w:eastAsia="宋体" w:hAnsi="Times New Roman" w:cs="Times New Roman" w:hint="eastAsia"/>
-        </w:rPr>
-        <w:t>，可以读取</w:t>
-      </w:r>
-      <w:r>
-        <w:rPr>
-          <w:rFonts w:ascii="Times New Roman" w:eastAsia="宋体" w:hAnsi="Times New Roman" w:cs="Times New Roman" w:hint="eastAsia"/>
-        </w:rPr>
-        <w:t>Next=</w:t>
-      </w:r>
-      <w:r>
-        <w:rPr>
-          <w:rFonts w:ascii="Times New Roman" w:eastAsia="宋体" w:hAnsi="Times New Roman" w:cs="Times New Roman" w:hint="eastAsia"/>
-        </w:rPr>
-        <w:t>最终的</w:t>
-      </w:r>
-      <w:r>
-        <w:rPr>
-          <w:rFonts w:ascii="Times New Roman" w:eastAsia="宋体" w:hAnsi="Times New Roman" w:cs="Times New Roman" w:hint="eastAsia"/>
-        </w:rPr>
-        <w:t>图像</w:t>
-      </w:r>
-    </w:p>
-    <w:p>
-      <w:pPr>
-        <w:pStyle w:val="a9"/>
-        <w:numPr>
-          <w:ilvl w:val="0"/>
-          <w:numId w:val="50"/>
-        </w:numPr>
-        <w:rPr>
-          <w:rFonts w:ascii="Times New Roman" w:eastAsia="宋体" w:hAnsi="Times New Roman" w:cs="Times New Roman"/>
-        </w:rPr>
-      </w:pPr>
-      <w:r>
-        <w:rPr>
-          <w:rFonts w:ascii="Times New Roman" w:eastAsia="宋体" w:hAnsi="Times New Roman" w:cs="Times New Roman" w:hint="eastAsia"/>
-        </w:rPr>
-        <w:t>抬升、降低、平坦地表工具增加顶点模式，切换后可以直接修改顶点高度，</w:t>
-      </w:r>
-      <w:r>
-        <w:rPr>
-          <w:rFonts w:ascii="Times New Roman" w:eastAsia="宋体" w:hAnsi="Times New Roman" w:cs="Times New Roman" w:hint="eastAsia"/>
-        </w:rPr>
-        <w:lastRenderedPageBreak/>
-        <w:t>生成更精细的斜坡</w:t>
+        <w:t>抬升、降低、平坦地表工具增加顶点模式，切换后可以直接修改顶点高度，生成更精细的斜坡</w:t>
       </w:r>
     </w:p>
     <w:p>
@@ -4049,6 +4067,7 @@
         <w:rPr>
           <w:rFonts w:ascii="Times New Roman" w:eastAsia="宋体" w:hAnsi="Times New Roman" w:cs="Times New Roman" w:hint="eastAsia"/>
         </w:rPr>
+        <w:lastRenderedPageBreak/>
         <w:t>修复在老系统上展开下拉菜单使用滚轮时，会错误触发文本框选择切换的</w:t>
       </w:r>
       <w:r>
@@ -4073,7 +4092,6 @@
         <w:rPr>
           <w:rFonts w:ascii="Times New Roman" w:eastAsia="宋体" w:hAnsi="Times New Roman" w:cs="Times New Roman" w:hint="eastAsia"/>
         </w:rPr>
-        <w:lastRenderedPageBreak/>
         <w:t>修复</w:t>
       </w:r>
       <w:r>
@@ -4965,6 +4983,7 @@
         <w:rPr>
           <w:rFonts w:ascii="Times New Roman" w:eastAsia="宋体" w:hAnsi="Times New Roman" w:cs="Times New Roman" w:hint="eastAsia"/>
         </w:rPr>
+        <w:lastRenderedPageBreak/>
         <w:t>可以记忆地形浏览器的大小</w:t>
       </w:r>
     </w:p>
@@ -4983,7 +5002,6 @@
         <w:rPr>
           <w:rFonts w:ascii="Times New Roman" w:eastAsia="宋体" w:hAnsi="Times New Roman" w:cs="Times New Roman" w:hint="eastAsia"/>
         </w:rPr>
-        <w:lastRenderedPageBreak/>
         <w:t>地形浏览器、覆盖物浏览器、对象查看器可以按住</w:t>
       </w:r>
       <w:r>
@@ -5892,6 +5910,7 @@
         <w:rPr>
           <w:rFonts w:ascii="Times New Roman" w:eastAsia="宋体" w:hAnsi="Times New Roman" w:cs="Times New Roman" w:hint="eastAsia"/>
         </w:rPr>
+        <w:lastRenderedPageBreak/>
         <w:t>AI</w:t>
       </w:r>
       <w:r>
@@ -5922,7 +5941,6 @@
         <w:rPr>
           <w:rFonts w:ascii="Times New Roman" w:eastAsia="宋体" w:hAnsi="Times New Roman" w:cs="Times New Roman" w:hint="eastAsia"/>
         </w:rPr>
-        <w:lastRenderedPageBreak/>
         <w:t>修复通用格式刷同时应用于多种不同对象时，</w:t>
       </w:r>
       <w:r>
@@ -6777,6 +6795,7 @@
         <w:rPr>
           <w:rFonts w:ascii="Times New Roman" w:eastAsia="宋体" w:hAnsi="Times New Roman" w:cs="Times New Roman" w:hint="eastAsia"/>
         </w:rPr>
+        <w:lastRenderedPageBreak/>
         <w:t>修复导入已存在的地图对话框中三个导入选项不正常的</w:t>
       </w:r>
       <w:r>
@@ -6801,7 +6820,6 @@
         <w:rPr>
           <w:rFonts w:ascii="Times New Roman" w:eastAsia="宋体" w:hAnsi="Times New Roman" w:cs="Times New Roman" w:hint="eastAsia"/>
         </w:rPr>
-        <w:lastRenderedPageBreak/>
         <w:t>地图工具</w:t>
       </w:r>
       <w:r>
@@ -7855,6 +7873,7 @@
         <w:rPr>
           <w:rFonts w:ascii="Times New Roman" w:eastAsia="宋体" w:hAnsi="Times New Roman" w:cs="Times New Roman" w:hint="eastAsia"/>
         </w:rPr>
+        <w:lastRenderedPageBreak/>
         <w:t>支持自定义气候类型的</w:t>
       </w:r>
       <w:r>
@@ -7895,7 +7914,6 @@
           <w:kern w:val="0"/>
           <w14:ligatures w14:val="none"/>
         </w:rPr>
-        <w:lastRenderedPageBreak/>
         <w:t>科技类型、</w:t>
       </w:r>
       <w:r>
@@ -9038,6 +9056,7 @@
         <w:rPr>
           <w:rFonts w:ascii="Times New Roman" w:eastAsia="宋体" w:hAnsi="Times New Roman" w:cs="Times New Roman" w:hint="eastAsia"/>
         </w:rPr>
+        <w:lastRenderedPageBreak/>
         <w:t>修复当显示缺省图像开启时，对没有影子帧的单位显示缺省阴影的</w:t>
       </w:r>
       <w:r>
@@ -9062,7 +9081,6 @@
         <w:rPr>
           <w:rFonts w:ascii="Times New Roman" w:eastAsia="宋体" w:hAnsi="Times New Roman" w:cs="Times New Roman" w:hint="eastAsia"/>
         </w:rPr>
-        <w:lastRenderedPageBreak/>
         <w:t>支持读取</w:t>
       </w:r>
       <w:r>
@@ -10059,6 +10077,7 @@
         <w:rPr>
           <w:rFonts w:ascii="Times New Roman" w:eastAsia="宋体" w:hAnsi="Times New Roman" w:cs="Times New Roman" w:hint="eastAsia"/>
         </w:rPr>
+        <w:lastRenderedPageBreak/>
         <w:t>支持车辆单位的额外炮塔和额外炮管</w:t>
       </w:r>
     </w:p>
@@ -10077,7 +10096,6 @@
         <w:rPr>
           <w:rFonts w:ascii="Times New Roman" w:eastAsia="宋体" w:hAnsi="Times New Roman" w:cs="Times New Roman"/>
         </w:rPr>
-        <w:lastRenderedPageBreak/>
         <w:t>I</w:t>
       </w:r>
       <w:r>

</xml_diff>

<commit_message>
keep existing map preview when auto saving
</commit_message>
<xml_diff>
--- a/Supplementary/文档/FA2SP HDM Edition说明文档.docx
+++ b/Supplementary/文档/FA2SP HDM Edition说明文档.docx
@@ -473,6 +473,30 @@
           <w:rFonts w:ascii="Times New Roman" w:eastAsia="宋体" w:hAnsi="Times New Roman" w:cs="Times New Roman" w:hint="eastAsia"/>
         </w:rPr>
         <w:t>作战小队编辑器的小队出现于和运输机起始路径点可以跳转</w:t>
+      </w:r>
+    </w:p>
+    <w:p>
+      <w:pPr>
+        <w:pStyle w:val="a9"/>
+        <w:numPr>
+          <w:ilvl w:val="0"/>
+          <w:numId w:val="11"/>
+        </w:numPr>
+        <w:rPr>
+          <w:rFonts w:ascii="Times New Roman" w:eastAsia="宋体" w:hAnsi="Times New Roman" w:cs="Times New Roman"/>
+        </w:rPr>
+      </w:pPr>
+      <w:r>
+        <w:rPr>
+          <w:rFonts w:ascii="Times New Roman" w:eastAsia="宋体" w:hAnsi="Times New Roman" w:cs="Times New Roman" w:hint="eastAsia"/>
+        </w:rPr>
+        <w:t>自动保存地图时维持已有缩略图</w:t>
+      </w:r>
+      <w:r>
+        <w:rPr>
+          <w:rFonts w:ascii="Times New Roman" w:eastAsia="宋体" w:hAnsi="Times New Roman" w:cs="Times New Roman" w:hint="eastAsia"/>
+        </w:rPr>
+        <w:t>，而不是清空缩略图</w:t>
       </w:r>
     </w:p>
     <w:p>
@@ -50731,7 +50755,7 @@
         <v:path o:extrusionok="f" gradientshapeok="t" o:connecttype="rect"/>
         <o:lock v:ext="edit" aspectratio="t"/>
       </v:shapetype>
-      <v:shape id="_x0000_i1030" type="#_x0000_t75" style="width:11.55pt;height:11.55pt" o:bullet="t">
+      <v:shape id="_x0000_i1032" type="#_x0000_t75" style="width:11.55pt;height:11.55pt" o:bullet="t">
         <v:imagedata r:id="rId1" o:title="mso9A9A"/>
       </v:shape>
     </w:pict>

</xml_diff>

<commit_message>
improve vertex tool around non-morphable tiles
</commit_message>
<xml_diff>
--- a/Supplementary/文档/FA2SP HDM Edition说明文档.docx
+++ b/Supplementary/文档/FA2SP HDM Edition说明文档.docx
@@ -174,7 +174,7 @@
           <w:rFonts w:ascii="宋体" w:eastAsia="宋体" w:hAnsi="宋体" w:hint="eastAsia"/>
           <w:sz w:val="24"/>
         </w:rPr>
-        <w:t>2</w:t>
+        <w:t>3</w:t>
       </w:r>
     </w:p>
     <w:p>
@@ -246,7 +246,7 @@
           <w:sz w:val="28"/>
           <w:szCs w:val="32"/>
         </w:rPr>
-        <w:t>2</w:t>
+        <w:t>3</w:t>
       </w:r>
       <w:r>
         <w:rPr>
@@ -504,6 +504,24 @@
         <w:pStyle w:val="a9"/>
         <w:numPr>
           <w:ilvl w:val="0"/>
+          <w:numId w:val="11"/>
+        </w:numPr>
+        <w:rPr>
+          <w:rFonts w:ascii="Times New Roman" w:eastAsia="宋体" w:hAnsi="Times New Roman" w:cs="Times New Roman"/>
+        </w:rPr>
+      </w:pPr>
+      <w:r>
+        <w:rPr>
+          <w:rFonts w:ascii="Times New Roman" w:eastAsia="宋体" w:hAnsi="Times New Roman" w:cs="Times New Roman" w:hint="eastAsia"/>
+        </w:rPr>
+        <w:t>优化顶点高度工具在不可抬升地形边缘使用时的表现</w:t>
+      </w:r>
+    </w:p>
+    <w:p>
+      <w:pPr>
+        <w:pStyle w:val="a9"/>
+        <w:numPr>
+          <w:ilvl w:val="0"/>
           <w:numId w:val="10"/>
         </w:numPr>
         <w:rPr>
@@ -856,6 +874,7 @@
         <w:rPr>
           <w:rFonts w:ascii="Times New Roman" w:eastAsia="宋体" w:hAnsi="Times New Roman" w:cs="Times New Roman" w:hint="eastAsia"/>
         </w:rPr>
+        <w:lastRenderedPageBreak/>
         <w:t>脚本编辑器中，当参数是路径点时，支持跳转到对应坐标</w:t>
       </w:r>
     </w:p>
@@ -882,7 +901,6 @@
           <w:sz w:val="28"/>
           <w:szCs w:val="32"/>
         </w:rPr>
-        <w:lastRenderedPageBreak/>
         <w:t>1.5.1 (2026.0</w:t>
       </w:r>
       <w:r>
@@ -2047,6 +2065,7 @@
         <w:rPr>
           <w:rFonts w:ascii="Times New Roman" w:eastAsia="宋体" w:hAnsi="Times New Roman" w:cs="Times New Roman" w:hint="eastAsia"/>
         </w:rPr>
+        <w:lastRenderedPageBreak/>
         <w:t>修复按键盘</w:t>
       </w:r>
       <w:r>
@@ -2083,913 +2102,913 @@
         <w:rPr>
           <w:rFonts w:ascii="Times New Roman" w:eastAsia="宋体" w:hAnsi="Times New Roman" w:cs="Times New Roman" w:hint="eastAsia"/>
         </w:rPr>
+        <w:t>调整地形浏览器图像的选中矩形框，使其更加明显</w:t>
+      </w:r>
+    </w:p>
+    <w:p>
+      <w:pPr>
+        <w:pStyle w:val="a9"/>
+        <w:numPr>
+          <w:ilvl w:val="0"/>
+          <w:numId w:val="50"/>
+        </w:numPr>
+        <w:rPr>
+          <w:rFonts w:ascii="Times New Roman" w:eastAsia="宋体" w:hAnsi="Times New Roman" w:cs="Times New Roman"/>
+        </w:rPr>
+      </w:pPr>
+      <w:r>
+        <w:rPr>
+          <w:rFonts w:ascii="Times New Roman" w:eastAsia="宋体" w:hAnsi="Times New Roman" w:cs="Times New Roman" w:hint="eastAsia"/>
+        </w:rPr>
+        <w:t>修复渲染地图时不渲染</w:t>
+      </w:r>
+      <w:r>
+        <w:rPr>
+          <w:rFonts w:ascii="Times New Roman" w:eastAsia="宋体" w:hAnsi="Times New Roman" w:cs="Times New Roman" w:hint="eastAsia"/>
+        </w:rPr>
+        <w:t>InvisibleInGame=yes</w:t>
+      </w:r>
+      <w:r>
+        <w:rPr>
+          <w:rFonts w:ascii="Times New Roman" w:eastAsia="宋体" w:hAnsi="Times New Roman" w:cs="Times New Roman" w:hint="eastAsia"/>
+        </w:rPr>
+        <w:t>的建筑的</w:t>
+      </w:r>
+      <w:r>
+        <w:rPr>
+          <w:rFonts w:ascii="Times New Roman" w:eastAsia="宋体" w:hAnsi="Times New Roman" w:cs="Times New Roman" w:hint="eastAsia"/>
+        </w:rPr>
+        <w:t>AlphaImage</w:t>
+      </w:r>
+      <w:r>
+        <w:rPr>
+          <w:rFonts w:ascii="Times New Roman" w:eastAsia="宋体" w:hAnsi="Times New Roman" w:cs="Times New Roman" w:hint="eastAsia"/>
+        </w:rPr>
+        <w:t>的</w:t>
+      </w:r>
+      <w:r>
+        <w:rPr>
+          <w:rFonts w:ascii="Times New Roman" w:eastAsia="宋体" w:hAnsi="Times New Roman" w:cs="Times New Roman" w:hint="eastAsia"/>
+        </w:rPr>
+        <w:t>bug</w:t>
+      </w:r>
+    </w:p>
+    <w:p>
+      <w:pPr>
+        <w:pStyle w:val="a9"/>
+        <w:numPr>
+          <w:ilvl w:val="0"/>
+          <w:numId w:val="50"/>
+        </w:numPr>
+        <w:rPr>
+          <w:rFonts w:ascii="Times New Roman" w:eastAsia="宋体" w:hAnsi="Times New Roman" w:cs="Times New Roman"/>
+        </w:rPr>
+      </w:pPr>
+      <w:r>
+        <w:rPr>
+          <w:rFonts w:ascii="Times New Roman" w:eastAsia="宋体" w:hAnsi="Times New Roman" w:cs="Times New Roman" w:hint="eastAsia"/>
+        </w:rPr>
+        <w:t>修复启用建筑筛选时无法隐藏阴影的</w:t>
+      </w:r>
+      <w:r>
+        <w:rPr>
+          <w:rFonts w:ascii="Times New Roman" w:eastAsia="宋体" w:hAnsi="Times New Roman" w:cs="Times New Roman" w:hint="eastAsia"/>
+        </w:rPr>
+        <w:t>bug</w:t>
+      </w:r>
+    </w:p>
+    <w:p>
+      <w:pPr>
+        <w:pStyle w:val="a9"/>
+        <w:numPr>
+          <w:ilvl w:val="0"/>
+          <w:numId w:val="50"/>
+        </w:numPr>
+        <w:rPr>
+          <w:rFonts w:ascii="Times New Roman" w:eastAsia="宋体" w:hAnsi="Times New Roman" w:cs="Times New Roman"/>
+        </w:rPr>
+      </w:pPr>
+      <w:r>
+        <w:rPr>
+          <w:rFonts w:ascii="Times New Roman" w:eastAsia="宋体" w:hAnsi="Times New Roman" w:cs="Times New Roman" w:hint="eastAsia"/>
+        </w:rPr>
+        <w:t>查找引用窗口增加</w:t>
+      </w:r>
+      <w:r>
+        <w:rPr>
+          <w:rFonts w:ascii="Times New Roman" w:eastAsia="宋体" w:hAnsi="Times New Roman" w:cs="Times New Roman" w:hint="eastAsia"/>
+        </w:rPr>
+        <w:t>跟随活动窗口</w:t>
+      </w:r>
+      <w:r>
+        <w:rPr>
+          <w:rFonts w:ascii="Times New Roman" w:eastAsia="宋体" w:hAnsi="Times New Roman" w:cs="Times New Roman" w:hint="eastAsia"/>
+        </w:rPr>
+        <w:t>选项，勾选后可以实时根据活动窗口切换内容</w:t>
+      </w:r>
+    </w:p>
+    <w:p>
+      <w:pPr>
+        <w:pStyle w:val="a9"/>
+        <w:numPr>
+          <w:ilvl w:val="0"/>
+          <w:numId w:val="50"/>
+        </w:numPr>
+        <w:rPr>
+          <w:rFonts w:ascii="Times New Roman" w:eastAsia="宋体" w:hAnsi="Times New Roman" w:cs="Times New Roman"/>
+        </w:rPr>
+      </w:pPr>
+      <w:r>
+        <w:rPr>
+          <w:rFonts w:ascii="Times New Roman" w:eastAsia="宋体" w:hAnsi="Times New Roman" w:cs="Times New Roman" w:hint="eastAsia"/>
+        </w:rPr>
+        <w:t>修复修改作战小队名称后，</w:t>
+      </w:r>
+      <w:r>
+        <w:rPr>
+          <w:rFonts w:ascii="Times New Roman" w:eastAsia="宋体" w:hAnsi="Times New Roman" w:cs="Times New Roman" w:hint="eastAsia"/>
+        </w:rPr>
+        <w:t>ai</w:t>
+      </w:r>
+      <w:r>
+        <w:rPr>
+          <w:rFonts w:ascii="Times New Roman" w:eastAsia="宋体" w:hAnsi="Times New Roman" w:cs="Times New Roman" w:hint="eastAsia"/>
+        </w:rPr>
+        <w:t>触发编辑器的小队</w:t>
+      </w:r>
+      <w:r>
+        <w:rPr>
+          <w:rFonts w:ascii="Times New Roman" w:eastAsia="宋体" w:hAnsi="Times New Roman" w:cs="Times New Roman" w:hint="eastAsia"/>
+        </w:rPr>
+        <w:t>#2</w:t>
+      </w:r>
+      <w:r>
+        <w:rPr>
+          <w:rFonts w:ascii="Times New Roman" w:eastAsia="宋体" w:hAnsi="Times New Roman" w:cs="Times New Roman" w:hint="eastAsia"/>
+        </w:rPr>
+        <w:t>显示错误的</w:t>
+      </w:r>
+      <w:r>
+        <w:rPr>
+          <w:rFonts w:ascii="Times New Roman" w:eastAsia="宋体" w:hAnsi="Times New Roman" w:cs="Times New Roman" w:hint="eastAsia"/>
+        </w:rPr>
+        <w:t>bug</w:t>
+      </w:r>
+    </w:p>
+    <w:p>
+      <w:pPr>
+        <w:pStyle w:val="a9"/>
+        <w:numPr>
+          <w:ilvl w:val="0"/>
+          <w:numId w:val="50"/>
+        </w:numPr>
+        <w:rPr>
+          <w:rFonts w:ascii="Times New Roman" w:eastAsia="宋体" w:hAnsi="Times New Roman" w:cs="Times New Roman"/>
+        </w:rPr>
+      </w:pPr>
+      <w:r>
+        <w:rPr>
+          <w:rFonts w:ascii="Times New Roman" w:eastAsia="宋体" w:hAnsi="Times New Roman" w:cs="Times New Roman" w:hint="eastAsia"/>
+        </w:rPr>
+        <w:t>触发、小队等编辑器支持为</w:t>
+      </w:r>
+      <w:r>
+        <w:rPr>
+          <w:rFonts w:ascii="Times New Roman" w:eastAsia="宋体" w:hAnsi="Times New Roman" w:cs="Times New Roman" w:hint="eastAsia"/>
+        </w:rPr>
+        <w:t>ID</w:t>
+      </w:r>
+      <w:r>
+        <w:rPr>
+          <w:rFonts w:ascii="Times New Roman" w:eastAsia="宋体" w:hAnsi="Times New Roman" w:cs="Times New Roman" w:hint="eastAsia"/>
+        </w:rPr>
+        <w:t>染色，双击拖拽小点即可设置颜色</w:t>
+      </w:r>
+    </w:p>
+    <w:p>
+      <w:pPr>
+        <w:pStyle w:val="a9"/>
+        <w:numPr>
+          <w:ilvl w:val="0"/>
+          <w:numId w:val="50"/>
+        </w:numPr>
+        <w:rPr>
+          <w:rFonts w:ascii="Times New Roman" w:eastAsia="宋体" w:hAnsi="Times New Roman" w:cs="Times New Roman"/>
+        </w:rPr>
+      </w:pPr>
+      <w:r>
+        <w:rPr>
+          <w:rFonts w:ascii="Times New Roman" w:eastAsia="宋体" w:hAnsi="Times New Roman" w:cs="Times New Roman" w:hint="eastAsia"/>
+        </w:rPr>
+        <w:t>单元标记支持笔刷大小放置</w:t>
+      </w:r>
+    </w:p>
+    <w:p>
+      <w:pPr>
+        <w:pStyle w:val="a9"/>
+        <w:numPr>
+          <w:ilvl w:val="0"/>
+          <w:numId w:val="50"/>
+        </w:numPr>
+        <w:rPr>
+          <w:rFonts w:ascii="Times New Roman" w:eastAsia="宋体" w:hAnsi="Times New Roman" w:cs="Times New Roman"/>
+        </w:rPr>
+      </w:pPr>
+      <w:r>
+        <w:rPr>
+          <w:rFonts w:ascii="Times New Roman" w:eastAsia="宋体" w:hAnsi="Times New Roman" w:cs="Times New Roman" w:hint="eastAsia"/>
+        </w:rPr>
+        <w:t>增加新的</w:t>
+      </w:r>
+      <w:r>
+        <w:rPr>
+          <w:rFonts w:ascii="Times New Roman" w:eastAsia="宋体" w:hAnsi="Times New Roman" w:cs="Times New Roman" w:hint="eastAsia"/>
+        </w:rPr>
+        <w:t>lua</w:t>
+      </w:r>
+      <w:r>
+        <w:rPr>
+          <w:rFonts w:ascii="Times New Roman" w:eastAsia="宋体" w:hAnsi="Times New Roman" w:cs="Times New Roman" w:hint="eastAsia"/>
+        </w:rPr>
+        <w:t>脚本，由</w:t>
+      </w:r>
+      <w:r>
+        <w:rPr>
+          <w:rFonts w:ascii="Times New Roman" w:eastAsia="宋体" w:hAnsi="Times New Roman" w:cs="Times New Roman" w:hint="eastAsia"/>
+        </w:rPr>
+        <w:t>AUY</w:t>
+      </w:r>
+      <w:r>
+        <w:rPr>
+          <w:rFonts w:ascii="Times New Roman" w:eastAsia="宋体" w:hAnsi="Times New Roman" w:cs="Times New Roman" w:hint="eastAsia"/>
+        </w:rPr>
+        <w:t>制作</w:t>
+      </w:r>
+    </w:p>
+    <w:p>
+      <w:pPr>
+        <w:pStyle w:val="a9"/>
+        <w:numPr>
+          <w:ilvl w:val="0"/>
+          <w:numId w:val="50"/>
+        </w:numPr>
+        <w:rPr>
+          <w:rFonts w:ascii="Times New Roman" w:eastAsia="宋体" w:hAnsi="Times New Roman" w:cs="Times New Roman"/>
+        </w:rPr>
+      </w:pPr>
+      <w:r>
+        <w:rPr>
+          <w:rFonts w:ascii="Times New Roman" w:eastAsia="宋体" w:hAnsi="Times New Roman" w:cs="Times New Roman" w:hint="eastAsia"/>
+        </w:rPr>
+        <w:t>修复跨地图类型粘贴时地形转换部分失效的</w:t>
+      </w:r>
+      <w:r>
+        <w:rPr>
+          <w:rFonts w:ascii="Times New Roman" w:eastAsia="宋体" w:hAnsi="Times New Roman" w:cs="Times New Roman" w:hint="eastAsia"/>
+        </w:rPr>
+        <w:t>bug</w:t>
+      </w:r>
+    </w:p>
+    <w:p>
+      <w:pPr>
+        <w:pStyle w:val="a9"/>
+        <w:numPr>
+          <w:ilvl w:val="0"/>
+          <w:numId w:val="50"/>
+        </w:numPr>
+        <w:rPr>
+          <w:rFonts w:ascii="Times New Roman" w:eastAsia="宋体" w:hAnsi="Times New Roman" w:cs="Times New Roman"/>
+        </w:rPr>
+      </w:pPr>
+      <w:r>
+        <w:rPr>
+          <w:rFonts w:ascii="Times New Roman" w:eastAsia="宋体" w:hAnsi="Times New Roman" w:cs="Times New Roman" w:hint="eastAsia"/>
+        </w:rPr>
+        <w:t>可以记录不同鼠标操作的笔刷大小，并在切换时自动还原，详见</w:t>
+      </w:r>
+      <w:r>
+        <w:rPr>
+          <w:rFonts w:ascii="Times New Roman" w:eastAsia="宋体" w:hAnsi="Times New Roman" w:cs="Times New Roman" w:hint="eastAsia"/>
+        </w:rPr>
+        <w:t>RecordBrushSizeHistory</w:t>
+      </w:r>
+    </w:p>
+    <w:p>
+      <w:pPr>
+        <w:pStyle w:val="a9"/>
+        <w:numPr>
+          <w:ilvl w:val="0"/>
+          <w:numId w:val="50"/>
+        </w:numPr>
+        <w:rPr>
+          <w:rFonts w:ascii="Times New Roman" w:eastAsia="宋体" w:hAnsi="Times New Roman" w:cs="Times New Roman"/>
+        </w:rPr>
+      </w:pPr>
+      <w:r>
+        <w:rPr>
+          <w:rFonts w:ascii="Times New Roman" w:eastAsia="宋体" w:hAnsi="Times New Roman" w:cs="Times New Roman" w:hint="eastAsia"/>
+        </w:rPr>
+        <w:t>增加</w:t>
+      </w:r>
+      <w:r>
+        <w:rPr>
+          <w:rFonts w:ascii="Times New Roman" w:eastAsia="宋体" w:hAnsi="Times New Roman" w:cs="Times New Roman" w:hint="eastAsia"/>
+        </w:rPr>
+        <w:t>/</w:t>
+      </w:r>
+      <w:r>
+        <w:rPr>
+          <w:rFonts w:ascii="Times New Roman" w:eastAsia="宋体" w:hAnsi="Times New Roman" w:cs="Times New Roman" w:hint="eastAsia"/>
+        </w:rPr>
+        <w:t>减少矿石支持调整笔刷大小</w:t>
+      </w:r>
+    </w:p>
+    <w:p>
+      <w:pPr>
+        <w:pStyle w:val="a9"/>
+        <w:numPr>
+          <w:ilvl w:val="0"/>
+          <w:numId w:val="50"/>
+        </w:numPr>
+        <w:rPr>
+          <w:rFonts w:ascii="Times New Roman" w:eastAsia="宋体" w:hAnsi="Times New Roman" w:cs="Times New Roman"/>
+        </w:rPr>
+      </w:pPr>
+      <w:r>
+        <w:rPr>
+          <w:rFonts w:ascii="Times New Roman" w:eastAsia="宋体" w:hAnsi="Times New Roman" w:cs="Times New Roman" w:hint="eastAsia"/>
+        </w:rPr>
+        <w:t>新增</w:t>
+      </w:r>
+      <w:r>
+        <w:rPr>
+          <w:rFonts w:ascii="Times New Roman" w:eastAsia="宋体" w:hAnsi="Times New Roman" w:cs="Times New Roman" w:hint="eastAsia"/>
+        </w:rPr>
+        <w:t>LuaDialog</w:t>
+      </w:r>
+      <w:r>
+        <w:rPr>
+          <w:rFonts w:ascii="Times New Roman" w:eastAsia="宋体" w:hAnsi="Times New Roman" w:cs="Times New Roman" w:hint="eastAsia"/>
+        </w:rPr>
+        <w:t>，可以在</w:t>
+      </w:r>
+      <w:r>
+        <w:rPr>
+          <w:rFonts w:ascii="Times New Roman" w:eastAsia="宋体" w:hAnsi="Times New Roman" w:cs="Times New Roman" w:hint="eastAsia"/>
+        </w:rPr>
+        <w:t>lua</w:t>
+      </w:r>
+      <w:r>
+        <w:rPr>
+          <w:rFonts w:ascii="Times New Roman" w:eastAsia="宋体" w:hAnsi="Times New Roman" w:cs="Times New Roman" w:hint="eastAsia"/>
+        </w:rPr>
+        <w:t>脚本内动态创建自定义窗口</w:t>
+      </w:r>
+    </w:p>
+    <w:p>
+      <w:pPr>
+        <w:pStyle w:val="a9"/>
+        <w:numPr>
+          <w:ilvl w:val="0"/>
+          <w:numId w:val="50"/>
+        </w:numPr>
+        <w:rPr>
+          <w:rFonts w:ascii="Times New Roman" w:eastAsia="宋体" w:hAnsi="Times New Roman" w:cs="Times New Roman"/>
+        </w:rPr>
+      </w:pPr>
+      <w:r>
+        <w:rPr>
+          <w:rFonts w:ascii="Times New Roman" w:eastAsia="宋体" w:hAnsi="Times New Roman" w:cs="Times New Roman" w:hint="eastAsia"/>
+        </w:rPr>
+        <w:t>修复改变地图大小后建筑灯光没有刷新的</w:t>
+      </w:r>
+      <w:r>
+        <w:rPr>
+          <w:rFonts w:ascii="Times New Roman" w:eastAsia="宋体" w:hAnsi="Times New Roman" w:cs="Times New Roman" w:hint="eastAsia"/>
+        </w:rPr>
+        <w:t>bug</w:t>
+      </w:r>
+    </w:p>
+    <w:p>
+      <w:pPr>
+        <w:pStyle w:val="a9"/>
+        <w:numPr>
+          <w:ilvl w:val="0"/>
+          <w:numId w:val="50"/>
+        </w:numPr>
+        <w:rPr>
+          <w:rFonts w:ascii="Times New Roman" w:eastAsia="宋体" w:hAnsi="Times New Roman" w:cs="Times New Roman"/>
+        </w:rPr>
+      </w:pPr>
+      <w:r>
+        <w:rPr>
+          <w:rFonts w:ascii="Times New Roman" w:eastAsia="宋体" w:hAnsi="Times New Roman" w:cs="Times New Roman" w:hint="eastAsia"/>
+        </w:rPr>
+        <w:t>多选模式可以显示不同矿石类型的价格</w:t>
+      </w:r>
+    </w:p>
+    <w:p>
+      <w:pPr>
+        <w:pStyle w:val="a9"/>
+        <w:numPr>
+          <w:ilvl w:val="0"/>
+          <w:numId w:val="50"/>
+        </w:numPr>
+        <w:rPr>
+          <w:rFonts w:ascii="Times New Roman" w:eastAsia="宋体" w:hAnsi="Times New Roman" w:cs="Times New Roman"/>
+        </w:rPr>
+      </w:pPr>
+      <w:r>
+        <w:rPr>
+          <w:rFonts w:ascii="Times New Roman" w:eastAsia="宋体" w:hAnsi="Times New Roman" w:cs="Times New Roman" w:hint="eastAsia"/>
+        </w:rPr>
+        <w:t>优化了绘图界面缩小时的渲染性能</w:t>
+      </w:r>
+    </w:p>
+    <w:p>
+      <w:pPr>
+        <w:pStyle w:val="a9"/>
+        <w:numPr>
+          <w:ilvl w:val="0"/>
+          <w:numId w:val="50"/>
+        </w:numPr>
+        <w:rPr>
+          <w:rFonts w:ascii="Times New Roman" w:eastAsia="宋体" w:hAnsi="Times New Roman" w:cs="Times New Roman"/>
+        </w:rPr>
+      </w:pPr>
+      <w:r>
+        <w:rPr>
+          <w:rFonts w:ascii="Times New Roman" w:eastAsia="宋体" w:hAnsi="Times New Roman" w:cs="Times New Roman" w:hint="eastAsia"/>
+        </w:rPr>
+        <w:t>修复使用触发编辑器拖拽小点为步兵关联标签时，已关联标记没有依据步兵子单元格显示的</w:t>
+      </w:r>
+      <w:r>
+        <w:rPr>
+          <w:rFonts w:ascii="Times New Roman" w:eastAsia="宋体" w:hAnsi="Times New Roman" w:cs="Times New Roman" w:hint="eastAsia"/>
+        </w:rPr>
+        <w:t>bug</w:t>
+      </w:r>
+    </w:p>
+    <w:p>
+      <w:pPr>
+        <w:pStyle w:val="a9"/>
+        <w:numPr>
+          <w:ilvl w:val="0"/>
+          <w:numId w:val="50"/>
+        </w:numPr>
+        <w:rPr>
+          <w:rFonts w:ascii="Times New Roman" w:eastAsia="宋体" w:hAnsi="Times New Roman" w:cs="Times New Roman"/>
+        </w:rPr>
+      </w:pPr>
+      <w:r>
+        <w:rPr>
+          <w:rFonts w:ascii="Times New Roman" w:eastAsia="宋体" w:hAnsi="Times New Roman" w:cs="Times New Roman" w:hint="eastAsia"/>
+        </w:rPr>
+        <w:t>Lua</w:t>
+      </w:r>
+      <w:r>
+        <w:rPr>
+          <w:rFonts w:ascii="Times New Roman" w:eastAsia="宋体" w:hAnsi="Times New Roman" w:cs="Times New Roman" w:hint="eastAsia"/>
+        </w:rPr>
+        <w:t>脚本终端可以开启</w:t>
+      </w:r>
+      <w:r>
+        <w:rPr>
+          <w:rFonts w:ascii="Times New Roman" w:eastAsia="宋体" w:hAnsi="Times New Roman" w:cs="Times New Roman" w:hint="eastAsia"/>
+        </w:rPr>
+        <w:t>MCP</w:t>
+      </w:r>
+      <w:r>
+        <w:rPr>
+          <w:rFonts w:ascii="Times New Roman" w:eastAsia="宋体" w:hAnsi="Times New Roman" w:cs="Times New Roman" w:hint="eastAsia"/>
+        </w:rPr>
+        <w:t>服务器，接入大语言模型调用</w:t>
+      </w:r>
+      <w:r>
+        <w:rPr>
+          <w:rFonts w:ascii="Times New Roman" w:eastAsia="宋体" w:hAnsi="Times New Roman" w:cs="Times New Roman" w:hint="eastAsia"/>
+        </w:rPr>
+        <w:t>lua</w:t>
+      </w:r>
+      <w:r>
+        <w:rPr>
+          <w:rFonts w:ascii="Times New Roman" w:eastAsia="宋体" w:hAnsi="Times New Roman" w:cs="Times New Roman" w:hint="eastAsia"/>
+        </w:rPr>
+        <w:t>脚本</w:t>
+      </w:r>
+      <w:r>
+        <w:rPr>
+          <w:rFonts w:ascii="Times New Roman" w:eastAsia="宋体" w:hAnsi="Times New Roman" w:cs="Times New Roman" w:hint="eastAsia"/>
+        </w:rPr>
+        <w:t>。详见</w:t>
+      </w:r>
+      <w:r>
+        <w:rPr>
+          <w:rFonts w:ascii="Times New Roman" w:eastAsia="宋体" w:hAnsi="Times New Roman" w:cs="Times New Roman" w:hint="eastAsia"/>
+        </w:rPr>
+        <w:t>MCP.Enable</w:t>
+      </w:r>
+    </w:p>
+    <w:p>
+      <w:pPr>
+        <w:pStyle w:val="a9"/>
+        <w:numPr>
+          <w:ilvl w:val="0"/>
+          <w:numId w:val="50"/>
+        </w:numPr>
+        <w:rPr>
+          <w:rFonts w:ascii="Times New Roman" w:eastAsia="宋体" w:hAnsi="Times New Roman" w:cs="Times New Roman"/>
+        </w:rPr>
+      </w:pPr>
+      <w:r>
+        <w:rPr>
+          <w:rFonts w:ascii="Times New Roman" w:eastAsia="宋体" w:hAnsi="Times New Roman" w:cs="Times New Roman" w:hint="eastAsia"/>
+        </w:rPr>
+        <w:t>修复渲染部分</w:t>
+      </w:r>
+      <w:r>
+        <w:rPr>
+          <w:rFonts w:ascii="Times New Roman" w:eastAsia="宋体" w:hAnsi="Times New Roman" w:cs="Times New Roman" w:hint="eastAsia"/>
+        </w:rPr>
+        <w:t>vxl</w:t>
+      </w:r>
+      <w:r>
+        <w:rPr>
+          <w:rFonts w:ascii="Times New Roman" w:eastAsia="宋体" w:hAnsi="Times New Roman" w:cs="Times New Roman" w:hint="eastAsia"/>
+        </w:rPr>
+        <w:t>时崩溃的</w:t>
+      </w:r>
+      <w:r>
+        <w:rPr>
+          <w:rFonts w:ascii="Times New Roman" w:eastAsia="宋体" w:hAnsi="Times New Roman" w:cs="Times New Roman" w:hint="eastAsia"/>
+        </w:rPr>
+        <w:t>bug</w:t>
+      </w:r>
+    </w:p>
+    <w:p>
+      <w:pPr>
+        <w:pStyle w:val="a9"/>
+        <w:numPr>
+          <w:ilvl w:val="0"/>
+          <w:numId w:val="50"/>
+        </w:numPr>
+        <w:rPr>
+          <w:rFonts w:ascii="Times New Roman" w:eastAsia="宋体" w:hAnsi="Times New Roman" w:cs="Times New Roman"/>
+        </w:rPr>
+      </w:pPr>
+      <w:r>
+        <w:rPr>
+          <w:rFonts w:ascii="Times New Roman" w:eastAsia="宋体" w:hAnsi="Times New Roman" w:cs="Times New Roman" w:hint="eastAsia"/>
+        </w:rPr>
+        <w:t>基本设置窗口增加背景音乐和载入界面背景音乐选项</w:t>
+      </w:r>
+    </w:p>
+    <w:p>
+      <w:pPr>
+        <w:pStyle w:val="a9"/>
+        <w:numPr>
+          <w:ilvl w:val="0"/>
+          <w:numId w:val="50"/>
+        </w:numPr>
+        <w:rPr>
+          <w:rFonts w:ascii="Times New Roman" w:eastAsia="宋体" w:hAnsi="Times New Roman" w:cs="Times New Roman"/>
+        </w:rPr>
+      </w:pPr>
+      <w:r>
+        <w:rPr>
+          <w:rFonts w:ascii="Times New Roman" w:eastAsia="宋体" w:hAnsi="Times New Roman" w:cs="Times New Roman" w:hint="eastAsia"/>
+        </w:rPr>
+        <w:t>单人任务设置</w:t>
+      </w:r>
+      <w:r>
+        <w:rPr>
+          <w:rFonts w:ascii="Times New Roman" w:eastAsia="宋体" w:hAnsi="Times New Roman" w:cs="Times New Roman" w:hint="eastAsia"/>
+        </w:rPr>
+        <w:t>-</w:t>
+      </w:r>
+      <w:r>
+        <w:rPr>
+          <w:rFonts w:ascii="Times New Roman" w:eastAsia="宋体" w:hAnsi="Times New Roman" w:cs="Times New Roman" w:hint="eastAsia"/>
+        </w:rPr>
+        <w:t>幻影伪装树木可以使用绘制随机树木窗口进行选择</w:t>
+      </w:r>
+    </w:p>
+    <w:p>
+      <w:pPr>
+        <w:pStyle w:val="a9"/>
+        <w:numPr>
+          <w:ilvl w:val="0"/>
+          <w:numId w:val="50"/>
+        </w:numPr>
+        <w:rPr>
+          <w:rFonts w:ascii="Times New Roman" w:eastAsia="宋体" w:hAnsi="Times New Roman" w:cs="Times New Roman"/>
+        </w:rPr>
+      </w:pPr>
+      <w:r>
+        <w:rPr>
+          <w:rFonts w:ascii="Times New Roman" w:eastAsia="宋体" w:hAnsi="Times New Roman" w:cs="Times New Roman" w:hint="eastAsia"/>
+        </w:rPr>
+        <w:t>放置高架桥头时，可以显示辅助参考线</w:t>
+      </w:r>
+    </w:p>
+    <w:p>
+      <w:pPr>
+        <w:pStyle w:val="a9"/>
+        <w:numPr>
+          <w:ilvl w:val="0"/>
+          <w:numId w:val="50"/>
+        </w:numPr>
+        <w:rPr>
+          <w:rFonts w:ascii="Times New Roman" w:eastAsia="宋体" w:hAnsi="Times New Roman" w:cs="Times New Roman"/>
+        </w:rPr>
+      </w:pPr>
+      <w:r>
+        <w:rPr>
+          <w:rFonts w:ascii="Times New Roman" w:eastAsia="宋体" w:hAnsi="Times New Roman" w:cs="Times New Roman" w:hint="eastAsia"/>
+        </w:rPr>
+        <w:t>为触发编辑器检查下级触发是否是自身添加开关，详见</w:t>
+      </w:r>
+      <w:r>
+        <w:rPr>
+          <w:rFonts w:ascii="Times New Roman" w:eastAsia="宋体" w:hAnsi="Times New Roman" w:cs="Times New Roman" w:hint="eastAsia"/>
+        </w:rPr>
+        <w:t>AttachedTriggerIsSelfCheck</w:t>
+      </w:r>
+    </w:p>
+    <w:p>
+      <w:pPr>
+        <w:pStyle w:val="a9"/>
+        <w:numPr>
+          <w:ilvl w:val="0"/>
+          <w:numId w:val="50"/>
+        </w:numPr>
+        <w:rPr>
+          <w:rFonts w:ascii="Times New Roman" w:eastAsia="宋体" w:hAnsi="Times New Roman" w:cs="Times New Roman"/>
+        </w:rPr>
+      </w:pPr>
+      <w:r>
+        <w:rPr>
+          <w:rFonts w:ascii="Times New Roman" w:eastAsia="宋体" w:hAnsi="Times New Roman" w:cs="Times New Roman" w:hint="eastAsia"/>
+        </w:rPr>
+        <w:t>修复遭遇战地图预览渲染时没有正确标记高架桥的</w:t>
+      </w:r>
+      <w:r>
+        <w:rPr>
+          <w:rFonts w:ascii="Times New Roman" w:eastAsia="宋体" w:hAnsi="Times New Roman" w:cs="Times New Roman" w:hint="eastAsia"/>
+        </w:rPr>
+        <w:t>bug</w:t>
+      </w:r>
+    </w:p>
+    <w:p>
+      <w:pPr>
+        <w:pStyle w:val="a9"/>
+        <w:numPr>
+          <w:ilvl w:val="0"/>
+          <w:numId w:val="50"/>
+        </w:numPr>
+        <w:rPr>
+          <w:rFonts w:ascii="Times New Roman" w:eastAsia="宋体" w:hAnsi="Times New Roman" w:cs="Times New Roman"/>
+        </w:rPr>
+      </w:pPr>
+      <w:r>
+        <w:rPr>
+          <w:rFonts w:ascii="Times New Roman" w:eastAsia="宋体" w:hAnsi="Times New Roman" w:cs="Times New Roman" w:hint="eastAsia"/>
+        </w:rPr>
+        <w:t>为</w:t>
+      </w:r>
+      <w:r>
+        <w:rPr>
+          <w:rFonts w:ascii="Times New Roman" w:eastAsia="宋体" w:hAnsi="Times New Roman" w:cs="Times New Roman" w:hint="eastAsia"/>
+        </w:rPr>
+        <w:t>Lua</w:t>
+      </w:r>
+      <w:r>
+        <w:rPr>
+          <w:rFonts w:ascii="Times New Roman" w:eastAsia="宋体" w:hAnsi="Times New Roman" w:cs="Times New Roman" w:hint="eastAsia"/>
+        </w:rPr>
+        <w:t>脚本终端添加安全检查，会在执行前静态检查高危操作，详见</w:t>
+      </w:r>
+      <w:r>
+        <w:rPr>
+          <w:rFonts w:ascii="Times New Roman" w:eastAsia="宋体" w:hAnsi="Times New Roman" w:cs="Times New Roman" w:hint="eastAsia"/>
+        </w:rPr>
+        <w:t>DisableLuaConsoleSafetyCheck</w:t>
+      </w:r>
+    </w:p>
+    <w:p>
+      <w:pPr>
+        <w:pStyle w:val="a9"/>
+        <w:numPr>
+          <w:ilvl w:val="0"/>
+          <w:numId w:val="50"/>
+        </w:numPr>
+        <w:rPr>
+          <w:rFonts w:ascii="Times New Roman" w:eastAsia="宋体" w:hAnsi="Times New Roman" w:cs="Times New Roman"/>
+        </w:rPr>
+      </w:pPr>
+      <w:r>
+        <w:rPr>
+          <w:rFonts w:ascii="Times New Roman" w:eastAsia="宋体" w:hAnsi="Times New Roman" w:cs="Times New Roman" w:hint="eastAsia"/>
+        </w:rPr>
+        <w:t>可以在地图视图内按方向键调节视角，同时按住</w:t>
+      </w:r>
+      <w:r>
+        <w:rPr>
+          <w:rFonts w:ascii="Times New Roman" w:eastAsia="宋体" w:hAnsi="Times New Roman" w:cs="Times New Roman" w:hint="eastAsia"/>
+        </w:rPr>
+        <w:t>ctrl</w:t>
+      </w:r>
+      <w:r>
+        <w:rPr>
+          <w:rFonts w:ascii="Times New Roman" w:eastAsia="宋体" w:hAnsi="Times New Roman" w:cs="Times New Roman" w:hint="eastAsia"/>
+        </w:rPr>
+        <w:t>键加速移动</w:t>
+      </w:r>
+    </w:p>
+    <w:p>
+      <w:pPr>
+        <w:pStyle w:val="a9"/>
+        <w:numPr>
+          <w:ilvl w:val="0"/>
+          <w:numId w:val="50"/>
+        </w:numPr>
+        <w:rPr>
+          <w:rFonts w:ascii="Times New Roman" w:eastAsia="宋体" w:hAnsi="Times New Roman" w:cs="Times New Roman"/>
+        </w:rPr>
+      </w:pPr>
+      <w:r>
+        <w:rPr>
+          <w:rFonts w:ascii="Times New Roman" w:eastAsia="宋体" w:hAnsi="Times New Roman" w:cs="Times New Roman" w:hint="eastAsia"/>
+        </w:rPr>
+        <w:t>修复部分遭遇战地图所属方选项重复的</w:t>
+      </w:r>
+      <w:r>
+        <w:rPr>
+          <w:rFonts w:ascii="Times New Roman" w:eastAsia="宋体" w:hAnsi="Times New Roman" w:cs="Times New Roman" w:hint="eastAsia"/>
+        </w:rPr>
+        <w:t>bug</w:t>
+      </w:r>
+    </w:p>
+    <w:p>
+      <w:pPr>
+        <w:pStyle w:val="a9"/>
+        <w:numPr>
+          <w:ilvl w:val="0"/>
+          <w:numId w:val="50"/>
+        </w:numPr>
+        <w:rPr>
+          <w:rFonts w:ascii="Times New Roman" w:eastAsia="宋体" w:hAnsi="Times New Roman" w:cs="Times New Roman"/>
+        </w:rPr>
+      </w:pPr>
+      <w:r>
+        <w:rPr>
+          <w:rFonts w:ascii="Times New Roman" w:eastAsia="宋体" w:hAnsi="Times New Roman" w:cs="Times New Roman" w:hint="eastAsia"/>
+        </w:rPr>
+        <w:t>重写单位属性对话框，标签支持搜索，所属方可以显示颜色</w:t>
+      </w:r>
+    </w:p>
+    <w:p>
+      <w:pPr>
+        <w:pStyle w:val="a9"/>
+        <w:numPr>
+          <w:ilvl w:val="0"/>
+          <w:numId w:val="50"/>
+        </w:numPr>
+        <w:rPr>
+          <w:rFonts w:ascii="Times New Roman" w:eastAsia="宋体" w:hAnsi="Times New Roman" w:cs="Times New Roman"/>
+        </w:rPr>
+      </w:pPr>
+      <w:r>
+        <w:rPr>
+          <w:rFonts w:ascii="Times New Roman" w:eastAsia="宋体" w:hAnsi="Times New Roman" w:cs="Times New Roman" w:hint="eastAsia"/>
+        </w:rPr>
+        <w:t>支持将</w:t>
+      </w:r>
+      <w:r>
+        <w:rPr>
+          <w:rFonts w:ascii="Times New Roman" w:eastAsia="宋体" w:hAnsi="Times New Roman" w:cs="Times New Roman" w:hint="eastAsia"/>
+        </w:rPr>
+        <w:t>物品浏览器和</w:t>
+      </w:r>
+      <w:r>
+        <w:rPr>
+          <w:rFonts w:ascii="Times New Roman" w:eastAsia="宋体" w:hAnsi="Times New Roman" w:cs="Times New Roman" w:hint="eastAsia"/>
+        </w:rPr>
+        <w:t>地形浏览器作为一个独立窗口显示</w:t>
+      </w:r>
+      <w:r>
+        <w:rPr>
+          <w:rFonts w:ascii="Times New Roman" w:eastAsia="宋体" w:hAnsi="Times New Roman" w:cs="Times New Roman" w:hint="eastAsia"/>
+        </w:rPr>
+        <w:t>，可以调节透明度</w:t>
+      </w:r>
+      <w:r>
+        <w:rPr>
+          <w:rFonts w:ascii="Times New Roman" w:eastAsia="宋体" w:hAnsi="Times New Roman" w:cs="Times New Roman" w:hint="eastAsia"/>
+        </w:rPr>
+        <w:t>，详见</w:t>
+      </w:r>
+      <w:r>
+        <w:rPr>
+          <w:rFonts w:ascii="Times New Roman" w:eastAsia="宋体" w:hAnsi="Times New Roman" w:cs="Times New Roman" w:hint="eastAsia"/>
+        </w:rPr>
+        <w:t>ViewObjectsFloating</w:t>
+      </w:r>
+      <w:r>
+        <w:rPr>
+          <w:rFonts w:ascii="Times New Roman" w:eastAsia="宋体" w:hAnsi="Times New Roman" w:cs="Times New Roman" w:hint="eastAsia"/>
+        </w:rPr>
+        <w:t>和</w:t>
+      </w:r>
+      <w:r>
+        <w:rPr>
+          <w:rFonts w:ascii="Times New Roman" w:eastAsia="宋体" w:hAnsi="Times New Roman" w:cs="Times New Roman" w:hint="eastAsia"/>
+        </w:rPr>
+        <w:t>TileSetBrowserFloating</w:t>
+      </w:r>
+    </w:p>
+    <w:p>
+      <w:pPr>
+        <w:pStyle w:val="a9"/>
+        <w:numPr>
+          <w:ilvl w:val="0"/>
+          <w:numId w:val="50"/>
+        </w:numPr>
+        <w:rPr>
+          <w:rFonts w:ascii="Times New Roman" w:eastAsia="宋体" w:hAnsi="Times New Roman" w:cs="Times New Roman"/>
+        </w:rPr>
+      </w:pPr>
+      <w:r>
+        <w:rPr>
+          <w:rFonts w:ascii="Times New Roman" w:eastAsia="宋体" w:hAnsi="Times New Roman" w:cs="Times New Roman" w:hint="eastAsia"/>
+        </w:rPr>
+        <w:t>绝大多数窗口可以调节透明度</w:t>
+      </w:r>
+    </w:p>
+    <w:p>
+      <w:pPr>
+        <w:pStyle w:val="a9"/>
+        <w:numPr>
+          <w:ilvl w:val="0"/>
+          <w:numId w:val="50"/>
+        </w:numPr>
+        <w:rPr>
+          <w:rFonts w:ascii="Times New Roman" w:eastAsia="宋体" w:hAnsi="Times New Roman" w:cs="Times New Roman"/>
+        </w:rPr>
+      </w:pPr>
+      <w:r>
+        <w:rPr>
+          <w:rFonts w:ascii="Times New Roman" w:eastAsia="宋体" w:hAnsi="Times New Roman" w:cs="Times New Roman" w:hint="eastAsia"/>
+        </w:rPr>
+        <w:t>修复部分情况下按工具栏擦除覆盖物等按钮不生效的</w:t>
+      </w:r>
+      <w:r>
+        <w:rPr>
+          <w:rFonts w:ascii="Times New Roman" w:eastAsia="宋体" w:hAnsi="Times New Roman" w:cs="Times New Roman" w:hint="eastAsia"/>
+        </w:rPr>
+        <w:t>bug</w:t>
+      </w:r>
+    </w:p>
+    <w:p>
+      <w:pPr>
+        <w:pStyle w:val="a9"/>
+        <w:numPr>
+          <w:ilvl w:val="0"/>
+          <w:numId w:val="50"/>
+        </w:numPr>
+        <w:rPr>
+          <w:rFonts w:ascii="Times New Roman" w:eastAsia="宋体" w:hAnsi="Times New Roman" w:cs="Times New Roman"/>
+        </w:rPr>
+      </w:pPr>
+      <w:r>
+        <w:rPr>
+          <w:rFonts w:ascii="Times New Roman" w:eastAsia="宋体" w:hAnsi="Times New Roman" w:cs="Times New Roman" w:hint="eastAsia"/>
+        </w:rPr>
+        <w:t>修复暗色模式下非主程序菜单的背景色被错误填充的</w:t>
+      </w:r>
+      <w:r>
+        <w:rPr>
+          <w:rFonts w:ascii="Times New Roman" w:eastAsia="宋体" w:hAnsi="Times New Roman" w:cs="Times New Roman" w:hint="eastAsia"/>
+        </w:rPr>
+        <w:t>bug</w:t>
+      </w:r>
+    </w:p>
+    <w:p>
+      <w:pPr>
+        <w:pStyle w:val="a9"/>
+        <w:numPr>
+          <w:ilvl w:val="0"/>
+          <w:numId w:val="50"/>
+        </w:numPr>
+        <w:rPr>
+          <w:rFonts w:ascii="Times New Roman" w:eastAsia="宋体" w:hAnsi="Times New Roman" w:cs="Times New Roman"/>
+        </w:rPr>
+      </w:pPr>
+      <w:r>
+        <w:rPr>
+          <w:rFonts w:ascii="Times New Roman" w:eastAsia="宋体" w:hAnsi="Times New Roman" w:cs="Times New Roman" w:hint="eastAsia"/>
+        </w:rPr>
         <w:lastRenderedPageBreak/>
-        <w:t>调整地形浏览器图像的选中矩形框，使其更加明显</w:t>
-      </w:r>
-    </w:p>
-    <w:p>
-      <w:pPr>
-        <w:pStyle w:val="a9"/>
-        <w:numPr>
-          <w:ilvl w:val="0"/>
-          <w:numId w:val="50"/>
-        </w:numPr>
-        <w:rPr>
-          <w:rFonts w:ascii="Times New Roman" w:eastAsia="宋体" w:hAnsi="Times New Roman" w:cs="Times New Roman"/>
-        </w:rPr>
-      </w:pPr>
-      <w:r>
-        <w:rPr>
-          <w:rFonts w:ascii="Times New Roman" w:eastAsia="宋体" w:hAnsi="Times New Roman" w:cs="Times New Roman" w:hint="eastAsia"/>
-        </w:rPr>
-        <w:t>修复渲染地图时不渲染</w:t>
-      </w:r>
-      <w:r>
-        <w:rPr>
-          <w:rFonts w:ascii="Times New Roman" w:eastAsia="宋体" w:hAnsi="Times New Roman" w:cs="Times New Roman" w:hint="eastAsia"/>
-        </w:rPr>
-        <w:t>InvisibleInGame=yes</w:t>
-      </w:r>
-      <w:r>
-        <w:rPr>
-          <w:rFonts w:ascii="Times New Roman" w:eastAsia="宋体" w:hAnsi="Times New Roman" w:cs="Times New Roman" w:hint="eastAsia"/>
-        </w:rPr>
-        <w:t>的建筑的</w:t>
-      </w:r>
-      <w:r>
-        <w:rPr>
-          <w:rFonts w:ascii="Times New Roman" w:eastAsia="宋体" w:hAnsi="Times New Roman" w:cs="Times New Roman" w:hint="eastAsia"/>
-        </w:rPr>
-        <w:t>AlphaImage</w:t>
-      </w:r>
-      <w:r>
-        <w:rPr>
-          <w:rFonts w:ascii="Times New Roman" w:eastAsia="宋体" w:hAnsi="Times New Roman" w:cs="Times New Roman" w:hint="eastAsia"/>
-        </w:rPr>
-        <w:t>的</w:t>
-      </w:r>
-      <w:r>
-        <w:rPr>
-          <w:rFonts w:ascii="Times New Roman" w:eastAsia="宋体" w:hAnsi="Times New Roman" w:cs="Times New Roman" w:hint="eastAsia"/>
-        </w:rPr>
-        <w:t>bug</w:t>
-      </w:r>
-    </w:p>
-    <w:p>
-      <w:pPr>
-        <w:pStyle w:val="a9"/>
-        <w:numPr>
-          <w:ilvl w:val="0"/>
-          <w:numId w:val="50"/>
-        </w:numPr>
-        <w:rPr>
-          <w:rFonts w:ascii="Times New Roman" w:eastAsia="宋体" w:hAnsi="Times New Roman" w:cs="Times New Roman"/>
-        </w:rPr>
-      </w:pPr>
-      <w:r>
-        <w:rPr>
-          <w:rFonts w:ascii="Times New Roman" w:eastAsia="宋体" w:hAnsi="Times New Roman" w:cs="Times New Roman" w:hint="eastAsia"/>
-        </w:rPr>
-        <w:t>修复启用建筑筛选时无法隐藏阴影的</w:t>
-      </w:r>
-      <w:r>
-        <w:rPr>
-          <w:rFonts w:ascii="Times New Roman" w:eastAsia="宋体" w:hAnsi="Times New Roman" w:cs="Times New Roman" w:hint="eastAsia"/>
-        </w:rPr>
-        <w:t>bug</w:t>
-      </w:r>
-    </w:p>
-    <w:p>
-      <w:pPr>
-        <w:pStyle w:val="a9"/>
-        <w:numPr>
-          <w:ilvl w:val="0"/>
-          <w:numId w:val="50"/>
-        </w:numPr>
-        <w:rPr>
-          <w:rFonts w:ascii="Times New Roman" w:eastAsia="宋体" w:hAnsi="Times New Roman" w:cs="Times New Roman"/>
-        </w:rPr>
-      </w:pPr>
-      <w:r>
-        <w:rPr>
-          <w:rFonts w:ascii="Times New Roman" w:eastAsia="宋体" w:hAnsi="Times New Roman" w:cs="Times New Roman" w:hint="eastAsia"/>
-        </w:rPr>
-        <w:t>查找引用窗口增加</w:t>
-      </w:r>
-      <w:r>
-        <w:rPr>
-          <w:rFonts w:ascii="Times New Roman" w:eastAsia="宋体" w:hAnsi="Times New Roman" w:cs="Times New Roman" w:hint="eastAsia"/>
-        </w:rPr>
-        <w:t>跟随活动窗口</w:t>
-      </w:r>
-      <w:r>
-        <w:rPr>
-          <w:rFonts w:ascii="Times New Roman" w:eastAsia="宋体" w:hAnsi="Times New Roman" w:cs="Times New Roman" w:hint="eastAsia"/>
-        </w:rPr>
-        <w:t>选项，勾选后可以实时根据活动窗口切换内容</w:t>
-      </w:r>
-    </w:p>
-    <w:p>
-      <w:pPr>
-        <w:pStyle w:val="a9"/>
-        <w:numPr>
-          <w:ilvl w:val="0"/>
-          <w:numId w:val="50"/>
-        </w:numPr>
-        <w:rPr>
-          <w:rFonts w:ascii="Times New Roman" w:eastAsia="宋体" w:hAnsi="Times New Roman" w:cs="Times New Roman"/>
-        </w:rPr>
-      </w:pPr>
-      <w:r>
-        <w:rPr>
-          <w:rFonts w:ascii="Times New Roman" w:eastAsia="宋体" w:hAnsi="Times New Roman" w:cs="Times New Roman" w:hint="eastAsia"/>
-        </w:rPr>
-        <w:t>修复修改作战小队名称后，</w:t>
-      </w:r>
-      <w:r>
-        <w:rPr>
-          <w:rFonts w:ascii="Times New Roman" w:eastAsia="宋体" w:hAnsi="Times New Roman" w:cs="Times New Roman" w:hint="eastAsia"/>
-        </w:rPr>
-        <w:t>ai</w:t>
-      </w:r>
-      <w:r>
-        <w:rPr>
-          <w:rFonts w:ascii="Times New Roman" w:eastAsia="宋体" w:hAnsi="Times New Roman" w:cs="Times New Roman" w:hint="eastAsia"/>
-        </w:rPr>
-        <w:t>触发编辑器的小队</w:t>
-      </w:r>
-      <w:r>
-        <w:rPr>
-          <w:rFonts w:ascii="Times New Roman" w:eastAsia="宋体" w:hAnsi="Times New Roman" w:cs="Times New Roman" w:hint="eastAsia"/>
-        </w:rPr>
-        <w:t>#2</w:t>
-      </w:r>
-      <w:r>
-        <w:rPr>
-          <w:rFonts w:ascii="Times New Roman" w:eastAsia="宋体" w:hAnsi="Times New Roman" w:cs="Times New Roman" w:hint="eastAsia"/>
-        </w:rPr>
-        <w:t>显示错误的</w:t>
-      </w:r>
-      <w:r>
-        <w:rPr>
-          <w:rFonts w:ascii="Times New Roman" w:eastAsia="宋体" w:hAnsi="Times New Roman" w:cs="Times New Roman" w:hint="eastAsia"/>
-        </w:rPr>
-        <w:t>bug</w:t>
-      </w:r>
-    </w:p>
-    <w:p>
-      <w:pPr>
-        <w:pStyle w:val="a9"/>
-        <w:numPr>
-          <w:ilvl w:val="0"/>
-          <w:numId w:val="50"/>
-        </w:numPr>
-        <w:rPr>
-          <w:rFonts w:ascii="Times New Roman" w:eastAsia="宋体" w:hAnsi="Times New Roman" w:cs="Times New Roman"/>
-        </w:rPr>
-      </w:pPr>
-      <w:r>
-        <w:rPr>
-          <w:rFonts w:ascii="Times New Roman" w:eastAsia="宋体" w:hAnsi="Times New Roman" w:cs="Times New Roman" w:hint="eastAsia"/>
-        </w:rPr>
-        <w:t>触发、小队等编辑器支持为</w:t>
-      </w:r>
-      <w:r>
-        <w:rPr>
-          <w:rFonts w:ascii="Times New Roman" w:eastAsia="宋体" w:hAnsi="Times New Roman" w:cs="Times New Roman" w:hint="eastAsia"/>
-        </w:rPr>
-        <w:t>ID</w:t>
-      </w:r>
-      <w:r>
-        <w:rPr>
-          <w:rFonts w:ascii="Times New Roman" w:eastAsia="宋体" w:hAnsi="Times New Roman" w:cs="Times New Roman" w:hint="eastAsia"/>
-        </w:rPr>
-        <w:t>染色，双击拖拽小点即可设置颜色</w:t>
-      </w:r>
-    </w:p>
-    <w:p>
-      <w:pPr>
-        <w:pStyle w:val="a9"/>
-        <w:numPr>
-          <w:ilvl w:val="0"/>
-          <w:numId w:val="50"/>
-        </w:numPr>
-        <w:rPr>
-          <w:rFonts w:ascii="Times New Roman" w:eastAsia="宋体" w:hAnsi="Times New Roman" w:cs="Times New Roman"/>
-        </w:rPr>
-      </w:pPr>
-      <w:r>
-        <w:rPr>
-          <w:rFonts w:ascii="Times New Roman" w:eastAsia="宋体" w:hAnsi="Times New Roman" w:cs="Times New Roman" w:hint="eastAsia"/>
-        </w:rPr>
-        <w:t>单元标记支持笔刷大小放置</w:t>
-      </w:r>
-    </w:p>
-    <w:p>
-      <w:pPr>
-        <w:pStyle w:val="a9"/>
-        <w:numPr>
-          <w:ilvl w:val="0"/>
-          <w:numId w:val="50"/>
-        </w:numPr>
-        <w:rPr>
-          <w:rFonts w:ascii="Times New Roman" w:eastAsia="宋体" w:hAnsi="Times New Roman" w:cs="Times New Roman"/>
-        </w:rPr>
-      </w:pPr>
-      <w:r>
-        <w:rPr>
-          <w:rFonts w:ascii="Times New Roman" w:eastAsia="宋体" w:hAnsi="Times New Roman" w:cs="Times New Roman" w:hint="eastAsia"/>
-        </w:rPr>
-        <w:t>增加新的</w:t>
-      </w:r>
-      <w:r>
-        <w:rPr>
-          <w:rFonts w:ascii="Times New Roman" w:eastAsia="宋体" w:hAnsi="Times New Roman" w:cs="Times New Roman" w:hint="eastAsia"/>
-        </w:rPr>
-        <w:t>lua</w:t>
-      </w:r>
-      <w:r>
-        <w:rPr>
-          <w:rFonts w:ascii="Times New Roman" w:eastAsia="宋体" w:hAnsi="Times New Roman" w:cs="Times New Roman" w:hint="eastAsia"/>
-        </w:rPr>
-        <w:t>脚本，由</w:t>
-      </w:r>
-      <w:r>
-        <w:rPr>
-          <w:rFonts w:ascii="Times New Roman" w:eastAsia="宋体" w:hAnsi="Times New Roman" w:cs="Times New Roman" w:hint="eastAsia"/>
-        </w:rPr>
-        <w:t>AUY</w:t>
-      </w:r>
-      <w:r>
-        <w:rPr>
-          <w:rFonts w:ascii="Times New Roman" w:eastAsia="宋体" w:hAnsi="Times New Roman" w:cs="Times New Roman" w:hint="eastAsia"/>
-        </w:rPr>
-        <w:t>制作</w:t>
-      </w:r>
-    </w:p>
-    <w:p>
-      <w:pPr>
-        <w:pStyle w:val="a9"/>
-        <w:numPr>
-          <w:ilvl w:val="0"/>
-          <w:numId w:val="50"/>
-        </w:numPr>
-        <w:rPr>
-          <w:rFonts w:ascii="Times New Roman" w:eastAsia="宋体" w:hAnsi="Times New Roman" w:cs="Times New Roman"/>
-        </w:rPr>
-      </w:pPr>
-      <w:r>
-        <w:rPr>
-          <w:rFonts w:ascii="Times New Roman" w:eastAsia="宋体" w:hAnsi="Times New Roman" w:cs="Times New Roman" w:hint="eastAsia"/>
-        </w:rPr>
-        <w:t>修复跨地图类型粘贴时地形转换部分失效的</w:t>
-      </w:r>
-      <w:r>
-        <w:rPr>
-          <w:rFonts w:ascii="Times New Roman" w:eastAsia="宋体" w:hAnsi="Times New Roman" w:cs="Times New Roman" w:hint="eastAsia"/>
-        </w:rPr>
-        <w:t>bug</w:t>
-      </w:r>
-    </w:p>
-    <w:p>
-      <w:pPr>
-        <w:pStyle w:val="a9"/>
-        <w:numPr>
-          <w:ilvl w:val="0"/>
-          <w:numId w:val="50"/>
-        </w:numPr>
-        <w:rPr>
-          <w:rFonts w:ascii="Times New Roman" w:eastAsia="宋体" w:hAnsi="Times New Roman" w:cs="Times New Roman"/>
-        </w:rPr>
-      </w:pPr>
-      <w:r>
-        <w:rPr>
-          <w:rFonts w:ascii="Times New Roman" w:eastAsia="宋体" w:hAnsi="Times New Roman" w:cs="Times New Roman" w:hint="eastAsia"/>
-        </w:rPr>
-        <w:t>可以记录不同鼠标操作的笔刷大小，并在切换时自动还原，详见</w:t>
-      </w:r>
-      <w:r>
-        <w:rPr>
-          <w:rFonts w:ascii="Times New Roman" w:eastAsia="宋体" w:hAnsi="Times New Roman" w:cs="Times New Roman" w:hint="eastAsia"/>
-        </w:rPr>
-        <w:t>RecordBrushSizeHistory</w:t>
-      </w:r>
-    </w:p>
-    <w:p>
-      <w:pPr>
-        <w:pStyle w:val="a9"/>
-        <w:numPr>
-          <w:ilvl w:val="0"/>
-          <w:numId w:val="50"/>
-        </w:numPr>
-        <w:rPr>
-          <w:rFonts w:ascii="Times New Roman" w:eastAsia="宋体" w:hAnsi="Times New Roman" w:cs="Times New Roman"/>
-        </w:rPr>
-      </w:pPr>
-      <w:r>
-        <w:rPr>
-          <w:rFonts w:ascii="Times New Roman" w:eastAsia="宋体" w:hAnsi="Times New Roman" w:cs="Times New Roman" w:hint="eastAsia"/>
-        </w:rPr>
-        <w:t>增加</w:t>
-      </w:r>
-      <w:r>
-        <w:rPr>
-          <w:rFonts w:ascii="Times New Roman" w:eastAsia="宋体" w:hAnsi="Times New Roman" w:cs="Times New Roman" w:hint="eastAsia"/>
-        </w:rPr>
-        <w:t>/</w:t>
-      </w:r>
-      <w:r>
-        <w:rPr>
-          <w:rFonts w:ascii="Times New Roman" w:eastAsia="宋体" w:hAnsi="Times New Roman" w:cs="Times New Roman" w:hint="eastAsia"/>
-        </w:rPr>
-        <w:t>减少矿石支持调整笔刷大小</w:t>
-      </w:r>
-    </w:p>
-    <w:p>
-      <w:pPr>
-        <w:pStyle w:val="a9"/>
-        <w:numPr>
-          <w:ilvl w:val="0"/>
-          <w:numId w:val="50"/>
-        </w:numPr>
-        <w:rPr>
-          <w:rFonts w:ascii="Times New Roman" w:eastAsia="宋体" w:hAnsi="Times New Roman" w:cs="Times New Roman"/>
-        </w:rPr>
-      </w:pPr>
-      <w:r>
-        <w:rPr>
-          <w:rFonts w:ascii="Times New Roman" w:eastAsia="宋体" w:hAnsi="Times New Roman" w:cs="Times New Roman" w:hint="eastAsia"/>
-        </w:rPr>
-        <w:t>新增</w:t>
-      </w:r>
-      <w:r>
-        <w:rPr>
-          <w:rFonts w:ascii="Times New Roman" w:eastAsia="宋体" w:hAnsi="Times New Roman" w:cs="Times New Roman" w:hint="eastAsia"/>
-        </w:rPr>
-        <w:t>LuaDialog</w:t>
-      </w:r>
-      <w:r>
-        <w:rPr>
-          <w:rFonts w:ascii="Times New Roman" w:eastAsia="宋体" w:hAnsi="Times New Roman" w:cs="Times New Roman" w:hint="eastAsia"/>
-        </w:rPr>
-        <w:t>，可以在</w:t>
-      </w:r>
-      <w:r>
-        <w:rPr>
-          <w:rFonts w:ascii="Times New Roman" w:eastAsia="宋体" w:hAnsi="Times New Roman" w:cs="Times New Roman" w:hint="eastAsia"/>
-        </w:rPr>
-        <w:t>lua</w:t>
-      </w:r>
-      <w:r>
-        <w:rPr>
-          <w:rFonts w:ascii="Times New Roman" w:eastAsia="宋体" w:hAnsi="Times New Roman" w:cs="Times New Roman" w:hint="eastAsia"/>
-        </w:rPr>
-        <w:t>脚本内动态创建自定义窗口</w:t>
-      </w:r>
-    </w:p>
-    <w:p>
-      <w:pPr>
-        <w:pStyle w:val="a9"/>
-        <w:numPr>
-          <w:ilvl w:val="0"/>
-          <w:numId w:val="50"/>
-        </w:numPr>
-        <w:rPr>
-          <w:rFonts w:ascii="Times New Roman" w:eastAsia="宋体" w:hAnsi="Times New Roman" w:cs="Times New Roman"/>
-        </w:rPr>
-      </w:pPr>
-      <w:r>
-        <w:rPr>
-          <w:rFonts w:ascii="Times New Roman" w:eastAsia="宋体" w:hAnsi="Times New Roman" w:cs="Times New Roman" w:hint="eastAsia"/>
-        </w:rPr>
-        <w:t>修复改变地图大小后建筑灯光没有刷新的</w:t>
-      </w:r>
-      <w:r>
-        <w:rPr>
-          <w:rFonts w:ascii="Times New Roman" w:eastAsia="宋体" w:hAnsi="Times New Roman" w:cs="Times New Roman" w:hint="eastAsia"/>
-        </w:rPr>
-        <w:t>bug</w:t>
-      </w:r>
-    </w:p>
-    <w:p>
-      <w:pPr>
-        <w:pStyle w:val="a9"/>
-        <w:numPr>
-          <w:ilvl w:val="0"/>
-          <w:numId w:val="50"/>
-        </w:numPr>
-        <w:rPr>
-          <w:rFonts w:ascii="Times New Roman" w:eastAsia="宋体" w:hAnsi="Times New Roman" w:cs="Times New Roman"/>
-        </w:rPr>
-      </w:pPr>
-      <w:r>
-        <w:rPr>
-          <w:rFonts w:ascii="Times New Roman" w:eastAsia="宋体" w:hAnsi="Times New Roman" w:cs="Times New Roman" w:hint="eastAsia"/>
-        </w:rPr>
-        <w:t>多选模式可以显示不同矿石类型的价格</w:t>
-      </w:r>
-    </w:p>
-    <w:p>
-      <w:pPr>
-        <w:pStyle w:val="a9"/>
-        <w:numPr>
-          <w:ilvl w:val="0"/>
-          <w:numId w:val="50"/>
-        </w:numPr>
-        <w:rPr>
-          <w:rFonts w:ascii="Times New Roman" w:eastAsia="宋体" w:hAnsi="Times New Roman" w:cs="Times New Roman"/>
-        </w:rPr>
-      </w:pPr>
-      <w:r>
-        <w:rPr>
-          <w:rFonts w:ascii="Times New Roman" w:eastAsia="宋体" w:hAnsi="Times New Roman" w:cs="Times New Roman" w:hint="eastAsia"/>
-        </w:rPr>
-        <w:t>优化了绘图界面缩小时的渲染性能</w:t>
-      </w:r>
-    </w:p>
-    <w:p>
-      <w:pPr>
-        <w:pStyle w:val="a9"/>
-        <w:numPr>
-          <w:ilvl w:val="0"/>
-          <w:numId w:val="50"/>
-        </w:numPr>
-        <w:rPr>
-          <w:rFonts w:ascii="Times New Roman" w:eastAsia="宋体" w:hAnsi="Times New Roman" w:cs="Times New Roman"/>
-        </w:rPr>
-      </w:pPr>
-      <w:r>
-        <w:rPr>
-          <w:rFonts w:ascii="Times New Roman" w:eastAsia="宋体" w:hAnsi="Times New Roman" w:cs="Times New Roman" w:hint="eastAsia"/>
-        </w:rPr>
-        <w:t>修复使用触发编辑器拖拽小点为步兵关联标签时，已关联标记没有依据步兵子单元格显示的</w:t>
-      </w:r>
-      <w:r>
-        <w:rPr>
-          <w:rFonts w:ascii="Times New Roman" w:eastAsia="宋体" w:hAnsi="Times New Roman" w:cs="Times New Roman" w:hint="eastAsia"/>
-        </w:rPr>
-        <w:t>bug</w:t>
-      </w:r>
-    </w:p>
-    <w:p>
-      <w:pPr>
-        <w:pStyle w:val="a9"/>
-        <w:numPr>
-          <w:ilvl w:val="0"/>
-          <w:numId w:val="50"/>
-        </w:numPr>
-        <w:rPr>
-          <w:rFonts w:ascii="Times New Roman" w:eastAsia="宋体" w:hAnsi="Times New Roman" w:cs="Times New Roman"/>
-        </w:rPr>
-      </w:pPr>
-      <w:r>
-        <w:rPr>
-          <w:rFonts w:ascii="Times New Roman" w:eastAsia="宋体" w:hAnsi="Times New Roman" w:cs="Times New Roman" w:hint="eastAsia"/>
-        </w:rPr>
-        <w:t>Lua</w:t>
-      </w:r>
-      <w:r>
-        <w:rPr>
-          <w:rFonts w:ascii="Times New Roman" w:eastAsia="宋体" w:hAnsi="Times New Roman" w:cs="Times New Roman" w:hint="eastAsia"/>
-        </w:rPr>
-        <w:t>脚本终端可以开启</w:t>
-      </w:r>
-      <w:r>
-        <w:rPr>
-          <w:rFonts w:ascii="Times New Roman" w:eastAsia="宋体" w:hAnsi="Times New Roman" w:cs="Times New Roman" w:hint="eastAsia"/>
-        </w:rPr>
-        <w:t>MCP</w:t>
-      </w:r>
-      <w:r>
-        <w:rPr>
-          <w:rFonts w:ascii="Times New Roman" w:eastAsia="宋体" w:hAnsi="Times New Roman" w:cs="Times New Roman" w:hint="eastAsia"/>
-        </w:rPr>
-        <w:t>服务器，接入大语言模型调用</w:t>
-      </w:r>
-      <w:r>
-        <w:rPr>
-          <w:rFonts w:ascii="Times New Roman" w:eastAsia="宋体" w:hAnsi="Times New Roman" w:cs="Times New Roman" w:hint="eastAsia"/>
-        </w:rPr>
-        <w:t>lua</w:t>
-      </w:r>
-      <w:r>
-        <w:rPr>
-          <w:rFonts w:ascii="Times New Roman" w:eastAsia="宋体" w:hAnsi="Times New Roman" w:cs="Times New Roman" w:hint="eastAsia"/>
-        </w:rPr>
-        <w:t>脚本</w:t>
-      </w:r>
-      <w:r>
-        <w:rPr>
-          <w:rFonts w:ascii="Times New Roman" w:eastAsia="宋体" w:hAnsi="Times New Roman" w:cs="Times New Roman" w:hint="eastAsia"/>
-        </w:rPr>
-        <w:t>。详见</w:t>
-      </w:r>
-      <w:r>
-        <w:rPr>
-          <w:rFonts w:ascii="Times New Roman" w:eastAsia="宋体" w:hAnsi="Times New Roman" w:cs="Times New Roman" w:hint="eastAsia"/>
-        </w:rPr>
-        <w:t>MCP.Enable</w:t>
-      </w:r>
-    </w:p>
-    <w:p>
-      <w:pPr>
-        <w:pStyle w:val="a9"/>
-        <w:numPr>
-          <w:ilvl w:val="0"/>
-          <w:numId w:val="50"/>
-        </w:numPr>
-        <w:rPr>
-          <w:rFonts w:ascii="Times New Roman" w:eastAsia="宋体" w:hAnsi="Times New Roman" w:cs="Times New Roman"/>
-        </w:rPr>
-      </w:pPr>
-      <w:r>
-        <w:rPr>
-          <w:rFonts w:ascii="Times New Roman" w:eastAsia="宋体" w:hAnsi="Times New Roman" w:cs="Times New Roman" w:hint="eastAsia"/>
-        </w:rPr>
-        <w:t>修复渲染部分</w:t>
-      </w:r>
-      <w:r>
-        <w:rPr>
-          <w:rFonts w:ascii="Times New Roman" w:eastAsia="宋体" w:hAnsi="Times New Roman" w:cs="Times New Roman" w:hint="eastAsia"/>
-        </w:rPr>
-        <w:t>vxl</w:t>
-      </w:r>
-      <w:r>
-        <w:rPr>
-          <w:rFonts w:ascii="Times New Roman" w:eastAsia="宋体" w:hAnsi="Times New Roman" w:cs="Times New Roman" w:hint="eastAsia"/>
-        </w:rPr>
-        <w:t>时崩溃的</w:t>
-      </w:r>
-      <w:r>
-        <w:rPr>
-          <w:rFonts w:ascii="Times New Roman" w:eastAsia="宋体" w:hAnsi="Times New Roman" w:cs="Times New Roman" w:hint="eastAsia"/>
-        </w:rPr>
-        <w:t>bug</w:t>
-      </w:r>
-    </w:p>
-    <w:p>
-      <w:pPr>
-        <w:pStyle w:val="a9"/>
-        <w:numPr>
-          <w:ilvl w:val="0"/>
-          <w:numId w:val="50"/>
-        </w:numPr>
-        <w:rPr>
-          <w:rFonts w:ascii="Times New Roman" w:eastAsia="宋体" w:hAnsi="Times New Roman" w:cs="Times New Roman"/>
-        </w:rPr>
-      </w:pPr>
-      <w:r>
-        <w:rPr>
-          <w:rFonts w:ascii="Times New Roman" w:eastAsia="宋体" w:hAnsi="Times New Roman" w:cs="Times New Roman" w:hint="eastAsia"/>
-        </w:rPr>
-        <w:t>基本设置窗口增加背景音乐和载入界面背景音乐选项</w:t>
-      </w:r>
-    </w:p>
-    <w:p>
-      <w:pPr>
-        <w:pStyle w:val="a9"/>
-        <w:numPr>
-          <w:ilvl w:val="0"/>
-          <w:numId w:val="50"/>
-        </w:numPr>
-        <w:rPr>
-          <w:rFonts w:ascii="Times New Roman" w:eastAsia="宋体" w:hAnsi="Times New Roman" w:cs="Times New Roman"/>
-        </w:rPr>
-      </w:pPr>
-      <w:r>
-        <w:rPr>
-          <w:rFonts w:ascii="Times New Roman" w:eastAsia="宋体" w:hAnsi="Times New Roman" w:cs="Times New Roman" w:hint="eastAsia"/>
-        </w:rPr>
-        <w:t>单人任务设置</w:t>
-      </w:r>
-      <w:r>
-        <w:rPr>
-          <w:rFonts w:ascii="Times New Roman" w:eastAsia="宋体" w:hAnsi="Times New Roman" w:cs="Times New Roman" w:hint="eastAsia"/>
-        </w:rPr>
-        <w:t>-</w:t>
-      </w:r>
-      <w:r>
-        <w:rPr>
-          <w:rFonts w:ascii="Times New Roman" w:eastAsia="宋体" w:hAnsi="Times New Roman" w:cs="Times New Roman" w:hint="eastAsia"/>
-        </w:rPr>
-        <w:t>幻影伪装树木可以使用绘制随机树木窗口进行选择</w:t>
-      </w:r>
-    </w:p>
-    <w:p>
-      <w:pPr>
-        <w:pStyle w:val="a9"/>
-        <w:numPr>
-          <w:ilvl w:val="0"/>
-          <w:numId w:val="50"/>
-        </w:numPr>
-        <w:rPr>
-          <w:rFonts w:ascii="Times New Roman" w:eastAsia="宋体" w:hAnsi="Times New Roman" w:cs="Times New Roman"/>
-        </w:rPr>
-      </w:pPr>
-      <w:r>
-        <w:rPr>
-          <w:rFonts w:ascii="Times New Roman" w:eastAsia="宋体" w:hAnsi="Times New Roman" w:cs="Times New Roman" w:hint="eastAsia"/>
-        </w:rPr>
-        <w:t>放置高架桥头时，可以显示辅助参考线</w:t>
-      </w:r>
-    </w:p>
-    <w:p>
-      <w:pPr>
-        <w:pStyle w:val="a9"/>
-        <w:numPr>
-          <w:ilvl w:val="0"/>
-          <w:numId w:val="50"/>
-        </w:numPr>
-        <w:rPr>
-          <w:rFonts w:ascii="Times New Roman" w:eastAsia="宋体" w:hAnsi="Times New Roman" w:cs="Times New Roman"/>
-        </w:rPr>
-      </w:pPr>
-      <w:r>
-        <w:rPr>
-          <w:rFonts w:ascii="Times New Roman" w:eastAsia="宋体" w:hAnsi="Times New Roman" w:cs="Times New Roman" w:hint="eastAsia"/>
-        </w:rPr>
-        <w:t>为触发编辑器检查下级触发是否是自身添加开关，详见</w:t>
-      </w:r>
-      <w:r>
-        <w:rPr>
-          <w:rFonts w:ascii="Times New Roman" w:eastAsia="宋体" w:hAnsi="Times New Roman" w:cs="Times New Roman" w:hint="eastAsia"/>
-        </w:rPr>
-        <w:t>AttachedTriggerIsSelfCheck</w:t>
-      </w:r>
-    </w:p>
-    <w:p>
-      <w:pPr>
-        <w:pStyle w:val="a9"/>
-        <w:numPr>
-          <w:ilvl w:val="0"/>
-          <w:numId w:val="50"/>
-        </w:numPr>
-        <w:rPr>
-          <w:rFonts w:ascii="Times New Roman" w:eastAsia="宋体" w:hAnsi="Times New Roman" w:cs="Times New Roman"/>
-        </w:rPr>
-      </w:pPr>
-      <w:r>
-        <w:rPr>
-          <w:rFonts w:ascii="Times New Roman" w:eastAsia="宋体" w:hAnsi="Times New Roman" w:cs="Times New Roman" w:hint="eastAsia"/>
-        </w:rPr>
-        <w:t>修复遭遇战地图预览渲染时没有正确标记高架桥的</w:t>
-      </w:r>
-      <w:r>
-        <w:rPr>
-          <w:rFonts w:ascii="Times New Roman" w:eastAsia="宋体" w:hAnsi="Times New Roman" w:cs="Times New Roman" w:hint="eastAsia"/>
-        </w:rPr>
-        <w:t>bug</w:t>
-      </w:r>
-    </w:p>
-    <w:p>
-      <w:pPr>
-        <w:pStyle w:val="a9"/>
-        <w:numPr>
-          <w:ilvl w:val="0"/>
-          <w:numId w:val="50"/>
-        </w:numPr>
-        <w:rPr>
-          <w:rFonts w:ascii="Times New Roman" w:eastAsia="宋体" w:hAnsi="Times New Roman" w:cs="Times New Roman"/>
-        </w:rPr>
-      </w:pPr>
-      <w:r>
-        <w:rPr>
-          <w:rFonts w:ascii="Times New Roman" w:eastAsia="宋体" w:hAnsi="Times New Roman" w:cs="Times New Roman" w:hint="eastAsia"/>
-        </w:rPr>
-        <w:t>为</w:t>
-      </w:r>
-      <w:r>
-        <w:rPr>
-          <w:rFonts w:ascii="Times New Roman" w:eastAsia="宋体" w:hAnsi="Times New Roman" w:cs="Times New Roman" w:hint="eastAsia"/>
-        </w:rPr>
-        <w:t>Lua</w:t>
-      </w:r>
-      <w:r>
-        <w:rPr>
-          <w:rFonts w:ascii="Times New Roman" w:eastAsia="宋体" w:hAnsi="Times New Roman" w:cs="Times New Roman" w:hint="eastAsia"/>
-        </w:rPr>
-        <w:t>脚本终端添加安全检查，会在执行前静态检查高危操作，详见</w:t>
-      </w:r>
-      <w:r>
-        <w:rPr>
-          <w:rFonts w:ascii="Times New Roman" w:eastAsia="宋体" w:hAnsi="Times New Roman" w:cs="Times New Roman" w:hint="eastAsia"/>
-        </w:rPr>
-        <w:t>DisableLuaConsoleSafetyCheck</w:t>
-      </w:r>
-    </w:p>
-    <w:p>
-      <w:pPr>
-        <w:pStyle w:val="a9"/>
-        <w:numPr>
-          <w:ilvl w:val="0"/>
-          <w:numId w:val="50"/>
-        </w:numPr>
-        <w:rPr>
-          <w:rFonts w:ascii="Times New Roman" w:eastAsia="宋体" w:hAnsi="Times New Roman" w:cs="Times New Roman"/>
-        </w:rPr>
-      </w:pPr>
-      <w:r>
-        <w:rPr>
-          <w:rFonts w:ascii="Times New Roman" w:eastAsia="宋体" w:hAnsi="Times New Roman" w:cs="Times New Roman" w:hint="eastAsia"/>
-        </w:rPr>
-        <w:t>可以在地图视图内按方向键调节视角，同时按住</w:t>
-      </w:r>
-      <w:r>
-        <w:rPr>
-          <w:rFonts w:ascii="Times New Roman" w:eastAsia="宋体" w:hAnsi="Times New Roman" w:cs="Times New Roman" w:hint="eastAsia"/>
-        </w:rPr>
-        <w:t>ctrl</w:t>
-      </w:r>
-      <w:r>
-        <w:rPr>
-          <w:rFonts w:ascii="Times New Roman" w:eastAsia="宋体" w:hAnsi="Times New Roman" w:cs="Times New Roman" w:hint="eastAsia"/>
-        </w:rPr>
-        <w:t>键加速移动</w:t>
-      </w:r>
-    </w:p>
-    <w:p>
-      <w:pPr>
-        <w:pStyle w:val="a9"/>
-        <w:numPr>
-          <w:ilvl w:val="0"/>
-          <w:numId w:val="50"/>
-        </w:numPr>
-        <w:rPr>
-          <w:rFonts w:ascii="Times New Roman" w:eastAsia="宋体" w:hAnsi="Times New Roman" w:cs="Times New Roman"/>
-        </w:rPr>
-      </w:pPr>
-      <w:r>
-        <w:rPr>
-          <w:rFonts w:ascii="Times New Roman" w:eastAsia="宋体" w:hAnsi="Times New Roman" w:cs="Times New Roman" w:hint="eastAsia"/>
-        </w:rPr>
-        <w:t>修复部分遭遇战地图所属方选项重复的</w:t>
-      </w:r>
-      <w:r>
-        <w:rPr>
-          <w:rFonts w:ascii="Times New Roman" w:eastAsia="宋体" w:hAnsi="Times New Roman" w:cs="Times New Roman" w:hint="eastAsia"/>
-        </w:rPr>
-        <w:t>bug</w:t>
-      </w:r>
-    </w:p>
-    <w:p>
-      <w:pPr>
-        <w:pStyle w:val="a9"/>
-        <w:numPr>
-          <w:ilvl w:val="0"/>
-          <w:numId w:val="50"/>
-        </w:numPr>
-        <w:rPr>
-          <w:rFonts w:ascii="Times New Roman" w:eastAsia="宋体" w:hAnsi="Times New Roman" w:cs="Times New Roman"/>
-        </w:rPr>
-      </w:pPr>
-      <w:r>
-        <w:rPr>
-          <w:rFonts w:ascii="Times New Roman" w:eastAsia="宋体" w:hAnsi="Times New Roman" w:cs="Times New Roman" w:hint="eastAsia"/>
-        </w:rPr>
-        <w:t>重写单位属性对话框，标签支持搜索，所属方可以显示颜色</w:t>
-      </w:r>
-    </w:p>
-    <w:p>
-      <w:pPr>
-        <w:pStyle w:val="a9"/>
-        <w:numPr>
-          <w:ilvl w:val="0"/>
-          <w:numId w:val="50"/>
-        </w:numPr>
-        <w:rPr>
-          <w:rFonts w:ascii="Times New Roman" w:eastAsia="宋体" w:hAnsi="Times New Roman" w:cs="Times New Roman"/>
-        </w:rPr>
-      </w:pPr>
-      <w:r>
-        <w:rPr>
-          <w:rFonts w:ascii="Times New Roman" w:eastAsia="宋体" w:hAnsi="Times New Roman" w:cs="Times New Roman" w:hint="eastAsia"/>
-        </w:rPr>
-        <w:t>支持将</w:t>
-      </w:r>
-      <w:r>
-        <w:rPr>
-          <w:rFonts w:ascii="Times New Roman" w:eastAsia="宋体" w:hAnsi="Times New Roman" w:cs="Times New Roman" w:hint="eastAsia"/>
-        </w:rPr>
-        <w:t>物品浏览器和</w:t>
-      </w:r>
-      <w:r>
-        <w:rPr>
-          <w:rFonts w:ascii="Times New Roman" w:eastAsia="宋体" w:hAnsi="Times New Roman" w:cs="Times New Roman" w:hint="eastAsia"/>
-        </w:rPr>
-        <w:t>地形浏览器作为一个独立窗口显示</w:t>
-      </w:r>
-      <w:r>
-        <w:rPr>
-          <w:rFonts w:ascii="Times New Roman" w:eastAsia="宋体" w:hAnsi="Times New Roman" w:cs="Times New Roman" w:hint="eastAsia"/>
-        </w:rPr>
-        <w:t>，可以调节透明度</w:t>
-      </w:r>
-      <w:r>
-        <w:rPr>
-          <w:rFonts w:ascii="Times New Roman" w:eastAsia="宋体" w:hAnsi="Times New Roman" w:cs="Times New Roman" w:hint="eastAsia"/>
-        </w:rPr>
-        <w:t>，详见</w:t>
-      </w:r>
-      <w:r>
-        <w:rPr>
-          <w:rFonts w:ascii="Times New Roman" w:eastAsia="宋体" w:hAnsi="Times New Roman" w:cs="Times New Roman" w:hint="eastAsia"/>
-        </w:rPr>
-        <w:t>ViewObjectsFloating</w:t>
-      </w:r>
-      <w:r>
-        <w:rPr>
-          <w:rFonts w:ascii="Times New Roman" w:eastAsia="宋体" w:hAnsi="Times New Roman" w:cs="Times New Roman" w:hint="eastAsia"/>
-        </w:rPr>
-        <w:t>和</w:t>
-      </w:r>
-      <w:r>
-        <w:rPr>
-          <w:rFonts w:ascii="Times New Roman" w:eastAsia="宋体" w:hAnsi="Times New Roman" w:cs="Times New Roman" w:hint="eastAsia"/>
-        </w:rPr>
-        <w:t>TileSetBrowserFloating</w:t>
-      </w:r>
-    </w:p>
-    <w:p>
-      <w:pPr>
-        <w:pStyle w:val="a9"/>
-        <w:numPr>
-          <w:ilvl w:val="0"/>
-          <w:numId w:val="50"/>
-        </w:numPr>
-        <w:rPr>
-          <w:rFonts w:ascii="Times New Roman" w:eastAsia="宋体" w:hAnsi="Times New Roman" w:cs="Times New Roman"/>
-        </w:rPr>
-      </w:pPr>
-      <w:r>
-        <w:rPr>
-          <w:rFonts w:ascii="Times New Roman" w:eastAsia="宋体" w:hAnsi="Times New Roman" w:cs="Times New Roman" w:hint="eastAsia"/>
-        </w:rPr>
-        <w:t>绝大多数窗口可以调节透明度</w:t>
-      </w:r>
-    </w:p>
-    <w:p>
-      <w:pPr>
-        <w:pStyle w:val="a9"/>
-        <w:numPr>
-          <w:ilvl w:val="0"/>
-          <w:numId w:val="50"/>
-        </w:numPr>
-        <w:rPr>
-          <w:rFonts w:ascii="Times New Roman" w:eastAsia="宋体" w:hAnsi="Times New Roman" w:cs="Times New Roman"/>
-        </w:rPr>
-      </w:pPr>
-      <w:r>
-        <w:rPr>
-          <w:rFonts w:ascii="Times New Roman" w:eastAsia="宋体" w:hAnsi="Times New Roman" w:cs="Times New Roman" w:hint="eastAsia"/>
-        </w:rPr>
-        <w:t>修复部分情况下按工具栏擦除覆盖物等按钮不生效的</w:t>
-      </w:r>
-      <w:r>
-        <w:rPr>
-          <w:rFonts w:ascii="Times New Roman" w:eastAsia="宋体" w:hAnsi="Times New Roman" w:cs="Times New Roman" w:hint="eastAsia"/>
-        </w:rPr>
-        <w:t>bug</w:t>
-      </w:r>
-    </w:p>
-    <w:p>
-      <w:pPr>
-        <w:pStyle w:val="a9"/>
-        <w:numPr>
-          <w:ilvl w:val="0"/>
-          <w:numId w:val="50"/>
-        </w:numPr>
-        <w:rPr>
-          <w:rFonts w:ascii="Times New Roman" w:eastAsia="宋体" w:hAnsi="Times New Roman" w:cs="Times New Roman"/>
-        </w:rPr>
-      </w:pPr>
-      <w:r>
-        <w:rPr>
-          <w:rFonts w:ascii="Times New Roman" w:eastAsia="宋体" w:hAnsi="Times New Roman" w:cs="Times New Roman" w:hint="eastAsia"/>
-        </w:rPr>
-        <w:t>修复暗色模式下非主程序菜单的背景色被错误填充的</w:t>
-      </w:r>
-      <w:r>
-        <w:rPr>
-          <w:rFonts w:ascii="Times New Roman" w:eastAsia="宋体" w:hAnsi="Times New Roman" w:cs="Times New Roman" w:hint="eastAsia"/>
-        </w:rPr>
-        <w:t>bug</w:t>
-      </w:r>
-    </w:p>
-    <w:p>
-      <w:pPr>
-        <w:pStyle w:val="a9"/>
-        <w:numPr>
-          <w:ilvl w:val="0"/>
-          <w:numId w:val="50"/>
-        </w:numPr>
-        <w:rPr>
-          <w:rFonts w:ascii="Times New Roman" w:eastAsia="宋体" w:hAnsi="Times New Roman" w:cs="Times New Roman"/>
-        </w:rPr>
-      </w:pPr>
-      <w:r>
-        <w:rPr>
-          <w:rFonts w:ascii="Times New Roman" w:eastAsia="宋体" w:hAnsi="Times New Roman" w:cs="Times New Roman" w:hint="eastAsia"/>
-        </w:rPr>
         <w:t>为触发编辑器、</w:t>
       </w:r>
       <w:r>
@@ -3002,14 +3021,7 @@
         <w:rPr>
           <w:rFonts w:ascii="Times New Roman" w:eastAsia="宋体" w:hAnsi="Times New Roman" w:cs="Times New Roman" w:hint="eastAsia"/>
         </w:rPr>
-        <w:t>触发编辑器增加跳转按钮，可以跳转到参数对应的路径</w:t>
-      </w:r>
-      <w:r>
-        <w:rPr>
-          <w:rFonts w:ascii="Times New Roman" w:eastAsia="宋体" w:hAnsi="Times New Roman" w:cs="Times New Roman" w:hint="eastAsia"/>
-        </w:rPr>
-        <w:lastRenderedPageBreak/>
-        <w:t>点、小队等位置</w:t>
+        <w:t>触发编辑器增加跳转按钮，可以跳转到参数对应的路径点、小队等位置</w:t>
       </w:r>
     </w:p>
     <w:p>
@@ -4007,6 +4019,7 @@
         <w:rPr>
           <w:rFonts w:ascii="Times New Roman" w:eastAsia="宋体" w:hAnsi="Times New Roman" w:cs="Times New Roman" w:hint="eastAsia"/>
         </w:rPr>
+        <w:lastRenderedPageBreak/>
         <w:t>允许设置下拉菜单是否自动搜索，若禁止，则需要按下</w:t>
       </w:r>
       <w:r>
@@ -4025,895 +4038,895 @@
         <w:rPr>
           <w:rFonts w:ascii="Times New Roman" w:eastAsia="宋体" w:hAnsi="Times New Roman" w:cs="Times New Roman" w:hint="eastAsia"/>
         </w:rPr>
+        <w:t>SearchCombobox.Disabled</w:t>
+      </w:r>
+      <w:r>
+        <w:rPr>
+          <w:rFonts w:ascii="Times New Roman" w:eastAsia="宋体" w:hAnsi="Times New Roman" w:cs="Times New Roman" w:hint="eastAsia"/>
+        </w:rPr>
+        <w:t>与</w:t>
+      </w:r>
+      <w:r>
+        <w:rPr>
+          <w:rFonts w:ascii="Times New Roman" w:eastAsia="宋体" w:hAnsi="Times New Roman" w:cs="Times New Roman" w:hint="eastAsia"/>
+        </w:rPr>
+        <w:t>SearchCombobox.AllowNonParams</w:t>
+      </w:r>
+    </w:p>
+    <w:p>
+      <w:pPr>
+        <w:pStyle w:val="a9"/>
+        <w:numPr>
+          <w:ilvl w:val="0"/>
+          <w:numId w:val="48"/>
+        </w:numPr>
+        <w:rPr>
+          <w:rFonts w:ascii="Times New Roman" w:eastAsia="宋体" w:hAnsi="Times New Roman" w:cs="Times New Roman"/>
+        </w:rPr>
+      </w:pPr>
+      <w:r>
+        <w:rPr>
+          <w:rFonts w:ascii="Times New Roman" w:eastAsia="宋体" w:hAnsi="Times New Roman" w:cs="Times New Roman" w:hint="eastAsia"/>
+        </w:rPr>
+        <w:t>修复使用</w:t>
+      </w:r>
+      <w:r>
+        <w:rPr>
+          <w:rFonts w:ascii="Times New Roman" w:eastAsia="宋体" w:hAnsi="Times New Roman" w:cs="Times New Roman" w:hint="eastAsia"/>
+        </w:rPr>
+        <w:t>FA2ForceSide</w:t>
+      </w:r>
+      <w:r>
+        <w:rPr>
+          <w:rFonts w:ascii="Times New Roman" w:eastAsia="宋体" w:hAnsi="Times New Roman" w:cs="Times New Roman" w:hint="eastAsia"/>
+        </w:rPr>
+        <w:t>时，非第一层分类无法按照</w:t>
+      </w:r>
+      <w:r>
+        <w:rPr>
+          <w:rFonts w:ascii="Times New Roman" w:eastAsia="宋体" w:hAnsi="Times New Roman" w:cs="Times New Roman" w:hint="eastAsia"/>
+        </w:rPr>
+        <w:t>[</w:t>
+      </w:r>
+      <w:r>
+        <w:rPr>
+          <w:rFonts w:ascii="Times New Roman" w:eastAsia="宋体" w:hAnsi="Times New Roman" w:cs="Times New Roman" w:hint="eastAsia"/>
+        </w:rPr>
+        <w:t>Sides</w:t>
+      </w:r>
+      <w:r>
+        <w:rPr>
+          <w:rFonts w:ascii="Times New Roman" w:eastAsia="宋体" w:hAnsi="Times New Roman" w:cs="Times New Roman" w:hint="eastAsia"/>
+        </w:rPr>
+        <w:t>]</w:t>
+      </w:r>
+      <w:r>
+        <w:rPr>
+          <w:rFonts w:ascii="Times New Roman" w:eastAsia="宋体" w:hAnsi="Times New Roman" w:cs="Times New Roman" w:hint="eastAsia"/>
+        </w:rPr>
+        <w:t>顺序进行排序的</w:t>
+      </w:r>
+      <w:r>
+        <w:rPr>
+          <w:rFonts w:ascii="Times New Roman" w:eastAsia="宋体" w:hAnsi="Times New Roman" w:cs="Times New Roman" w:hint="eastAsia"/>
+        </w:rPr>
+        <w:t>bug</w:t>
+      </w:r>
+    </w:p>
+    <w:p>
+      <w:pPr>
+        <w:pStyle w:val="a9"/>
+        <w:numPr>
+          <w:ilvl w:val="0"/>
+          <w:numId w:val="48"/>
+        </w:numPr>
+        <w:rPr>
+          <w:rFonts w:ascii="Times New Roman" w:eastAsia="宋体" w:hAnsi="Times New Roman" w:cs="Times New Roman"/>
+        </w:rPr>
+      </w:pPr>
+      <w:r>
+        <w:rPr>
+          <w:rFonts w:ascii="Times New Roman" w:eastAsia="宋体" w:hAnsi="Times New Roman" w:cs="Times New Roman" w:hint="eastAsia"/>
+        </w:rPr>
+        <w:t>修复在老系统上展开下拉菜单使用滚轮时，会错误触发文本框选择切换的</w:t>
+      </w:r>
+      <w:r>
+        <w:rPr>
+          <w:rFonts w:ascii="Times New Roman" w:eastAsia="宋体" w:hAnsi="Times New Roman" w:cs="Times New Roman" w:hint="eastAsia"/>
+        </w:rPr>
+        <w:t>bug</w:t>
+      </w:r>
+    </w:p>
+    <w:p>
+      <w:pPr>
+        <w:pStyle w:val="a9"/>
+        <w:numPr>
+          <w:ilvl w:val="0"/>
+          <w:numId w:val="48"/>
+        </w:numPr>
+        <w:rPr>
+          <w:rFonts w:ascii="Times New Roman" w:eastAsia="宋体" w:hAnsi="Times New Roman" w:cs="Times New Roman"/>
+        </w:rPr>
+      </w:pPr>
+      <w:r>
+        <w:rPr>
+          <w:rFonts w:ascii="Times New Roman" w:eastAsia="宋体" w:hAnsi="Times New Roman" w:cs="Times New Roman" w:hint="eastAsia"/>
+        </w:rPr>
+        <w:t>修复</w:t>
+      </w:r>
+      <w:r>
+        <w:rPr>
+          <w:rFonts w:ascii="Times New Roman" w:eastAsia="宋体" w:hAnsi="Times New Roman" w:cs="Times New Roman" w:hint="eastAsia"/>
+        </w:rPr>
+        <w:t>在使用了某些系统设置软件后，下拉菜单无法正确获取文本的</w:t>
+      </w:r>
+      <w:r>
+        <w:rPr>
+          <w:rFonts w:ascii="Times New Roman" w:eastAsia="宋体" w:hAnsi="Times New Roman" w:cs="Times New Roman" w:hint="eastAsia"/>
+        </w:rPr>
+        <w:t>bug</w:t>
+      </w:r>
+    </w:p>
+    <w:p>
+      <w:pPr>
+        <w:pStyle w:val="a9"/>
+        <w:numPr>
+          <w:ilvl w:val="0"/>
+          <w:numId w:val="48"/>
+        </w:numPr>
+        <w:rPr>
+          <w:rFonts w:ascii="Times New Roman" w:eastAsia="宋体" w:hAnsi="Times New Roman" w:cs="Times New Roman"/>
+        </w:rPr>
+      </w:pPr>
+      <w:r>
+        <w:rPr>
+          <w:rFonts w:ascii="Times New Roman" w:eastAsia="宋体" w:hAnsi="Times New Roman" w:cs="Times New Roman" w:hint="eastAsia"/>
+        </w:rPr>
+        <w:t>重写标签编辑器，支持查找引用、转到触发等特性，支持按名称进行排序，详见</w:t>
+      </w:r>
+      <w:r>
+        <w:rPr>
+          <w:rFonts w:ascii="Times New Roman" w:eastAsia="宋体" w:hAnsi="Times New Roman" w:cs="Times New Roman" w:hint="eastAsia"/>
+        </w:rPr>
+        <w:t>SortByLabelName.Tag</w:t>
+      </w:r>
+    </w:p>
+    <w:p>
+      <w:pPr>
+        <w:pStyle w:val="a9"/>
+        <w:numPr>
+          <w:ilvl w:val="0"/>
+          <w:numId w:val="48"/>
+        </w:numPr>
+        <w:rPr>
+          <w:rFonts w:ascii="Times New Roman" w:eastAsia="宋体" w:hAnsi="Times New Roman" w:cs="Times New Roman"/>
+        </w:rPr>
+      </w:pPr>
+      <w:r>
+        <w:rPr>
+          <w:rFonts w:ascii="Times New Roman" w:eastAsia="宋体" w:hAnsi="Times New Roman" w:cs="Times New Roman" w:hint="eastAsia"/>
+        </w:rPr>
+        <w:t>修复触发批量编辑器</w:t>
+      </w:r>
+      <w:r>
+        <w:rPr>
+          <w:rFonts w:ascii="Times New Roman" w:eastAsia="宋体" w:hAnsi="Times New Roman" w:cs="Times New Roman" w:hint="eastAsia"/>
+        </w:rPr>
+        <w:t>左侧</w:t>
+      </w:r>
+      <w:r>
+        <w:rPr>
+          <w:rFonts w:ascii="Times New Roman" w:eastAsia="宋体" w:hAnsi="Times New Roman" w:cs="Times New Roman" w:hint="eastAsia"/>
+        </w:rPr>
+        <w:t>列表排序</w:t>
+      </w:r>
+      <w:r>
+        <w:rPr>
+          <w:rFonts w:ascii="Times New Roman" w:eastAsia="宋体" w:hAnsi="Times New Roman" w:cs="Times New Roman" w:hint="eastAsia"/>
+        </w:rPr>
+        <w:t>bug</w:t>
+      </w:r>
+    </w:p>
+    <w:p>
+      <w:pPr>
+        <w:pStyle w:val="a9"/>
+        <w:numPr>
+          <w:ilvl w:val="0"/>
+          <w:numId w:val="48"/>
+        </w:numPr>
+        <w:rPr>
+          <w:rFonts w:ascii="Times New Roman" w:eastAsia="宋体" w:hAnsi="Times New Roman" w:cs="Times New Roman"/>
+        </w:rPr>
+      </w:pPr>
+      <w:r>
+        <w:rPr>
+          <w:rFonts w:ascii="Times New Roman" w:eastAsia="宋体" w:hAnsi="Times New Roman" w:cs="Times New Roman"/>
+        </w:rPr>
+        <w:t>I</w:t>
+      </w:r>
+      <w:r>
+        <w:rPr>
+          <w:rFonts w:ascii="Times New Roman" w:eastAsia="宋体" w:hAnsi="Times New Roman" w:cs="Times New Roman" w:hint="eastAsia"/>
+        </w:rPr>
+        <w:t>ni</w:t>
+      </w:r>
+      <w:r>
+        <w:rPr>
+          <w:rFonts w:ascii="Times New Roman" w:eastAsia="宋体" w:hAnsi="Times New Roman" w:cs="Times New Roman" w:hint="eastAsia"/>
+        </w:rPr>
+        <w:t>编辑器的“导入</w:t>
+      </w:r>
+      <w:r>
+        <w:rPr>
+          <w:rFonts w:ascii="Times New Roman" w:eastAsia="宋体" w:hAnsi="Times New Roman" w:cs="Times New Roman" w:hint="eastAsia"/>
+        </w:rPr>
+        <w:t>ini</w:t>
+      </w:r>
+      <w:r>
+        <w:rPr>
+          <w:rFonts w:ascii="Times New Roman" w:eastAsia="宋体" w:hAnsi="Times New Roman" w:cs="Times New Roman" w:hint="eastAsia"/>
+        </w:rPr>
+        <w:t>”窗口支持调整大小</w:t>
+      </w:r>
+    </w:p>
+    <w:p>
+      <w:pPr>
+        <w:pStyle w:val="a9"/>
+        <w:numPr>
+          <w:ilvl w:val="0"/>
+          <w:numId w:val="48"/>
+        </w:numPr>
+        <w:rPr>
+          <w:rFonts w:ascii="Times New Roman" w:eastAsia="宋体" w:hAnsi="Times New Roman" w:cs="Times New Roman"/>
+        </w:rPr>
+      </w:pPr>
+      <w:r>
+        <w:rPr>
+          <w:rFonts w:ascii="Times New Roman" w:eastAsia="宋体" w:hAnsi="Times New Roman" w:cs="Times New Roman" w:hint="eastAsia"/>
+        </w:rPr>
+        <w:t>修复部分建筑无法显示受损火焰、</w:t>
+      </w:r>
+      <w:r>
+        <w:rPr>
+          <w:rFonts w:ascii="Times New Roman" w:eastAsia="宋体" w:hAnsi="Times New Roman" w:cs="Times New Roman" w:hint="eastAsia"/>
+        </w:rPr>
+        <w:t>AlphaImage</w:t>
+      </w:r>
+      <w:r>
+        <w:rPr>
+          <w:rFonts w:ascii="Times New Roman" w:eastAsia="宋体" w:hAnsi="Times New Roman" w:cs="Times New Roman" w:hint="eastAsia"/>
+        </w:rPr>
+        <w:t>的</w:t>
+      </w:r>
+      <w:r>
+        <w:rPr>
+          <w:rFonts w:ascii="Times New Roman" w:eastAsia="宋体" w:hAnsi="Times New Roman" w:cs="Times New Roman" w:hint="eastAsia"/>
+        </w:rPr>
+        <w:t>bug</w:t>
+      </w:r>
+    </w:p>
+    <w:p>
+      <w:pPr>
+        <w:pStyle w:val="a9"/>
+        <w:numPr>
+          <w:ilvl w:val="0"/>
+          <w:numId w:val="48"/>
+        </w:numPr>
+        <w:rPr>
+          <w:rFonts w:ascii="Times New Roman" w:eastAsia="宋体" w:hAnsi="Times New Roman" w:cs="Times New Roman"/>
+        </w:rPr>
+      </w:pPr>
+      <w:r>
+        <w:rPr>
+          <w:rFonts w:ascii="Times New Roman" w:eastAsia="宋体" w:hAnsi="Times New Roman" w:cs="Times New Roman" w:hint="eastAsia"/>
+        </w:rPr>
+        <w:t>优化右键拖动流畅度，拖动时可以实时更新小地图</w:t>
+      </w:r>
+    </w:p>
+    <w:p>
+      <w:pPr>
+        <w:pStyle w:val="a9"/>
+        <w:numPr>
+          <w:ilvl w:val="0"/>
+          <w:numId w:val="48"/>
+        </w:numPr>
+        <w:rPr>
+          <w:rFonts w:ascii="Times New Roman" w:eastAsia="宋体" w:hAnsi="Times New Roman" w:cs="Times New Roman"/>
+        </w:rPr>
+      </w:pPr>
+      <w:r>
+        <w:rPr>
+          <w:rFonts w:ascii="Times New Roman" w:eastAsia="宋体" w:hAnsi="Times New Roman" w:cs="Times New Roman" w:hint="eastAsia"/>
+        </w:rPr>
+        <w:t>优化右键取消当前指令时物品浏览器不停向上切换的</w:t>
+      </w:r>
+      <w:r>
+        <w:rPr>
+          <w:rFonts w:ascii="Times New Roman" w:eastAsia="宋体" w:hAnsi="Times New Roman" w:cs="Times New Roman" w:hint="eastAsia"/>
+        </w:rPr>
+        <w:t>bug</w:t>
+      </w:r>
+    </w:p>
+    <w:p>
+      <w:pPr>
+        <w:pStyle w:val="a9"/>
+        <w:numPr>
+          <w:ilvl w:val="0"/>
+          <w:numId w:val="48"/>
+        </w:numPr>
+        <w:rPr>
+          <w:rFonts w:ascii="Times New Roman" w:eastAsia="宋体" w:hAnsi="Times New Roman" w:cs="Times New Roman"/>
+        </w:rPr>
+      </w:pPr>
+      <w:r>
+        <w:rPr>
+          <w:rFonts w:ascii="Times New Roman" w:eastAsia="宋体" w:hAnsi="Times New Roman" w:cs="Times New Roman" w:hint="eastAsia"/>
+        </w:rPr>
+        <w:t>删除单元标记支持笔刷大小</w:t>
+      </w:r>
+    </w:p>
+    <w:p>
+      <w:pPr>
+        <w:pStyle w:val="a9"/>
+        <w:numPr>
+          <w:ilvl w:val="0"/>
+          <w:numId w:val="48"/>
+        </w:numPr>
+        <w:rPr>
+          <w:rFonts w:ascii="Times New Roman" w:eastAsia="宋体" w:hAnsi="Times New Roman" w:cs="Times New Roman"/>
+        </w:rPr>
+      </w:pPr>
+      <w:r>
+        <w:rPr>
+          <w:rFonts w:ascii="Times New Roman" w:eastAsia="宋体" w:hAnsi="Times New Roman" w:cs="Times New Roman" w:hint="eastAsia"/>
+        </w:rPr>
+        <w:t>为</w:t>
+      </w:r>
+      <w:r>
+        <w:rPr>
+          <w:rFonts w:ascii="Times New Roman" w:eastAsia="宋体" w:hAnsi="Times New Roman" w:cs="Times New Roman" w:hint="eastAsia"/>
+        </w:rPr>
+        <w:t>Lua</w:t>
+      </w:r>
+      <w:r>
+        <w:rPr>
+          <w:rFonts w:ascii="Times New Roman" w:eastAsia="宋体" w:hAnsi="Times New Roman" w:cs="Times New Roman" w:hint="eastAsia"/>
+        </w:rPr>
+        <w:t>脚本增加结束脚本函数，详见</w:t>
+      </w:r>
+      <w:r>
+        <w:rPr>
+          <w:rFonts w:ascii="Times New Roman" w:eastAsia="宋体" w:hAnsi="Times New Roman" w:cs="Times New Roman" w:hint="eastAsia"/>
+        </w:rPr>
+        <w:t>Lua</w:t>
+      </w:r>
+      <w:r>
+        <w:rPr>
+          <w:rFonts w:ascii="Times New Roman" w:eastAsia="宋体" w:hAnsi="Times New Roman" w:cs="Times New Roman" w:hint="eastAsia"/>
+        </w:rPr>
+        <w:t>脚本文档</w:t>
+      </w:r>
+      <w:r>
+        <w:rPr>
+          <w:rFonts w:ascii="Times New Roman" w:eastAsia="宋体" w:hAnsi="Times New Roman" w:cs="Times New Roman" w:hint="eastAsia"/>
+        </w:rPr>
+        <w:t>.xlsx</w:t>
+      </w:r>
+    </w:p>
+    <w:p>
+      <w:pPr>
+        <w:pStyle w:val="a9"/>
+        <w:numPr>
+          <w:ilvl w:val="0"/>
+          <w:numId w:val="48"/>
+        </w:numPr>
+        <w:rPr>
+          <w:rFonts w:ascii="Times New Roman" w:eastAsia="宋体" w:hAnsi="Times New Roman" w:cs="Times New Roman"/>
+        </w:rPr>
+      </w:pPr>
+      <w:r>
+        <w:rPr>
+          <w:rFonts w:ascii="Times New Roman" w:eastAsia="宋体" w:hAnsi="Times New Roman" w:cs="Times New Roman" w:hint="eastAsia"/>
+        </w:rPr>
+        <w:t>范围查看支持查看指示者与抑制者范围</w:t>
+      </w:r>
+    </w:p>
+    <w:p>
+      <w:pPr>
+        <w:pStyle w:val="a9"/>
+        <w:numPr>
+          <w:ilvl w:val="0"/>
+          <w:numId w:val="48"/>
+        </w:numPr>
+        <w:rPr>
+          <w:rFonts w:ascii="Times New Roman" w:eastAsia="宋体" w:hAnsi="Times New Roman" w:cs="Times New Roman"/>
+        </w:rPr>
+      </w:pPr>
+      <w:r>
+        <w:rPr>
+          <w:rFonts w:ascii="Times New Roman" w:eastAsia="宋体" w:hAnsi="Times New Roman" w:cs="Times New Roman" w:hint="eastAsia"/>
+        </w:rPr>
+        <w:t>若地图类型对应后缀的地形对象或污染文件不存在，会加载</w:t>
+      </w:r>
+      <w:r>
+        <w:rPr>
+          <w:rFonts w:ascii="Times New Roman" w:eastAsia="宋体" w:hAnsi="Times New Roman" w:cs="Times New Roman" w:hint="eastAsia"/>
+        </w:rPr>
+        <w:t>对应的</w:t>
+      </w:r>
+      <w:r>
+        <w:rPr>
+          <w:rFonts w:ascii="Times New Roman" w:eastAsia="宋体" w:hAnsi="Times New Roman" w:cs="Times New Roman" w:hint="eastAsia"/>
+        </w:rPr>
+        <w:t>.shp</w:t>
+      </w:r>
+      <w:r>
+        <w:rPr>
+          <w:rFonts w:ascii="Times New Roman" w:eastAsia="宋体" w:hAnsi="Times New Roman" w:cs="Times New Roman" w:hint="eastAsia"/>
+        </w:rPr>
+        <w:t>文件</w:t>
+      </w:r>
+    </w:p>
+    <w:p>
+      <w:pPr>
+        <w:pStyle w:val="a9"/>
+        <w:numPr>
+          <w:ilvl w:val="0"/>
+          <w:numId w:val="48"/>
+        </w:numPr>
+        <w:rPr>
+          <w:rFonts w:ascii="Times New Roman" w:eastAsia="宋体" w:hAnsi="Times New Roman" w:cs="Times New Roman"/>
+        </w:rPr>
+      </w:pPr>
+      <w:r>
+        <w:rPr>
+          <w:rFonts w:ascii="Times New Roman" w:eastAsia="宋体" w:hAnsi="Times New Roman" w:cs="Times New Roman" w:hint="eastAsia"/>
+        </w:rPr>
+        <w:t>修复粘贴地形预览会导致隐藏地形块属性被覆盖的</w:t>
+      </w:r>
+      <w:r>
+        <w:rPr>
+          <w:rFonts w:ascii="Times New Roman" w:eastAsia="宋体" w:hAnsi="Times New Roman" w:cs="Times New Roman" w:hint="eastAsia"/>
+        </w:rPr>
+        <w:t>bug</w:t>
+      </w:r>
+      <w:r>
+        <w:rPr>
+          <w:rFonts w:ascii="Times New Roman" w:eastAsia="宋体" w:hAnsi="Times New Roman" w:cs="Times New Roman" w:hint="eastAsia"/>
+        </w:rPr>
+        <w:t>，粘贴地形会尊重</w:t>
+      </w:r>
+      <w:r>
+        <w:rPr>
+          <w:rFonts w:ascii="Times New Roman" w:eastAsia="宋体" w:hAnsi="Times New Roman" w:cs="Times New Roman" w:hint="eastAsia"/>
+        </w:rPr>
+        <w:t>PlaceTileSkipHide</w:t>
+      </w:r>
+    </w:p>
+    <w:p>
+      <w:pPr>
+        <w:pStyle w:val="a9"/>
+        <w:numPr>
+          <w:ilvl w:val="0"/>
+          <w:numId w:val="48"/>
+        </w:numPr>
+        <w:rPr>
+          <w:rFonts w:ascii="Times New Roman" w:eastAsia="宋体" w:hAnsi="Times New Roman" w:cs="Times New Roman"/>
+        </w:rPr>
+      </w:pPr>
+      <w:r>
+        <w:rPr>
+          <w:rFonts w:ascii="Times New Roman" w:eastAsia="宋体" w:hAnsi="Times New Roman" w:cs="Times New Roman" w:hint="eastAsia"/>
+        </w:rPr>
+        <w:t>支持</w:t>
+      </w:r>
+      <w:r>
+        <w:rPr>
+          <w:rFonts w:ascii="Times New Roman" w:eastAsia="宋体" w:hAnsi="Times New Roman" w:cs="Times New Roman" w:hint="eastAsia"/>
+        </w:rPr>
+        <w:t>Direct11</w:t>
+      </w:r>
+      <w:r>
+        <w:rPr>
+          <w:rFonts w:ascii="Times New Roman" w:eastAsia="宋体" w:hAnsi="Times New Roman" w:cs="Times New Roman" w:hint="eastAsia"/>
+        </w:rPr>
+        <w:t>绘图，可大幅提升性能，详见</w:t>
+      </w:r>
+      <w:r>
+        <w:rPr>
+          <w:rFonts w:ascii="Times New Roman" w:eastAsia="宋体" w:hAnsi="Times New Roman" w:cs="Times New Roman" w:hint="eastAsia"/>
+        </w:rPr>
+        <w:t>DirectXRendering</w:t>
+      </w:r>
+    </w:p>
+    <w:p>
+      <w:pPr>
+        <w:pStyle w:val="a9"/>
+        <w:numPr>
+          <w:ilvl w:val="0"/>
+          <w:numId w:val="48"/>
+        </w:numPr>
+        <w:rPr>
+          <w:rFonts w:ascii="Times New Roman" w:eastAsia="宋体" w:hAnsi="Times New Roman" w:cs="Times New Roman"/>
+        </w:rPr>
+      </w:pPr>
+      <w:r>
+        <w:rPr>
+          <w:rFonts w:ascii="Times New Roman" w:eastAsia="宋体" w:hAnsi="Times New Roman" w:cs="Times New Roman" w:hint="eastAsia"/>
+        </w:rPr>
+        <w:t>支持切换是否更精确地计算深度关系，详见</w:t>
+      </w:r>
+      <w:r>
+        <w:rPr>
+          <w:rFonts w:ascii="Times New Roman" w:eastAsia="宋体" w:hAnsi="Times New Roman" w:cs="Times New Roman" w:hint="eastAsia"/>
+        </w:rPr>
+        <w:t>PreciseDepthCalculation</w:t>
+      </w:r>
+    </w:p>
+    <w:p>
+      <w:pPr>
+        <w:pStyle w:val="a9"/>
+        <w:numPr>
+          <w:ilvl w:val="0"/>
+          <w:numId w:val="48"/>
+        </w:numPr>
+        <w:rPr>
+          <w:rFonts w:ascii="Times New Roman" w:eastAsia="宋体" w:hAnsi="Times New Roman" w:cs="Times New Roman"/>
+        </w:rPr>
+      </w:pPr>
+      <w:r>
+        <w:rPr>
+          <w:rFonts w:ascii="Times New Roman" w:eastAsia="宋体" w:hAnsi="Times New Roman" w:cs="Times New Roman" w:hint="eastAsia"/>
+        </w:rPr>
+        <w:t>修复物品浏览器多级分组单位选择错误的</w:t>
+      </w:r>
+      <w:r>
+        <w:rPr>
+          <w:rFonts w:ascii="Times New Roman" w:eastAsia="宋体" w:hAnsi="Times New Roman" w:cs="Times New Roman" w:hint="eastAsia"/>
+        </w:rPr>
+        <w:t>bug</w:t>
+      </w:r>
+    </w:p>
+    <w:p>
+      <w:pPr>
+        <w:pStyle w:val="a9"/>
+        <w:numPr>
+          <w:ilvl w:val="0"/>
+          <w:numId w:val="48"/>
+        </w:numPr>
+        <w:rPr>
+          <w:rFonts w:ascii="Times New Roman" w:eastAsia="宋体" w:hAnsi="Times New Roman" w:cs="Times New Roman"/>
+        </w:rPr>
+      </w:pPr>
+      <w:r>
+        <w:rPr>
+          <w:rFonts w:ascii="Times New Roman" w:eastAsia="宋体" w:hAnsi="Times New Roman" w:cs="Times New Roman" w:hint="eastAsia"/>
+        </w:rPr>
+        <w:t>支持在地图初始化时加载所有地图内单位，减少使用中卡顿，详见</w:t>
+      </w:r>
+      <w:r>
+        <w:rPr>
+          <w:rFonts w:ascii="Times New Roman" w:eastAsia="宋体" w:hAnsi="Times New Roman" w:cs="Times New Roman" w:hint="eastAsia"/>
+        </w:rPr>
+        <w:t>LoadObjectsOnInit</w:t>
+      </w:r>
+    </w:p>
+    <w:p>
+      <w:pPr>
+        <w:pStyle w:val="a9"/>
+        <w:numPr>
+          <w:ilvl w:val="0"/>
+          <w:numId w:val="48"/>
+        </w:numPr>
+        <w:rPr>
+          <w:rFonts w:ascii="Times New Roman" w:eastAsia="宋体" w:hAnsi="Times New Roman" w:cs="Times New Roman"/>
+        </w:rPr>
+      </w:pPr>
+      <w:r>
+        <w:rPr>
+          <w:rFonts w:ascii="Times New Roman" w:eastAsia="宋体" w:hAnsi="Times New Roman" w:cs="Times New Roman" w:hint="eastAsia"/>
+        </w:rPr>
+        <w:t>重写所属方编辑器，颜色下拉菜单可以预览颜色，支持</w:t>
+      </w:r>
+      <w:r>
+        <w:rPr>
+          <w:rFonts w:ascii="Times New Roman" w:eastAsia="宋体" w:hAnsi="Times New Roman" w:cs="Times New Roman" w:hint="eastAsia"/>
+        </w:rPr>
+        <w:t>Phobos</w:t>
+      </w:r>
+      <w:r>
+        <w:rPr>
+          <w:rFonts w:ascii="Times New Roman" w:eastAsia="宋体" w:hAnsi="Times New Roman" w:cs="Times New Roman" w:hint="eastAsia"/>
+        </w:rPr>
+        <w:t>的</w:t>
+      </w:r>
+      <w:r>
+        <w:rPr>
+          <w:rFonts w:ascii="Times New Roman" w:eastAsia="宋体" w:hAnsi="Times New Roman" w:cs="Times New Roman" w:hint="eastAsia"/>
+        </w:rPr>
+        <w:t>RepairBaseNodes</w:t>
+      </w:r>
+    </w:p>
+    <w:p>
+      <w:pPr>
+        <w:pStyle w:val="a9"/>
+        <w:numPr>
+          <w:ilvl w:val="0"/>
+          <w:numId w:val="48"/>
+        </w:numPr>
+        <w:rPr>
+          <w:rFonts w:ascii="Times New Roman" w:eastAsia="宋体" w:hAnsi="Times New Roman" w:cs="Times New Roman"/>
+        </w:rPr>
+      </w:pPr>
+      <w:r>
+        <w:rPr>
+          <w:rFonts w:ascii="Times New Roman" w:eastAsia="宋体" w:hAnsi="Times New Roman" w:cs="Times New Roman" w:hint="eastAsia"/>
+        </w:rPr>
+        <w:t>触发编辑器下拉菜单可以直接查看触发的禁止状态，详见</w:t>
+      </w:r>
+      <w:r>
+        <w:rPr>
+          <w:rFonts w:ascii="Times New Roman" w:eastAsia="宋体" w:hAnsi="Times New Roman" w:cs="Times New Roman" w:hint="eastAsia"/>
+        </w:rPr>
+        <w:t>DisplayTriggerEnableInfo</w:t>
+      </w:r>
+    </w:p>
+    <w:p>
+      <w:pPr>
+        <w:pStyle w:val="a9"/>
+        <w:numPr>
+          <w:ilvl w:val="0"/>
+          <w:numId w:val="48"/>
+        </w:numPr>
+        <w:rPr>
+          <w:rFonts w:ascii="Times New Roman" w:eastAsia="宋体" w:hAnsi="Times New Roman" w:cs="Times New Roman"/>
+        </w:rPr>
+      </w:pPr>
+      <w:r>
+        <w:rPr>
+          <w:rFonts w:ascii="Times New Roman" w:eastAsia="宋体" w:hAnsi="Times New Roman" w:cs="Times New Roman" w:hint="eastAsia"/>
+        </w:rPr>
+        <w:t>修复使用</w:t>
+      </w:r>
+      <w:r>
+        <w:rPr>
+          <w:rFonts w:ascii="Times New Roman" w:eastAsia="宋体" w:hAnsi="Times New Roman" w:cs="Times New Roman" w:hint="eastAsia"/>
+        </w:rPr>
+        <w:t>Scintilla</w:t>
+      </w:r>
+      <w:r>
+        <w:rPr>
+          <w:rFonts w:ascii="Times New Roman" w:eastAsia="宋体" w:hAnsi="Times New Roman" w:cs="Times New Roman" w:hint="eastAsia"/>
+        </w:rPr>
+        <w:t>引擎的窗口在较老</w:t>
+      </w:r>
+      <w:r>
+        <w:rPr>
+          <w:rFonts w:ascii="Times New Roman" w:eastAsia="宋体" w:hAnsi="Times New Roman" w:cs="Times New Roman" w:hint="eastAsia"/>
+        </w:rPr>
+        <w:t>CPU</w:t>
+      </w:r>
+      <w:r>
+        <w:rPr>
+          <w:rFonts w:ascii="Times New Roman" w:eastAsia="宋体" w:hAnsi="Times New Roman" w:cs="Times New Roman" w:hint="eastAsia"/>
+        </w:rPr>
+        <w:t>上无法正确显示的</w:t>
+      </w:r>
+      <w:r>
+        <w:rPr>
+          <w:rFonts w:ascii="Times New Roman" w:eastAsia="宋体" w:hAnsi="Times New Roman" w:cs="Times New Roman" w:hint="eastAsia"/>
+        </w:rPr>
+        <w:t>bug</w:t>
+      </w:r>
+    </w:p>
+    <w:p>
+      <w:pPr>
+        <w:pStyle w:val="a9"/>
+        <w:numPr>
+          <w:ilvl w:val="0"/>
+          <w:numId w:val="48"/>
+        </w:numPr>
+        <w:rPr>
+          <w:rFonts w:ascii="Times New Roman" w:eastAsia="宋体" w:hAnsi="Times New Roman" w:cs="Times New Roman"/>
+        </w:rPr>
+      </w:pPr>
+      <w:r>
+        <w:rPr>
+          <w:rFonts w:ascii="Times New Roman" w:eastAsia="宋体" w:hAnsi="Times New Roman" w:cs="Times New Roman" w:hint="eastAsia"/>
+        </w:rPr>
+        <w:t>触发编辑器的查找引用可显示当前触发的对应参数并跳转（支持小队、触发和标签）</w:t>
+      </w:r>
+    </w:p>
+    <w:p>
+      <w:pPr>
+        <w:pStyle w:val="a9"/>
+        <w:numPr>
+          <w:ilvl w:val="0"/>
+          <w:numId w:val="48"/>
+        </w:numPr>
+        <w:rPr>
+          <w:rFonts w:ascii="Times New Roman" w:eastAsia="宋体" w:hAnsi="Times New Roman" w:cs="Times New Roman"/>
+        </w:rPr>
+      </w:pPr>
+      <w:r>
+        <w:rPr>
+          <w:rFonts w:ascii="Times New Roman" w:eastAsia="宋体" w:hAnsi="Times New Roman" w:cs="Times New Roman" w:hint="eastAsia"/>
+        </w:rPr>
+        <w:t>修复触发编辑器事件参数填写触发或小队时，不能正确截断名称的</w:t>
+      </w:r>
+      <w:r>
+        <w:rPr>
+          <w:rFonts w:ascii="Times New Roman" w:eastAsia="宋体" w:hAnsi="Times New Roman" w:cs="Times New Roman" w:hint="eastAsia"/>
+        </w:rPr>
+        <w:t>bug</w:t>
+      </w:r>
+    </w:p>
+    <w:p>
+      <w:pPr>
+        <w:pStyle w:val="a9"/>
+        <w:numPr>
+          <w:ilvl w:val="0"/>
+          <w:numId w:val="48"/>
+        </w:numPr>
+        <w:rPr>
+          <w:rFonts w:ascii="Times New Roman" w:eastAsia="宋体" w:hAnsi="Times New Roman" w:cs="Times New Roman"/>
+        </w:rPr>
+      </w:pPr>
+      <w:r>
+        <w:rPr>
+          <w:rFonts w:ascii="Times New Roman" w:eastAsia="宋体" w:hAnsi="Times New Roman" w:cs="Times New Roman" w:hint="eastAsia"/>
+        </w:rPr>
+        <w:t>可以按住</w:t>
+      </w:r>
+      <w:r>
+        <w:rPr>
+          <w:rFonts w:ascii="Times New Roman" w:eastAsia="宋体" w:hAnsi="Times New Roman" w:cs="Times New Roman" w:hint="eastAsia"/>
+        </w:rPr>
+        <w:t>Alt</w:t>
+      </w:r>
+      <w:r>
+        <w:rPr>
+          <w:rFonts w:ascii="Times New Roman" w:eastAsia="宋体" w:hAnsi="Times New Roman" w:cs="Times New Roman" w:hint="eastAsia"/>
+        </w:rPr>
+        <w:t>键的同时滚动滚轮调整笔刷大小</w:t>
+      </w:r>
+    </w:p>
+    <w:p>
+      <w:pPr>
+        <w:pStyle w:val="a9"/>
+        <w:numPr>
+          <w:ilvl w:val="0"/>
+          <w:numId w:val="48"/>
+        </w:numPr>
+        <w:rPr>
+          <w:rFonts w:ascii="Times New Roman" w:eastAsia="宋体" w:hAnsi="Times New Roman" w:cs="Times New Roman"/>
+        </w:rPr>
+      </w:pPr>
+      <w:r>
+        <w:rPr>
+          <w:rFonts w:ascii="Times New Roman" w:eastAsia="宋体" w:hAnsi="Times New Roman" w:cs="Times New Roman" w:hint="eastAsia"/>
+        </w:rPr>
+        <w:t>平坦地形、抬升地形等工具会显示笔刷范围</w:t>
+      </w:r>
+    </w:p>
+    <w:p>
+      <w:pPr>
+        <w:pStyle w:val="a9"/>
+        <w:numPr>
+          <w:ilvl w:val="0"/>
+          <w:numId w:val="48"/>
+        </w:numPr>
+        <w:rPr>
+          <w:rFonts w:ascii="Times New Roman" w:eastAsia="宋体" w:hAnsi="Times New Roman" w:cs="Times New Roman"/>
+        </w:rPr>
+      </w:pPr>
+      <w:r>
+        <w:rPr>
+          <w:rFonts w:ascii="Times New Roman" w:eastAsia="宋体" w:hAnsi="Times New Roman" w:cs="Times New Roman" w:hint="eastAsia"/>
+        </w:rPr>
+        <w:t>修复触发列表等列表分组错误的</w:t>
+      </w:r>
+      <w:r>
+        <w:rPr>
+          <w:rFonts w:ascii="Times New Roman" w:eastAsia="宋体" w:hAnsi="Times New Roman" w:cs="Times New Roman" w:hint="eastAsia"/>
+        </w:rPr>
+        <w:t>bug</w:t>
+      </w:r>
+    </w:p>
+    <w:p>
+      <w:pPr>
+        <w:pStyle w:val="a9"/>
+        <w:numPr>
+          <w:ilvl w:val="0"/>
+          <w:numId w:val="48"/>
+        </w:numPr>
+        <w:rPr>
+          <w:rFonts w:ascii="Times New Roman" w:eastAsia="宋体" w:hAnsi="Times New Roman" w:cs="Times New Roman"/>
+        </w:rPr>
+      </w:pPr>
+      <w:r>
+        <w:rPr>
+          <w:rFonts w:ascii="Times New Roman" w:eastAsia="宋体" w:hAnsi="Times New Roman" w:cs="Times New Roman" w:hint="eastAsia"/>
+        </w:rPr>
+        <w:t>距离工具箱新增放置自由圆，可以自定义半径</w:t>
+      </w:r>
+    </w:p>
+    <w:p>
+      <w:pPr>
+        <w:pStyle w:val="a9"/>
+        <w:numPr>
+          <w:ilvl w:val="0"/>
+          <w:numId w:val="48"/>
+        </w:numPr>
+        <w:rPr>
+          <w:rFonts w:ascii="Times New Roman" w:eastAsia="宋体" w:hAnsi="Times New Roman" w:cs="Times New Roman"/>
+        </w:rPr>
+      </w:pPr>
+      <w:r>
+        <w:rPr>
+          <w:rFonts w:ascii="Times New Roman" w:eastAsia="宋体" w:hAnsi="Times New Roman" w:cs="Times New Roman" w:hint="eastAsia"/>
+        </w:rPr>
+        <w:t>地图注释新增放置线段、箭头、圆功能，可以保存在地图内</w:t>
+      </w:r>
+    </w:p>
+    <w:p>
+      <w:pPr>
+        <w:pStyle w:val="a9"/>
+        <w:numPr>
+          <w:ilvl w:val="0"/>
+          <w:numId w:val="48"/>
+        </w:numPr>
+        <w:rPr>
+          <w:rFonts w:ascii="Times New Roman" w:eastAsia="宋体" w:hAnsi="Times New Roman" w:cs="Times New Roman"/>
+        </w:rPr>
+      </w:pPr>
+      <w:r>
+        <w:rPr>
+          <w:rFonts w:ascii="Times New Roman" w:eastAsia="宋体" w:hAnsi="Times New Roman" w:cs="Times New Roman" w:hint="eastAsia"/>
+        </w:rPr>
+        <w:t>修复触发编辑器在修改触发名称时可能会导致触发列表产生重复的</w:t>
+      </w:r>
+      <w:r>
+        <w:rPr>
+          <w:rFonts w:ascii="Times New Roman" w:eastAsia="宋体" w:hAnsi="Times New Roman" w:cs="Times New Roman" w:hint="eastAsia"/>
+        </w:rPr>
+        <w:t>bug</w:t>
+      </w:r>
+    </w:p>
+    <w:p>
+      <w:pPr>
+        <w:pStyle w:val="a9"/>
+        <w:numPr>
+          <w:ilvl w:val="0"/>
+          <w:numId w:val="48"/>
+        </w:numPr>
+        <w:rPr>
+          <w:rFonts w:ascii="Times New Roman" w:eastAsia="宋体" w:hAnsi="Times New Roman" w:cs="Times New Roman"/>
+        </w:rPr>
+      </w:pPr>
+      <w:r>
+        <w:rPr>
+          <w:rFonts w:ascii="Times New Roman" w:eastAsia="宋体" w:hAnsi="Times New Roman" w:cs="Times New Roman" w:hint="eastAsia"/>
+        </w:rPr>
+        <w:t>地图检查器不会阻止窗口输入，双击包含坐标的错误可以跳转至指定位置</w:t>
+      </w:r>
+    </w:p>
+    <w:p>
+      <w:pPr>
+        <w:pStyle w:val="a9"/>
+        <w:numPr>
+          <w:ilvl w:val="0"/>
+          <w:numId w:val="48"/>
+        </w:numPr>
+        <w:rPr>
+          <w:rFonts w:ascii="Times New Roman" w:eastAsia="宋体" w:hAnsi="Times New Roman" w:cs="Times New Roman"/>
+        </w:rPr>
+      </w:pPr>
+      <w:r>
+        <w:rPr>
+          <w:rFonts w:ascii="Times New Roman" w:eastAsia="宋体" w:hAnsi="Times New Roman" w:cs="Times New Roman" w:hint="eastAsia"/>
+        </w:rPr>
         <w:lastRenderedPageBreak/>
-        <w:t>SearchCombobox.Disabled</w:t>
-      </w:r>
-      <w:r>
-        <w:rPr>
-          <w:rFonts w:ascii="Times New Roman" w:eastAsia="宋体" w:hAnsi="Times New Roman" w:cs="Times New Roman" w:hint="eastAsia"/>
-        </w:rPr>
-        <w:t>与</w:t>
-      </w:r>
-      <w:r>
-        <w:rPr>
-          <w:rFonts w:ascii="Times New Roman" w:eastAsia="宋体" w:hAnsi="Times New Roman" w:cs="Times New Roman" w:hint="eastAsia"/>
-        </w:rPr>
-        <w:t>SearchCombobox.AllowNonParams</w:t>
-      </w:r>
-    </w:p>
-    <w:p>
-      <w:pPr>
-        <w:pStyle w:val="a9"/>
-        <w:numPr>
-          <w:ilvl w:val="0"/>
-          <w:numId w:val="48"/>
-        </w:numPr>
-        <w:rPr>
-          <w:rFonts w:ascii="Times New Roman" w:eastAsia="宋体" w:hAnsi="Times New Roman" w:cs="Times New Roman"/>
-        </w:rPr>
-      </w:pPr>
-      <w:r>
-        <w:rPr>
-          <w:rFonts w:ascii="Times New Roman" w:eastAsia="宋体" w:hAnsi="Times New Roman" w:cs="Times New Roman" w:hint="eastAsia"/>
-        </w:rPr>
-        <w:t>修复使用</w:t>
-      </w:r>
-      <w:r>
-        <w:rPr>
-          <w:rFonts w:ascii="Times New Roman" w:eastAsia="宋体" w:hAnsi="Times New Roman" w:cs="Times New Roman" w:hint="eastAsia"/>
-        </w:rPr>
-        <w:t>FA2ForceSide</w:t>
-      </w:r>
-      <w:r>
-        <w:rPr>
-          <w:rFonts w:ascii="Times New Roman" w:eastAsia="宋体" w:hAnsi="Times New Roman" w:cs="Times New Roman" w:hint="eastAsia"/>
-        </w:rPr>
-        <w:t>时，非第一层分类无法按照</w:t>
-      </w:r>
-      <w:r>
-        <w:rPr>
-          <w:rFonts w:ascii="Times New Roman" w:eastAsia="宋体" w:hAnsi="Times New Roman" w:cs="Times New Roman" w:hint="eastAsia"/>
-        </w:rPr>
-        <w:t>[</w:t>
-      </w:r>
-      <w:r>
-        <w:rPr>
-          <w:rFonts w:ascii="Times New Roman" w:eastAsia="宋体" w:hAnsi="Times New Roman" w:cs="Times New Roman" w:hint="eastAsia"/>
-        </w:rPr>
-        <w:t>Sides</w:t>
-      </w:r>
-      <w:r>
-        <w:rPr>
-          <w:rFonts w:ascii="Times New Roman" w:eastAsia="宋体" w:hAnsi="Times New Roman" w:cs="Times New Roman" w:hint="eastAsia"/>
-        </w:rPr>
-        <w:t>]</w:t>
-      </w:r>
-      <w:r>
-        <w:rPr>
-          <w:rFonts w:ascii="Times New Roman" w:eastAsia="宋体" w:hAnsi="Times New Roman" w:cs="Times New Roman" w:hint="eastAsia"/>
-        </w:rPr>
-        <w:t>顺序进行排序的</w:t>
-      </w:r>
-      <w:r>
-        <w:rPr>
-          <w:rFonts w:ascii="Times New Roman" w:eastAsia="宋体" w:hAnsi="Times New Roman" w:cs="Times New Roman" w:hint="eastAsia"/>
-        </w:rPr>
-        <w:t>bug</w:t>
-      </w:r>
-    </w:p>
-    <w:p>
-      <w:pPr>
-        <w:pStyle w:val="a9"/>
-        <w:numPr>
-          <w:ilvl w:val="0"/>
-          <w:numId w:val="48"/>
-        </w:numPr>
-        <w:rPr>
-          <w:rFonts w:ascii="Times New Roman" w:eastAsia="宋体" w:hAnsi="Times New Roman" w:cs="Times New Roman"/>
-        </w:rPr>
-      </w:pPr>
-      <w:r>
-        <w:rPr>
-          <w:rFonts w:ascii="Times New Roman" w:eastAsia="宋体" w:hAnsi="Times New Roman" w:cs="Times New Roman" w:hint="eastAsia"/>
-        </w:rPr>
-        <w:t>修复在老系统上展开下拉菜单使用滚轮时，会错误触发文本框选择切换的</w:t>
-      </w:r>
-      <w:r>
-        <w:rPr>
-          <w:rFonts w:ascii="Times New Roman" w:eastAsia="宋体" w:hAnsi="Times New Roman" w:cs="Times New Roman" w:hint="eastAsia"/>
-        </w:rPr>
-        <w:t>bug</w:t>
-      </w:r>
-    </w:p>
-    <w:p>
-      <w:pPr>
-        <w:pStyle w:val="a9"/>
-        <w:numPr>
-          <w:ilvl w:val="0"/>
-          <w:numId w:val="48"/>
-        </w:numPr>
-        <w:rPr>
-          <w:rFonts w:ascii="Times New Roman" w:eastAsia="宋体" w:hAnsi="Times New Roman" w:cs="Times New Roman"/>
-        </w:rPr>
-      </w:pPr>
-      <w:r>
-        <w:rPr>
-          <w:rFonts w:ascii="Times New Roman" w:eastAsia="宋体" w:hAnsi="Times New Roman" w:cs="Times New Roman" w:hint="eastAsia"/>
-        </w:rPr>
-        <w:t>修复</w:t>
-      </w:r>
-      <w:r>
-        <w:rPr>
-          <w:rFonts w:ascii="Times New Roman" w:eastAsia="宋体" w:hAnsi="Times New Roman" w:cs="Times New Roman" w:hint="eastAsia"/>
-        </w:rPr>
-        <w:t>在使用了某些系统设置软件后，下拉菜单无法正确获取文本的</w:t>
-      </w:r>
-      <w:r>
-        <w:rPr>
-          <w:rFonts w:ascii="Times New Roman" w:eastAsia="宋体" w:hAnsi="Times New Roman" w:cs="Times New Roman" w:hint="eastAsia"/>
-        </w:rPr>
-        <w:t>bug</w:t>
-      </w:r>
-    </w:p>
-    <w:p>
-      <w:pPr>
-        <w:pStyle w:val="a9"/>
-        <w:numPr>
-          <w:ilvl w:val="0"/>
-          <w:numId w:val="48"/>
-        </w:numPr>
-        <w:rPr>
-          <w:rFonts w:ascii="Times New Roman" w:eastAsia="宋体" w:hAnsi="Times New Roman" w:cs="Times New Roman"/>
-        </w:rPr>
-      </w:pPr>
-      <w:r>
-        <w:rPr>
-          <w:rFonts w:ascii="Times New Roman" w:eastAsia="宋体" w:hAnsi="Times New Roman" w:cs="Times New Roman" w:hint="eastAsia"/>
-        </w:rPr>
-        <w:t>重写标签编辑器，支持查找引用、转到触发等特性，支持按名称进行排序，详见</w:t>
-      </w:r>
-      <w:r>
-        <w:rPr>
-          <w:rFonts w:ascii="Times New Roman" w:eastAsia="宋体" w:hAnsi="Times New Roman" w:cs="Times New Roman" w:hint="eastAsia"/>
-        </w:rPr>
-        <w:t>SortByLabelName.Tag</w:t>
-      </w:r>
-    </w:p>
-    <w:p>
-      <w:pPr>
-        <w:pStyle w:val="a9"/>
-        <w:numPr>
-          <w:ilvl w:val="0"/>
-          <w:numId w:val="48"/>
-        </w:numPr>
-        <w:rPr>
-          <w:rFonts w:ascii="Times New Roman" w:eastAsia="宋体" w:hAnsi="Times New Roman" w:cs="Times New Roman"/>
-        </w:rPr>
-      </w:pPr>
-      <w:r>
-        <w:rPr>
-          <w:rFonts w:ascii="Times New Roman" w:eastAsia="宋体" w:hAnsi="Times New Roman" w:cs="Times New Roman" w:hint="eastAsia"/>
-        </w:rPr>
-        <w:t>修复触发批量编辑器</w:t>
-      </w:r>
-      <w:r>
-        <w:rPr>
-          <w:rFonts w:ascii="Times New Roman" w:eastAsia="宋体" w:hAnsi="Times New Roman" w:cs="Times New Roman" w:hint="eastAsia"/>
-        </w:rPr>
-        <w:t>左侧</w:t>
-      </w:r>
-      <w:r>
-        <w:rPr>
-          <w:rFonts w:ascii="Times New Roman" w:eastAsia="宋体" w:hAnsi="Times New Roman" w:cs="Times New Roman" w:hint="eastAsia"/>
-        </w:rPr>
-        <w:t>列表排序</w:t>
-      </w:r>
-      <w:r>
-        <w:rPr>
-          <w:rFonts w:ascii="Times New Roman" w:eastAsia="宋体" w:hAnsi="Times New Roman" w:cs="Times New Roman" w:hint="eastAsia"/>
-        </w:rPr>
-        <w:t>bug</w:t>
-      </w:r>
-    </w:p>
-    <w:p>
-      <w:pPr>
-        <w:pStyle w:val="a9"/>
-        <w:numPr>
-          <w:ilvl w:val="0"/>
-          <w:numId w:val="48"/>
-        </w:numPr>
-        <w:rPr>
-          <w:rFonts w:ascii="Times New Roman" w:eastAsia="宋体" w:hAnsi="Times New Roman" w:cs="Times New Roman"/>
-        </w:rPr>
-      </w:pPr>
-      <w:r>
-        <w:rPr>
-          <w:rFonts w:ascii="Times New Roman" w:eastAsia="宋体" w:hAnsi="Times New Roman" w:cs="Times New Roman"/>
-        </w:rPr>
-        <w:t>I</w:t>
-      </w:r>
-      <w:r>
-        <w:rPr>
-          <w:rFonts w:ascii="Times New Roman" w:eastAsia="宋体" w:hAnsi="Times New Roman" w:cs="Times New Roman" w:hint="eastAsia"/>
-        </w:rPr>
-        <w:t>ni</w:t>
-      </w:r>
-      <w:r>
-        <w:rPr>
-          <w:rFonts w:ascii="Times New Roman" w:eastAsia="宋体" w:hAnsi="Times New Roman" w:cs="Times New Roman" w:hint="eastAsia"/>
-        </w:rPr>
-        <w:t>编辑器的“导入</w:t>
-      </w:r>
-      <w:r>
-        <w:rPr>
-          <w:rFonts w:ascii="Times New Roman" w:eastAsia="宋体" w:hAnsi="Times New Roman" w:cs="Times New Roman" w:hint="eastAsia"/>
-        </w:rPr>
-        <w:t>ini</w:t>
-      </w:r>
-      <w:r>
-        <w:rPr>
-          <w:rFonts w:ascii="Times New Roman" w:eastAsia="宋体" w:hAnsi="Times New Roman" w:cs="Times New Roman" w:hint="eastAsia"/>
-        </w:rPr>
-        <w:t>”窗口支持调整大小</w:t>
-      </w:r>
-    </w:p>
-    <w:p>
-      <w:pPr>
-        <w:pStyle w:val="a9"/>
-        <w:numPr>
-          <w:ilvl w:val="0"/>
-          <w:numId w:val="48"/>
-        </w:numPr>
-        <w:rPr>
-          <w:rFonts w:ascii="Times New Roman" w:eastAsia="宋体" w:hAnsi="Times New Roman" w:cs="Times New Roman"/>
-        </w:rPr>
-      </w:pPr>
-      <w:r>
-        <w:rPr>
-          <w:rFonts w:ascii="Times New Roman" w:eastAsia="宋体" w:hAnsi="Times New Roman" w:cs="Times New Roman" w:hint="eastAsia"/>
-        </w:rPr>
-        <w:t>修复部分建筑无法显示受损火焰、</w:t>
-      </w:r>
-      <w:r>
-        <w:rPr>
-          <w:rFonts w:ascii="Times New Roman" w:eastAsia="宋体" w:hAnsi="Times New Roman" w:cs="Times New Roman" w:hint="eastAsia"/>
-        </w:rPr>
-        <w:t>AlphaImage</w:t>
-      </w:r>
-      <w:r>
-        <w:rPr>
-          <w:rFonts w:ascii="Times New Roman" w:eastAsia="宋体" w:hAnsi="Times New Roman" w:cs="Times New Roman" w:hint="eastAsia"/>
-        </w:rPr>
-        <w:t>的</w:t>
-      </w:r>
-      <w:r>
-        <w:rPr>
-          <w:rFonts w:ascii="Times New Roman" w:eastAsia="宋体" w:hAnsi="Times New Roman" w:cs="Times New Roman" w:hint="eastAsia"/>
-        </w:rPr>
-        <w:t>bug</w:t>
-      </w:r>
-    </w:p>
-    <w:p>
-      <w:pPr>
-        <w:pStyle w:val="a9"/>
-        <w:numPr>
-          <w:ilvl w:val="0"/>
-          <w:numId w:val="48"/>
-        </w:numPr>
-        <w:rPr>
-          <w:rFonts w:ascii="Times New Roman" w:eastAsia="宋体" w:hAnsi="Times New Roman" w:cs="Times New Roman"/>
-        </w:rPr>
-      </w:pPr>
-      <w:r>
-        <w:rPr>
-          <w:rFonts w:ascii="Times New Roman" w:eastAsia="宋体" w:hAnsi="Times New Roman" w:cs="Times New Roman" w:hint="eastAsia"/>
-        </w:rPr>
-        <w:t>优化右键拖动流畅度，拖动时可以实时更新小地图</w:t>
-      </w:r>
-    </w:p>
-    <w:p>
-      <w:pPr>
-        <w:pStyle w:val="a9"/>
-        <w:numPr>
-          <w:ilvl w:val="0"/>
-          <w:numId w:val="48"/>
-        </w:numPr>
-        <w:rPr>
-          <w:rFonts w:ascii="Times New Roman" w:eastAsia="宋体" w:hAnsi="Times New Roman" w:cs="Times New Roman"/>
-        </w:rPr>
-      </w:pPr>
-      <w:r>
-        <w:rPr>
-          <w:rFonts w:ascii="Times New Roman" w:eastAsia="宋体" w:hAnsi="Times New Roman" w:cs="Times New Roman" w:hint="eastAsia"/>
-        </w:rPr>
-        <w:t>优化右键取消当前指令时物品浏览器不停向上切换的</w:t>
-      </w:r>
-      <w:r>
-        <w:rPr>
-          <w:rFonts w:ascii="Times New Roman" w:eastAsia="宋体" w:hAnsi="Times New Roman" w:cs="Times New Roman" w:hint="eastAsia"/>
-        </w:rPr>
-        <w:t>bug</w:t>
-      </w:r>
-    </w:p>
-    <w:p>
-      <w:pPr>
-        <w:pStyle w:val="a9"/>
-        <w:numPr>
-          <w:ilvl w:val="0"/>
-          <w:numId w:val="48"/>
-        </w:numPr>
-        <w:rPr>
-          <w:rFonts w:ascii="Times New Roman" w:eastAsia="宋体" w:hAnsi="Times New Roman" w:cs="Times New Roman"/>
-        </w:rPr>
-      </w:pPr>
-      <w:r>
-        <w:rPr>
-          <w:rFonts w:ascii="Times New Roman" w:eastAsia="宋体" w:hAnsi="Times New Roman" w:cs="Times New Roman" w:hint="eastAsia"/>
-        </w:rPr>
-        <w:t>删除单元标记支持笔刷大小</w:t>
-      </w:r>
-    </w:p>
-    <w:p>
-      <w:pPr>
-        <w:pStyle w:val="a9"/>
-        <w:numPr>
-          <w:ilvl w:val="0"/>
-          <w:numId w:val="48"/>
-        </w:numPr>
-        <w:rPr>
-          <w:rFonts w:ascii="Times New Roman" w:eastAsia="宋体" w:hAnsi="Times New Roman" w:cs="Times New Roman"/>
-        </w:rPr>
-      </w:pPr>
-      <w:r>
-        <w:rPr>
-          <w:rFonts w:ascii="Times New Roman" w:eastAsia="宋体" w:hAnsi="Times New Roman" w:cs="Times New Roman" w:hint="eastAsia"/>
-        </w:rPr>
-        <w:t>为</w:t>
-      </w:r>
-      <w:r>
-        <w:rPr>
-          <w:rFonts w:ascii="Times New Roman" w:eastAsia="宋体" w:hAnsi="Times New Roman" w:cs="Times New Roman" w:hint="eastAsia"/>
-        </w:rPr>
-        <w:t>Lua</w:t>
-      </w:r>
-      <w:r>
-        <w:rPr>
-          <w:rFonts w:ascii="Times New Roman" w:eastAsia="宋体" w:hAnsi="Times New Roman" w:cs="Times New Roman" w:hint="eastAsia"/>
-        </w:rPr>
-        <w:t>脚本增加结束脚本函数，详见</w:t>
-      </w:r>
-      <w:r>
-        <w:rPr>
-          <w:rFonts w:ascii="Times New Roman" w:eastAsia="宋体" w:hAnsi="Times New Roman" w:cs="Times New Roman" w:hint="eastAsia"/>
-        </w:rPr>
-        <w:t>Lua</w:t>
-      </w:r>
-      <w:r>
-        <w:rPr>
-          <w:rFonts w:ascii="Times New Roman" w:eastAsia="宋体" w:hAnsi="Times New Roman" w:cs="Times New Roman" w:hint="eastAsia"/>
-        </w:rPr>
-        <w:t>脚本文档</w:t>
-      </w:r>
-      <w:r>
-        <w:rPr>
-          <w:rFonts w:ascii="Times New Roman" w:eastAsia="宋体" w:hAnsi="Times New Roman" w:cs="Times New Roman" w:hint="eastAsia"/>
-        </w:rPr>
-        <w:t>.xlsx</w:t>
-      </w:r>
-    </w:p>
-    <w:p>
-      <w:pPr>
-        <w:pStyle w:val="a9"/>
-        <w:numPr>
-          <w:ilvl w:val="0"/>
-          <w:numId w:val="48"/>
-        </w:numPr>
-        <w:rPr>
-          <w:rFonts w:ascii="Times New Roman" w:eastAsia="宋体" w:hAnsi="Times New Roman" w:cs="Times New Roman"/>
-        </w:rPr>
-      </w:pPr>
-      <w:r>
-        <w:rPr>
-          <w:rFonts w:ascii="Times New Roman" w:eastAsia="宋体" w:hAnsi="Times New Roman" w:cs="Times New Roman" w:hint="eastAsia"/>
-        </w:rPr>
-        <w:t>范围查看支持查看指示者与抑制者范围</w:t>
-      </w:r>
-    </w:p>
-    <w:p>
-      <w:pPr>
-        <w:pStyle w:val="a9"/>
-        <w:numPr>
-          <w:ilvl w:val="0"/>
-          <w:numId w:val="48"/>
-        </w:numPr>
-        <w:rPr>
-          <w:rFonts w:ascii="Times New Roman" w:eastAsia="宋体" w:hAnsi="Times New Roman" w:cs="Times New Roman"/>
-        </w:rPr>
-      </w:pPr>
-      <w:r>
-        <w:rPr>
-          <w:rFonts w:ascii="Times New Roman" w:eastAsia="宋体" w:hAnsi="Times New Roman" w:cs="Times New Roman" w:hint="eastAsia"/>
-        </w:rPr>
-        <w:t>若地图类型对应后缀的地形对象或污染文件不存在，会加载</w:t>
-      </w:r>
-      <w:r>
-        <w:rPr>
-          <w:rFonts w:ascii="Times New Roman" w:eastAsia="宋体" w:hAnsi="Times New Roman" w:cs="Times New Roman" w:hint="eastAsia"/>
-        </w:rPr>
-        <w:t>对应的</w:t>
-      </w:r>
-      <w:r>
-        <w:rPr>
-          <w:rFonts w:ascii="Times New Roman" w:eastAsia="宋体" w:hAnsi="Times New Roman" w:cs="Times New Roman" w:hint="eastAsia"/>
-        </w:rPr>
-        <w:t>.shp</w:t>
-      </w:r>
-      <w:r>
-        <w:rPr>
-          <w:rFonts w:ascii="Times New Roman" w:eastAsia="宋体" w:hAnsi="Times New Roman" w:cs="Times New Roman" w:hint="eastAsia"/>
-        </w:rPr>
-        <w:t>文件</w:t>
-      </w:r>
-    </w:p>
-    <w:p>
-      <w:pPr>
-        <w:pStyle w:val="a9"/>
-        <w:numPr>
-          <w:ilvl w:val="0"/>
-          <w:numId w:val="48"/>
-        </w:numPr>
-        <w:rPr>
-          <w:rFonts w:ascii="Times New Roman" w:eastAsia="宋体" w:hAnsi="Times New Roman" w:cs="Times New Roman"/>
-        </w:rPr>
-      </w:pPr>
-      <w:r>
-        <w:rPr>
-          <w:rFonts w:ascii="Times New Roman" w:eastAsia="宋体" w:hAnsi="Times New Roman" w:cs="Times New Roman" w:hint="eastAsia"/>
-        </w:rPr>
-        <w:t>修复粘贴地形预览会导致隐藏地形块属性被覆盖的</w:t>
-      </w:r>
-      <w:r>
-        <w:rPr>
-          <w:rFonts w:ascii="Times New Roman" w:eastAsia="宋体" w:hAnsi="Times New Roman" w:cs="Times New Roman" w:hint="eastAsia"/>
-        </w:rPr>
-        <w:t>bug</w:t>
-      </w:r>
-      <w:r>
-        <w:rPr>
-          <w:rFonts w:ascii="Times New Roman" w:eastAsia="宋体" w:hAnsi="Times New Roman" w:cs="Times New Roman" w:hint="eastAsia"/>
-        </w:rPr>
-        <w:t>，粘贴地形会尊重</w:t>
-      </w:r>
-      <w:r>
-        <w:rPr>
-          <w:rFonts w:ascii="Times New Roman" w:eastAsia="宋体" w:hAnsi="Times New Roman" w:cs="Times New Roman" w:hint="eastAsia"/>
-        </w:rPr>
-        <w:t>PlaceTileSkipHide</w:t>
-      </w:r>
-    </w:p>
-    <w:p>
-      <w:pPr>
-        <w:pStyle w:val="a9"/>
-        <w:numPr>
-          <w:ilvl w:val="0"/>
-          <w:numId w:val="48"/>
-        </w:numPr>
-        <w:rPr>
-          <w:rFonts w:ascii="Times New Roman" w:eastAsia="宋体" w:hAnsi="Times New Roman" w:cs="Times New Roman"/>
-        </w:rPr>
-      </w:pPr>
-      <w:r>
-        <w:rPr>
-          <w:rFonts w:ascii="Times New Roman" w:eastAsia="宋体" w:hAnsi="Times New Roman" w:cs="Times New Roman" w:hint="eastAsia"/>
-        </w:rPr>
-        <w:t>支持</w:t>
-      </w:r>
-      <w:r>
-        <w:rPr>
-          <w:rFonts w:ascii="Times New Roman" w:eastAsia="宋体" w:hAnsi="Times New Roman" w:cs="Times New Roman" w:hint="eastAsia"/>
-        </w:rPr>
-        <w:t>Direct11</w:t>
-      </w:r>
-      <w:r>
-        <w:rPr>
-          <w:rFonts w:ascii="Times New Roman" w:eastAsia="宋体" w:hAnsi="Times New Roman" w:cs="Times New Roman" w:hint="eastAsia"/>
-        </w:rPr>
-        <w:t>绘图，可大幅提升性能，详见</w:t>
-      </w:r>
-      <w:r>
-        <w:rPr>
-          <w:rFonts w:ascii="Times New Roman" w:eastAsia="宋体" w:hAnsi="Times New Roman" w:cs="Times New Roman" w:hint="eastAsia"/>
-        </w:rPr>
-        <w:t>DirectXRendering</w:t>
-      </w:r>
-    </w:p>
-    <w:p>
-      <w:pPr>
-        <w:pStyle w:val="a9"/>
-        <w:numPr>
-          <w:ilvl w:val="0"/>
-          <w:numId w:val="48"/>
-        </w:numPr>
-        <w:rPr>
-          <w:rFonts w:ascii="Times New Roman" w:eastAsia="宋体" w:hAnsi="Times New Roman" w:cs="Times New Roman"/>
-        </w:rPr>
-      </w:pPr>
-      <w:r>
-        <w:rPr>
-          <w:rFonts w:ascii="Times New Roman" w:eastAsia="宋体" w:hAnsi="Times New Roman" w:cs="Times New Roman" w:hint="eastAsia"/>
-        </w:rPr>
-        <w:t>支持切换是否更精确地计算深度关系，详见</w:t>
-      </w:r>
-      <w:r>
-        <w:rPr>
-          <w:rFonts w:ascii="Times New Roman" w:eastAsia="宋体" w:hAnsi="Times New Roman" w:cs="Times New Roman" w:hint="eastAsia"/>
-        </w:rPr>
-        <w:t>PreciseDepthCalculation</w:t>
-      </w:r>
-    </w:p>
-    <w:p>
-      <w:pPr>
-        <w:pStyle w:val="a9"/>
-        <w:numPr>
-          <w:ilvl w:val="0"/>
-          <w:numId w:val="48"/>
-        </w:numPr>
-        <w:rPr>
-          <w:rFonts w:ascii="Times New Roman" w:eastAsia="宋体" w:hAnsi="Times New Roman" w:cs="Times New Roman"/>
-        </w:rPr>
-      </w:pPr>
-      <w:r>
-        <w:rPr>
-          <w:rFonts w:ascii="Times New Roman" w:eastAsia="宋体" w:hAnsi="Times New Roman" w:cs="Times New Roman" w:hint="eastAsia"/>
-        </w:rPr>
-        <w:t>修复物品浏览器多级分组单位选择错误的</w:t>
-      </w:r>
-      <w:r>
-        <w:rPr>
-          <w:rFonts w:ascii="Times New Roman" w:eastAsia="宋体" w:hAnsi="Times New Roman" w:cs="Times New Roman" w:hint="eastAsia"/>
-        </w:rPr>
-        <w:t>bug</w:t>
-      </w:r>
-    </w:p>
-    <w:p>
-      <w:pPr>
-        <w:pStyle w:val="a9"/>
-        <w:numPr>
-          <w:ilvl w:val="0"/>
-          <w:numId w:val="48"/>
-        </w:numPr>
-        <w:rPr>
-          <w:rFonts w:ascii="Times New Roman" w:eastAsia="宋体" w:hAnsi="Times New Roman" w:cs="Times New Roman"/>
-        </w:rPr>
-      </w:pPr>
-      <w:r>
-        <w:rPr>
-          <w:rFonts w:ascii="Times New Roman" w:eastAsia="宋体" w:hAnsi="Times New Roman" w:cs="Times New Roman" w:hint="eastAsia"/>
-        </w:rPr>
-        <w:t>支持在地图初始化时加载所有地图内单位，减少使用中卡顿，详见</w:t>
-      </w:r>
-      <w:r>
-        <w:rPr>
-          <w:rFonts w:ascii="Times New Roman" w:eastAsia="宋体" w:hAnsi="Times New Roman" w:cs="Times New Roman" w:hint="eastAsia"/>
-        </w:rPr>
-        <w:t>LoadObjectsOnInit</w:t>
-      </w:r>
-    </w:p>
-    <w:p>
-      <w:pPr>
-        <w:pStyle w:val="a9"/>
-        <w:numPr>
-          <w:ilvl w:val="0"/>
-          <w:numId w:val="48"/>
-        </w:numPr>
-        <w:rPr>
-          <w:rFonts w:ascii="Times New Roman" w:eastAsia="宋体" w:hAnsi="Times New Roman" w:cs="Times New Roman"/>
-        </w:rPr>
-      </w:pPr>
-      <w:r>
-        <w:rPr>
-          <w:rFonts w:ascii="Times New Roman" w:eastAsia="宋体" w:hAnsi="Times New Roman" w:cs="Times New Roman" w:hint="eastAsia"/>
-        </w:rPr>
-        <w:t>重写所属方编辑器，颜色下拉菜单可以预览颜色，支持</w:t>
-      </w:r>
-      <w:r>
-        <w:rPr>
-          <w:rFonts w:ascii="Times New Roman" w:eastAsia="宋体" w:hAnsi="Times New Roman" w:cs="Times New Roman" w:hint="eastAsia"/>
-        </w:rPr>
-        <w:t>Phobos</w:t>
-      </w:r>
-      <w:r>
-        <w:rPr>
-          <w:rFonts w:ascii="Times New Roman" w:eastAsia="宋体" w:hAnsi="Times New Roman" w:cs="Times New Roman" w:hint="eastAsia"/>
-        </w:rPr>
-        <w:t>的</w:t>
-      </w:r>
-      <w:r>
-        <w:rPr>
-          <w:rFonts w:ascii="Times New Roman" w:eastAsia="宋体" w:hAnsi="Times New Roman" w:cs="Times New Roman" w:hint="eastAsia"/>
-        </w:rPr>
-        <w:t>RepairBaseNodes</w:t>
-      </w:r>
-    </w:p>
-    <w:p>
-      <w:pPr>
-        <w:pStyle w:val="a9"/>
-        <w:numPr>
-          <w:ilvl w:val="0"/>
-          <w:numId w:val="48"/>
-        </w:numPr>
-        <w:rPr>
-          <w:rFonts w:ascii="Times New Roman" w:eastAsia="宋体" w:hAnsi="Times New Roman" w:cs="Times New Roman"/>
-        </w:rPr>
-      </w:pPr>
-      <w:r>
-        <w:rPr>
-          <w:rFonts w:ascii="Times New Roman" w:eastAsia="宋体" w:hAnsi="Times New Roman" w:cs="Times New Roman" w:hint="eastAsia"/>
-        </w:rPr>
-        <w:t>触发编辑器下拉菜单可以直接查看触发的禁止状态，详见</w:t>
-      </w:r>
-      <w:r>
-        <w:rPr>
-          <w:rFonts w:ascii="Times New Roman" w:eastAsia="宋体" w:hAnsi="Times New Roman" w:cs="Times New Roman" w:hint="eastAsia"/>
-        </w:rPr>
-        <w:t>DisplayTriggerEnableInfo</w:t>
-      </w:r>
-    </w:p>
-    <w:p>
-      <w:pPr>
-        <w:pStyle w:val="a9"/>
-        <w:numPr>
-          <w:ilvl w:val="0"/>
-          <w:numId w:val="48"/>
-        </w:numPr>
-        <w:rPr>
-          <w:rFonts w:ascii="Times New Roman" w:eastAsia="宋体" w:hAnsi="Times New Roman" w:cs="Times New Roman"/>
-        </w:rPr>
-      </w:pPr>
-      <w:r>
-        <w:rPr>
-          <w:rFonts w:ascii="Times New Roman" w:eastAsia="宋体" w:hAnsi="Times New Roman" w:cs="Times New Roman" w:hint="eastAsia"/>
-        </w:rPr>
-        <w:t>修复使用</w:t>
-      </w:r>
-      <w:r>
-        <w:rPr>
-          <w:rFonts w:ascii="Times New Roman" w:eastAsia="宋体" w:hAnsi="Times New Roman" w:cs="Times New Roman" w:hint="eastAsia"/>
-        </w:rPr>
-        <w:t>Scintilla</w:t>
-      </w:r>
-      <w:r>
-        <w:rPr>
-          <w:rFonts w:ascii="Times New Roman" w:eastAsia="宋体" w:hAnsi="Times New Roman" w:cs="Times New Roman" w:hint="eastAsia"/>
-        </w:rPr>
-        <w:t>引擎的窗口在较老</w:t>
-      </w:r>
-      <w:r>
-        <w:rPr>
-          <w:rFonts w:ascii="Times New Roman" w:eastAsia="宋体" w:hAnsi="Times New Roman" w:cs="Times New Roman" w:hint="eastAsia"/>
-        </w:rPr>
-        <w:t>CPU</w:t>
-      </w:r>
-      <w:r>
-        <w:rPr>
-          <w:rFonts w:ascii="Times New Roman" w:eastAsia="宋体" w:hAnsi="Times New Roman" w:cs="Times New Roman" w:hint="eastAsia"/>
-        </w:rPr>
-        <w:t>上无法正确显示的</w:t>
-      </w:r>
-      <w:r>
-        <w:rPr>
-          <w:rFonts w:ascii="Times New Roman" w:eastAsia="宋体" w:hAnsi="Times New Roman" w:cs="Times New Roman" w:hint="eastAsia"/>
-        </w:rPr>
-        <w:t>bug</w:t>
-      </w:r>
-    </w:p>
-    <w:p>
-      <w:pPr>
-        <w:pStyle w:val="a9"/>
-        <w:numPr>
-          <w:ilvl w:val="0"/>
-          <w:numId w:val="48"/>
-        </w:numPr>
-        <w:rPr>
-          <w:rFonts w:ascii="Times New Roman" w:eastAsia="宋体" w:hAnsi="Times New Roman" w:cs="Times New Roman"/>
-        </w:rPr>
-      </w:pPr>
-      <w:r>
-        <w:rPr>
-          <w:rFonts w:ascii="Times New Roman" w:eastAsia="宋体" w:hAnsi="Times New Roman" w:cs="Times New Roman" w:hint="eastAsia"/>
-        </w:rPr>
-        <w:t>触发编辑器的查找引用可显示当前触发的对应参数并跳转（支持小队、触发和标签）</w:t>
-      </w:r>
-    </w:p>
-    <w:p>
-      <w:pPr>
-        <w:pStyle w:val="a9"/>
-        <w:numPr>
-          <w:ilvl w:val="0"/>
-          <w:numId w:val="48"/>
-        </w:numPr>
-        <w:rPr>
-          <w:rFonts w:ascii="Times New Roman" w:eastAsia="宋体" w:hAnsi="Times New Roman" w:cs="Times New Roman"/>
-        </w:rPr>
-      </w:pPr>
-      <w:r>
-        <w:rPr>
-          <w:rFonts w:ascii="Times New Roman" w:eastAsia="宋体" w:hAnsi="Times New Roman" w:cs="Times New Roman" w:hint="eastAsia"/>
-        </w:rPr>
-        <w:t>修复触发编辑器事件参数填写触发或小队时，不能正确截断名称的</w:t>
-      </w:r>
-      <w:r>
-        <w:rPr>
-          <w:rFonts w:ascii="Times New Roman" w:eastAsia="宋体" w:hAnsi="Times New Roman" w:cs="Times New Roman" w:hint="eastAsia"/>
-        </w:rPr>
-        <w:t>bug</w:t>
-      </w:r>
-    </w:p>
-    <w:p>
-      <w:pPr>
-        <w:pStyle w:val="a9"/>
-        <w:numPr>
-          <w:ilvl w:val="0"/>
-          <w:numId w:val="48"/>
-        </w:numPr>
-        <w:rPr>
-          <w:rFonts w:ascii="Times New Roman" w:eastAsia="宋体" w:hAnsi="Times New Roman" w:cs="Times New Roman"/>
-        </w:rPr>
-      </w:pPr>
-      <w:r>
-        <w:rPr>
-          <w:rFonts w:ascii="Times New Roman" w:eastAsia="宋体" w:hAnsi="Times New Roman" w:cs="Times New Roman" w:hint="eastAsia"/>
-        </w:rPr>
-        <w:t>可以按住</w:t>
-      </w:r>
-      <w:r>
-        <w:rPr>
-          <w:rFonts w:ascii="Times New Roman" w:eastAsia="宋体" w:hAnsi="Times New Roman" w:cs="Times New Roman" w:hint="eastAsia"/>
-        </w:rPr>
-        <w:t>Alt</w:t>
-      </w:r>
-      <w:r>
-        <w:rPr>
-          <w:rFonts w:ascii="Times New Roman" w:eastAsia="宋体" w:hAnsi="Times New Roman" w:cs="Times New Roman" w:hint="eastAsia"/>
-        </w:rPr>
-        <w:t>键的同时滚动滚轮调整笔刷大小</w:t>
-      </w:r>
-    </w:p>
-    <w:p>
-      <w:pPr>
-        <w:pStyle w:val="a9"/>
-        <w:numPr>
-          <w:ilvl w:val="0"/>
-          <w:numId w:val="48"/>
-        </w:numPr>
-        <w:rPr>
-          <w:rFonts w:ascii="Times New Roman" w:eastAsia="宋体" w:hAnsi="Times New Roman" w:cs="Times New Roman"/>
-        </w:rPr>
-      </w:pPr>
-      <w:r>
-        <w:rPr>
-          <w:rFonts w:ascii="Times New Roman" w:eastAsia="宋体" w:hAnsi="Times New Roman" w:cs="Times New Roman" w:hint="eastAsia"/>
-        </w:rPr>
-        <w:t>平坦地形、抬升地形等工具会显示笔刷范围</w:t>
-      </w:r>
-    </w:p>
-    <w:p>
-      <w:pPr>
-        <w:pStyle w:val="a9"/>
-        <w:numPr>
-          <w:ilvl w:val="0"/>
-          <w:numId w:val="48"/>
-        </w:numPr>
-        <w:rPr>
-          <w:rFonts w:ascii="Times New Roman" w:eastAsia="宋体" w:hAnsi="Times New Roman" w:cs="Times New Roman"/>
-        </w:rPr>
-      </w:pPr>
-      <w:r>
-        <w:rPr>
-          <w:rFonts w:ascii="Times New Roman" w:eastAsia="宋体" w:hAnsi="Times New Roman" w:cs="Times New Roman" w:hint="eastAsia"/>
-        </w:rPr>
-        <w:t>修复触发列表等列表分组错误的</w:t>
-      </w:r>
-      <w:r>
-        <w:rPr>
-          <w:rFonts w:ascii="Times New Roman" w:eastAsia="宋体" w:hAnsi="Times New Roman" w:cs="Times New Roman" w:hint="eastAsia"/>
-        </w:rPr>
-        <w:t>bug</w:t>
-      </w:r>
-    </w:p>
-    <w:p>
-      <w:pPr>
-        <w:pStyle w:val="a9"/>
-        <w:numPr>
-          <w:ilvl w:val="0"/>
-          <w:numId w:val="48"/>
-        </w:numPr>
-        <w:rPr>
-          <w:rFonts w:ascii="Times New Roman" w:eastAsia="宋体" w:hAnsi="Times New Roman" w:cs="Times New Roman"/>
-        </w:rPr>
-      </w:pPr>
-      <w:r>
-        <w:rPr>
-          <w:rFonts w:ascii="Times New Roman" w:eastAsia="宋体" w:hAnsi="Times New Roman" w:cs="Times New Roman" w:hint="eastAsia"/>
-        </w:rPr>
-        <w:t>距离工具箱新增放置自由圆，可以自定义半径</w:t>
-      </w:r>
-    </w:p>
-    <w:p>
-      <w:pPr>
-        <w:pStyle w:val="a9"/>
-        <w:numPr>
-          <w:ilvl w:val="0"/>
-          <w:numId w:val="48"/>
-        </w:numPr>
-        <w:rPr>
-          <w:rFonts w:ascii="Times New Roman" w:eastAsia="宋体" w:hAnsi="Times New Roman" w:cs="Times New Roman"/>
-        </w:rPr>
-      </w:pPr>
-      <w:r>
-        <w:rPr>
-          <w:rFonts w:ascii="Times New Roman" w:eastAsia="宋体" w:hAnsi="Times New Roman" w:cs="Times New Roman" w:hint="eastAsia"/>
-        </w:rPr>
-        <w:t>地图注释新增放置线段、箭头、圆功能，可以保存在地图内</w:t>
-      </w:r>
-    </w:p>
-    <w:p>
-      <w:pPr>
-        <w:pStyle w:val="a9"/>
-        <w:numPr>
-          <w:ilvl w:val="0"/>
-          <w:numId w:val="48"/>
-        </w:numPr>
-        <w:rPr>
-          <w:rFonts w:ascii="Times New Roman" w:eastAsia="宋体" w:hAnsi="Times New Roman" w:cs="Times New Roman"/>
-        </w:rPr>
-      </w:pPr>
-      <w:r>
-        <w:rPr>
-          <w:rFonts w:ascii="Times New Roman" w:eastAsia="宋体" w:hAnsi="Times New Roman" w:cs="Times New Roman" w:hint="eastAsia"/>
-        </w:rPr>
-        <w:t>修复触发编辑器在修改触发名称时可能会导致触发列表产生重复的</w:t>
-      </w:r>
-      <w:r>
-        <w:rPr>
-          <w:rFonts w:ascii="Times New Roman" w:eastAsia="宋体" w:hAnsi="Times New Roman" w:cs="Times New Roman" w:hint="eastAsia"/>
-        </w:rPr>
-        <w:t>bug</w:t>
-      </w:r>
-    </w:p>
-    <w:p>
-      <w:pPr>
-        <w:pStyle w:val="a9"/>
-        <w:numPr>
-          <w:ilvl w:val="0"/>
-          <w:numId w:val="48"/>
-        </w:numPr>
-        <w:rPr>
-          <w:rFonts w:ascii="Times New Roman" w:eastAsia="宋体" w:hAnsi="Times New Roman" w:cs="Times New Roman"/>
-        </w:rPr>
-      </w:pPr>
-      <w:r>
-        <w:rPr>
-          <w:rFonts w:ascii="Times New Roman" w:eastAsia="宋体" w:hAnsi="Times New Roman" w:cs="Times New Roman" w:hint="eastAsia"/>
-        </w:rPr>
-        <w:t>地图检查器不会阻止窗口输入，双击包含坐标的错误可以跳转至指定位置</w:t>
-      </w:r>
-    </w:p>
-    <w:p>
-      <w:pPr>
-        <w:pStyle w:val="a9"/>
-        <w:numPr>
-          <w:ilvl w:val="0"/>
-          <w:numId w:val="48"/>
-        </w:numPr>
-        <w:rPr>
-          <w:rFonts w:ascii="Times New Roman" w:eastAsia="宋体" w:hAnsi="Times New Roman" w:cs="Times New Roman"/>
-        </w:rPr>
-      </w:pPr>
-      <w:r>
-        <w:rPr>
-          <w:rFonts w:ascii="Times New Roman" w:eastAsia="宋体" w:hAnsi="Times New Roman" w:cs="Times New Roman" w:hint="eastAsia"/>
-        </w:rPr>
         <w:t>优化对高</w:t>
       </w:r>
       <w:r>
@@ -4970,15 +4983,7 @@
             <w:rFonts w:ascii="Times New Roman" w:eastAsia="宋体" w:hAnsi="Times New Roman" w:cs="Times New Roman"/>
             <w:color w:val="0B769F" w:themeColor="accent4" w:themeShade="BF"/>
           </w:rPr>
-          <w:t>雷</w:t>
-        </w:r>
-        <w:r>
-          <w:rPr>
-            <w:rFonts w:ascii="Times New Roman" w:eastAsia="宋体" w:hAnsi="Times New Roman" w:cs="Times New Roman"/>
-            <w:color w:val="0B769F" w:themeColor="accent4" w:themeShade="BF"/>
-          </w:rPr>
-          <w:lastRenderedPageBreak/>
-          <w:t>德克里莫</w:t>
+          <w:t>雷德克里莫</w:t>
         </w:r>
       </w:hyperlink>
       <w:r>
@@ -5869,6 +5874,7 @@
         <w:rPr>
           <w:rFonts w:ascii="Times New Roman" w:eastAsia="宋体" w:hAnsi="Times New Roman" w:cs="Times New Roman" w:hint="eastAsia"/>
         </w:rPr>
+        <w:lastRenderedPageBreak/>
         <w:t>修复地形的</w:t>
       </w:r>
       <w:r>
@@ -5905,7 +5911,6 @@
         <w:rPr>
           <w:rFonts w:ascii="Times New Roman" w:eastAsia="宋体" w:hAnsi="Times New Roman" w:cs="Times New Roman" w:hint="eastAsia"/>
         </w:rPr>
-        <w:lastRenderedPageBreak/>
         <w:t>支持</w:t>
       </w:r>
       <w:r>
@@ -6808,6 +6813,7 @@
         <w:rPr>
           <w:rFonts w:ascii="Times New Roman" w:eastAsia="宋体" w:hAnsi="Times New Roman" w:cs="Times New Roman" w:hint="eastAsia"/>
         </w:rPr>
+        <w:lastRenderedPageBreak/>
         <w:t>触发批量编辑器的拖拽高亮可以正确显示在目标单元格上</w:t>
       </w:r>
     </w:p>
@@ -6826,7 +6832,6 @@
         <w:rPr>
           <w:rFonts w:ascii="Times New Roman" w:eastAsia="宋体" w:hAnsi="Times New Roman" w:cs="Times New Roman" w:hint="eastAsia"/>
         </w:rPr>
-        <w:lastRenderedPageBreak/>
         <w:t>修复当拖拽小绿点或触发事件、行为时，若突然失去焦点，会导致拖拽预览始终显示的</w:t>
       </w:r>
       <w:r>
@@ -7874,6 +7879,7 @@
         <w:rPr>
           <w:rFonts w:ascii="Times New Roman" w:eastAsia="宋体" w:hAnsi="Times New Roman" w:cs="Times New Roman" w:hint="eastAsia"/>
         </w:rPr>
+        <w:lastRenderedPageBreak/>
         <w:t>减少不必要的文件加载检查，加快加载速度</w:t>
       </w:r>
     </w:p>
@@ -7892,7 +7898,6 @@
         <w:rPr>
           <w:rFonts w:ascii="Times New Roman" w:eastAsia="宋体" w:hAnsi="Times New Roman" w:cs="Times New Roman" w:hint="eastAsia"/>
         </w:rPr>
-        <w:lastRenderedPageBreak/>
         <w:t>支持自定义气候类型的素材文件后缀和</w:t>
       </w:r>
       <w:r>
@@ -9045,6 +9050,7 @@
         <w:rPr>
           <w:rFonts w:ascii="Times New Roman" w:eastAsia="宋体" w:hAnsi="Times New Roman" w:cs="Times New Roman" w:hint="eastAsia"/>
         </w:rPr>
+        <w:lastRenderedPageBreak/>
         <w:t>优化建筑与建筑动画色盘不同时色彩显示的表现</w:t>
       </w:r>
     </w:p>
@@ -9063,7 +9069,6 @@
         <w:rPr>
           <w:rFonts w:ascii="Times New Roman" w:eastAsia="宋体" w:hAnsi="Times New Roman" w:cs="Times New Roman" w:hint="eastAsia"/>
         </w:rPr>
-        <w:lastRenderedPageBreak/>
         <w:t>优化建筑</w:t>
       </w:r>
       <w:r>
@@ -10078,6 +10083,7 @@
         <w:rPr>
           <w:rFonts w:ascii="Times New Roman" w:eastAsia="宋体" w:hAnsi="Times New Roman" w:cs="Times New Roman" w:hint="eastAsia"/>
         </w:rPr>
+        <w:lastRenderedPageBreak/>
         <w:t>优化高架桥阴影渲染</w:t>
       </w:r>
     </w:p>
@@ -10096,7 +10102,6 @@
         <w:rPr>
           <w:rFonts w:ascii="Times New Roman" w:eastAsia="宋体" w:hAnsi="Times New Roman" w:cs="Times New Roman" w:hint="eastAsia"/>
         </w:rPr>
-        <w:lastRenderedPageBreak/>
         <w:t>使用格式刷时会显示被修改的属性</w:t>
       </w:r>
     </w:p>
@@ -11123,6 +11128,7 @@
         <w:rPr>
           <w:rFonts w:ascii="Times New Roman" w:eastAsia="宋体" w:hAnsi="Times New Roman" w:cs="Times New Roman" w:hint="eastAsia"/>
         </w:rPr>
+        <w:lastRenderedPageBreak/>
         <w:t>移除</w:t>
       </w:r>
       <w:r>
@@ -11165,7 +11171,6 @@
         <w:rPr>
           <w:rFonts w:ascii="Times New Roman" w:eastAsia="宋体" w:hAnsi="Times New Roman" w:cs="Times New Roman"/>
         </w:rPr>
-        <w:lastRenderedPageBreak/>
         <w:t>L</w:t>
       </w:r>
       <w:r>
@@ -50755,7 +50760,7 @@
         <v:path o:extrusionok="f" gradientshapeok="t" o:connecttype="rect"/>
         <o:lock v:ext="edit" aspectratio="t"/>
       </v:shapetype>
-      <v:shape id="_x0000_i1032" type="#_x0000_t75" style="width:11.55pt;height:11.55pt" o:bullet="t">
+      <v:shape id="_x0000_i1030" type="#_x0000_t75" style="width:11.55pt;height:11.55pt" o:bullet="t">
         <v:imagedata r:id="rId1" o:title="mso9A9A"/>
       </v:shape>
     </w:pict>

</xml_diff>

<commit_message>
scroll to adjust techno facing when placing
</commit_message>
<xml_diff>
--- a/Supplementary/文档/FA2SP HDM Edition说明文档.docx
+++ b/Supplementary/文档/FA2SP HDM Edition说明文档.docx
@@ -174,7 +174,7 @@
           <w:rFonts w:ascii="宋体" w:eastAsia="宋体" w:hAnsi="宋体" w:hint="eastAsia"/>
           <w:sz w:val="24"/>
         </w:rPr>
-        <w:t>7</w:t>
+        <w:t>8</w:t>
       </w:r>
     </w:p>
     <w:p>
@@ -246,7 +246,7 @@
           <w:sz w:val="28"/>
           <w:szCs w:val="32"/>
         </w:rPr>
-        <w:t>7</w:t>
+        <w:t>8</w:t>
       </w:r>
       <w:r>
         <w:rPr>
@@ -600,6 +600,24 @@
         <w:pStyle w:val="a9"/>
         <w:numPr>
           <w:ilvl w:val="0"/>
+          <w:numId w:val="11"/>
+        </w:numPr>
+        <w:rPr>
+          <w:rFonts w:ascii="Times New Roman" w:eastAsia="宋体" w:hAnsi="Times New Roman" w:cs="Times New Roman"/>
+        </w:rPr>
+      </w:pPr>
+      <w:r>
+        <w:rPr>
+          <w:rFonts w:ascii="Times New Roman" w:eastAsia="宋体" w:hAnsi="Times New Roman" w:cs="Times New Roman" w:hint="eastAsia"/>
+        </w:rPr>
+        <w:t>在摆放单位的时候，滚动鼠标滚轮调整方向</w:t>
+      </w:r>
+    </w:p>
+    <w:p>
+      <w:pPr>
+        <w:pStyle w:val="a9"/>
+        <w:numPr>
+          <w:ilvl w:val="0"/>
           <w:numId w:val="10"/>
         </w:numPr>
         <w:rPr>
@@ -850,7 +868,14 @@
         <w:rPr>
           <w:rFonts w:ascii="Times New Roman" w:eastAsia="宋体" w:hAnsi="Times New Roman" w:cs="Times New Roman" w:hint="eastAsia"/>
         </w:rPr>
-        <w:t>键切换后可以批量绘制多段连接地形，并支持形成闭环</w:t>
+        <w:t>键切换后可以批量绘制多段连接地</w:t>
+      </w:r>
+      <w:r>
+        <w:rPr>
+          <w:rFonts w:ascii="Times New Roman" w:eastAsia="宋体" w:hAnsi="Times New Roman" w:cs="Times New Roman" w:hint="eastAsia"/>
+        </w:rPr>
+        <w:lastRenderedPageBreak/>
+        <w:t>形，并支持形成闭环</w:t>
       </w:r>
     </w:p>
     <w:p>
@@ -868,7 +893,6 @@
         <w:rPr>
           <w:rFonts w:ascii="Times New Roman" w:eastAsia="宋体" w:hAnsi="Times New Roman" w:cs="Times New Roman" w:hint="eastAsia"/>
         </w:rPr>
-        <w:lastRenderedPageBreak/>
         <w:t>修复开启</w:t>
       </w:r>
       <w:r>
@@ -50838,7 +50862,7 @@
         <v:path o:extrusionok="f" gradientshapeok="t" o:connecttype="rect"/>
         <o:lock v:ext="edit" aspectratio="t"/>
       </v:shapetype>
-      <v:shape id="_x0000_i1030" type="#_x0000_t75" style="width:11.55pt;height:11.55pt" o:bullet="t">
+      <v:shape id="_x0000_i1032" type="#_x0000_t75" style="width:11.55pt;height:11.55pt" o:bullet="t">
         <v:imagedata r:id="rId1" o:title="mso9A9A"/>
       </v:shape>
     </w:pict>

</xml_diff>

<commit_message>
fix change building image bug
</commit_message>
<xml_diff>
--- a/Supplementary/文档/FA2SP HDM Edition说明文档.docx
+++ b/Supplementary/文档/FA2SP HDM Edition说明文档.docx
@@ -167,7 +167,14 @@
           <w:rFonts w:ascii="宋体" w:eastAsia="宋体" w:hAnsi="宋体" w:hint="eastAsia"/>
           <w:sz w:val="24"/>
         </w:rPr>
-        <w:t>20</w:t>
+        <w:t>2</w:t>
+      </w:r>
+      <w:r>
+        <w:rPr>
+          <w:rFonts w:ascii="宋体" w:eastAsia="宋体" w:hAnsi="宋体" w:hint="eastAsia"/>
+          <w:sz w:val="24"/>
+        </w:rPr>
+        <w:t>2</w:t>
       </w:r>
     </w:p>
     <w:p>
@@ -229,7 +236,7 @@
           <w:sz w:val="28"/>
           <w:szCs w:val="32"/>
         </w:rPr>
-        <w:t>20</w:t>
+        <w:t>2</w:t>
       </w:r>
       <w:r>
         <w:rPr>
@@ -239,466 +246,502 @@
           <w:sz w:val="28"/>
           <w:szCs w:val="32"/>
         </w:rPr>
-        <w:t>)</w:t>
-      </w:r>
-    </w:p>
-    <w:p>
-      <w:pPr>
-        <w:pStyle w:val="a9"/>
-        <w:numPr>
-          <w:ilvl w:val="0"/>
-          <w:numId w:val="11"/>
-        </w:numPr>
-        <w:rPr>
-          <w:rFonts w:ascii="Times New Roman" w:eastAsia="宋体" w:hAnsi="Times New Roman" w:cs="Times New Roman"/>
-        </w:rPr>
-      </w:pPr>
-      <w:r>
-        <w:rPr>
-          <w:rFonts w:ascii="Times New Roman" w:eastAsia="宋体" w:hAnsi="Times New Roman" w:cs="Times New Roman" w:hint="eastAsia"/>
-        </w:rPr>
-        <w:t>修复单人游戏设置</w:t>
-      </w:r>
-      <w:r>
-        <w:rPr>
-          <w:rFonts w:ascii="Times New Roman" w:eastAsia="宋体" w:hAnsi="Times New Roman" w:cs="Times New Roman" w:hint="eastAsia"/>
-        </w:rPr>
-        <w:t>-&gt;</w:t>
-      </w:r>
-      <w:r>
-        <w:rPr>
-          <w:rFonts w:ascii="Times New Roman" w:eastAsia="宋体" w:hAnsi="Times New Roman" w:cs="Times New Roman" w:hint="eastAsia"/>
-        </w:rPr>
-        <w:t>幻影伪装树木窗口关闭时的崩溃</w:t>
-      </w:r>
-    </w:p>
-    <w:p>
-      <w:pPr>
-        <w:pStyle w:val="a9"/>
-        <w:numPr>
-          <w:ilvl w:val="0"/>
-          <w:numId w:val="11"/>
-        </w:numPr>
-        <w:rPr>
-          <w:rFonts w:ascii="Times New Roman" w:eastAsia="宋体" w:hAnsi="Times New Roman" w:cs="Times New Roman"/>
-        </w:rPr>
-      </w:pPr>
-      <w:r>
-        <w:rPr>
-          <w:rFonts w:ascii="Times New Roman" w:eastAsia="宋体" w:hAnsi="Times New Roman" w:cs="Times New Roman" w:hint="eastAsia"/>
-        </w:rPr>
-        <w:t>触发编辑器的局部变量参数可以跳转</w:t>
-      </w:r>
-    </w:p>
-    <w:p>
-      <w:pPr>
-        <w:pStyle w:val="a9"/>
-        <w:numPr>
-          <w:ilvl w:val="0"/>
-          <w:numId w:val="11"/>
-        </w:numPr>
-        <w:rPr>
-          <w:rFonts w:ascii="Times New Roman" w:eastAsia="宋体" w:hAnsi="Times New Roman" w:cs="Times New Roman"/>
-        </w:rPr>
-      </w:pPr>
-      <w:r>
-        <w:rPr>
-          <w:rFonts w:ascii="Times New Roman" w:eastAsia="宋体" w:hAnsi="Times New Roman" w:cs="Times New Roman" w:hint="eastAsia"/>
-        </w:rPr>
-        <w:t>修复单位属性窗口的血量调节会产生累计误差的</w:t>
-      </w:r>
-      <w:r>
-        <w:rPr>
-          <w:rFonts w:ascii="Times New Roman" w:eastAsia="宋体" w:hAnsi="Times New Roman" w:cs="Times New Roman" w:hint="eastAsia"/>
-        </w:rPr>
-        <w:t>bug</w:t>
-      </w:r>
-    </w:p>
-    <w:p>
-      <w:pPr>
-        <w:pStyle w:val="a9"/>
-        <w:numPr>
-          <w:ilvl w:val="0"/>
-          <w:numId w:val="11"/>
-        </w:numPr>
-        <w:rPr>
-          <w:rFonts w:ascii="Times New Roman" w:eastAsia="宋体" w:hAnsi="Times New Roman" w:cs="Times New Roman"/>
-        </w:rPr>
-      </w:pPr>
-      <w:r>
-        <w:rPr>
-          <w:rFonts w:ascii="Times New Roman" w:eastAsia="宋体" w:hAnsi="Times New Roman" w:cs="Times New Roman" w:hint="eastAsia"/>
-        </w:rPr>
-        <w:t>可以控制是否在单位属性窗口内显示真实血量或百分比血量，详见</w:t>
-      </w:r>
-      <w:r>
-        <w:rPr>
-          <w:rFonts w:ascii="Times New Roman" w:eastAsia="宋体" w:hAnsi="Times New Roman" w:cs="Times New Roman" w:hint="eastAsia"/>
-        </w:rPr>
-        <w:t>DisplayRealHPinTechnoDlg</w:t>
-      </w:r>
-    </w:p>
-    <w:p>
-      <w:pPr>
-        <w:pStyle w:val="a9"/>
-        <w:numPr>
-          <w:ilvl w:val="0"/>
-          <w:numId w:val="11"/>
-        </w:numPr>
-        <w:rPr>
-          <w:rFonts w:ascii="Times New Roman" w:eastAsia="宋体" w:hAnsi="Times New Roman" w:cs="Times New Roman"/>
-        </w:rPr>
-      </w:pPr>
-      <w:r>
-        <w:rPr>
-          <w:rFonts w:ascii="Times New Roman" w:eastAsia="宋体" w:hAnsi="Times New Roman" w:cs="Times New Roman"/>
-        </w:rPr>
-        <w:t>L</w:t>
-      </w:r>
-      <w:r>
-        <w:rPr>
-          <w:rFonts w:ascii="Times New Roman" w:eastAsia="宋体" w:hAnsi="Times New Roman" w:cs="Times New Roman" w:hint="eastAsia"/>
-        </w:rPr>
-        <w:t>ua</w:t>
-      </w:r>
-      <w:r>
-        <w:rPr>
-          <w:rFonts w:ascii="Times New Roman" w:eastAsia="宋体" w:hAnsi="Times New Roman" w:cs="Times New Roman" w:hint="eastAsia"/>
-        </w:rPr>
-        <w:t>脚本新增打开、保存地图函数</w:t>
-      </w:r>
-    </w:p>
-    <w:p>
-      <w:pPr>
-        <w:pStyle w:val="a9"/>
-        <w:numPr>
-          <w:ilvl w:val="0"/>
-          <w:numId w:val="11"/>
-        </w:numPr>
-        <w:rPr>
-          <w:rFonts w:ascii="Times New Roman" w:eastAsia="宋体" w:hAnsi="Times New Roman" w:cs="Times New Roman"/>
-        </w:rPr>
-      </w:pPr>
-      <w:r>
-        <w:rPr>
-          <w:rFonts w:ascii="Times New Roman" w:eastAsia="宋体" w:hAnsi="Times New Roman" w:cs="Times New Roman" w:hint="eastAsia"/>
-        </w:rPr>
-        <w:t>可以在触发编辑器</w:t>
-      </w:r>
-      <w:r>
-        <w:rPr>
-          <w:rFonts w:ascii="Times New Roman" w:eastAsia="宋体" w:hAnsi="Times New Roman" w:cs="Times New Roman" w:hint="eastAsia"/>
-        </w:rPr>
-        <w:t>、脚本编辑器</w:t>
-      </w:r>
-      <w:r>
-        <w:rPr>
-          <w:rFonts w:ascii="Times New Roman" w:eastAsia="宋体" w:hAnsi="Times New Roman" w:cs="Times New Roman" w:hint="eastAsia"/>
-        </w:rPr>
-        <w:t>中预览音效、</w:t>
-      </w:r>
-      <w:r>
-        <w:rPr>
-          <w:rFonts w:ascii="Times New Roman" w:eastAsia="宋体" w:hAnsi="Times New Roman" w:cs="Times New Roman" w:hint="eastAsia"/>
-        </w:rPr>
-        <w:t>EVA</w:t>
-      </w:r>
-      <w:r>
-        <w:rPr>
-          <w:rFonts w:ascii="Times New Roman" w:eastAsia="宋体" w:hAnsi="Times New Roman" w:cs="Times New Roman" w:hint="eastAsia"/>
-        </w:rPr>
-        <w:t>、背景音乐</w:t>
-      </w:r>
-      <w:r>
-        <w:rPr>
-          <w:rFonts w:ascii="Times New Roman" w:eastAsia="宋体" w:hAnsi="Times New Roman" w:cs="Times New Roman" w:hint="eastAsia"/>
-        </w:rPr>
-        <w:t>、动画</w:t>
-      </w:r>
-    </w:p>
-    <w:p>
-      <w:pPr>
-        <w:pStyle w:val="a9"/>
-        <w:numPr>
-          <w:ilvl w:val="0"/>
-          <w:numId w:val="11"/>
-        </w:numPr>
-        <w:rPr>
-          <w:rFonts w:ascii="Times New Roman" w:eastAsia="宋体" w:hAnsi="Times New Roman" w:cs="Times New Roman"/>
-        </w:rPr>
-      </w:pPr>
-      <w:r>
-        <w:rPr>
-          <w:rFonts w:ascii="Times New Roman" w:eastAsia="宋体" w:hAnsi="Times New Roman" w:cs="Times New Roman" w:hint="eastAsia"/>
-        </w:rPr>
-        <w:t>物品浏览器新增右键菜单，可以展开</w:t>
-      </w:r>
-      <w:r>
-        <w:rPr>
-          <w:rFonts w:ascii="Times New Roman" w:eastAsia="宋体" w:hAnsi="Times New Roman" w:cs="Times New Roman" w:hint="eastAsia"/>
-        </w:rPr>
-        <w:t>/</w:t>
-      </w:r>
-      <w:r>
-        <w:rPr>
-          <w:rFonts w:ascii="Times New Roman" w:eastAsia="宋体" w:hAnsi="Times New Roman" w:cs="Times New Roman" w:hint="eastAsia"/>
-        </w:rPr>
-        <w:t>收起全部节点，或滚动到最上或最下</w:t>
-      </w:r>
-    </w:p>
-    <w:p>
-      <w:pPr>
-        <w:pStyle w:val="a9"/>
-        <w:numPr>
-          <w:ilvl w:val="0"/>
-          <w:numId w:val="11"/>
-        </w:numPr>
-        <w:rPr>
-          <w:rFonts w:ascii="Times New Roman" w:eastAsia="宋体" w:hAnsi="Times New Roman" w:cs="Times New Roman"/>
-        </w:rPr>
-      </w:pPr>
-      <w:r>
-        <w:rPr>
-          <w:rFonts w:ascii="Times New Roman" w:eastAsia="宋体" w:hAnsi="Times New Roman" w:cs="Times New Roman" w:hint="eastAsia"/>
-        </w:rPr>
-        <w:t>作战小队编辑器的小队出现于和运输机起始路径点可以跳转</w:t>
-      </w:r>
-    </w:p>
-    <w:p>
-      <w:pPr>
-        <w:pStyle w:val="a9"/>
-        <w:numPr>
-          <w:ilvl w:val="0"/>
-          <w:numId w:val="11"/>
-        </w:numPr>
-        <w:rPr>
-          <w:rFonts w:ascii="Times New Roman" w:eastAsia="宋体" w:hAnsi="Times New Roman" w:cs="Times New Roman"/>
-        </w:rPr>
-      </w:pPr>
-      <w:r>
-        <w:rPr>
-          <w:rFonts w:ascii="Times New Roman" w:eastAsia="宋体" w:hAnsi="Times New Roman" w:cs="Times New Roman" w:hint="eastAsia"/>
-        </w:rPr>
-        <w:t>自动保存地图时维持已有缩略图</w:t>
-      </w:r>
-      <w:r>
-        <w:rPr>
-          <w:rFonts w:ascii="Times New Roman" w:eastAsia="宋体" w:hAnsi="Times New Roman" w:cs="Times New Roman" w:hint="eastAsia"/>
-        </w:rPr>
-        <w:t>，而不是清空缩略图</w:t>
-      </w:r>
-    </w:p>
-    <w:p>
-      <w:pPr>
-        <w:pStyle w:val="a9"/>
-        <w:numPr>
-          <w:ilvl w:val="0"/>
-          <w:numId w:val="11"/>
-        </w:numPr>
-        <w:rPr>
-          <w:rFonts w:ascii="Times New Roman" w:eastAsia="宋体" w:hAnsi="Times New Roman" w:cs="Times New Roman"/>
-        </w:rPr>
-      </w:pPr>
-      <w:r>
-        <w:rPr>
-          <w:rFonts w:ascii="Times New Roman" w:eastAsia="宋体" w:hAnsi="Times New Roman" w:cs="Times New Roman" w:hint="eastAsia"/>
-        </w:rPr>
-        <w:t>优化顶点高度工具在不可抬升地形边缘使用时的表现</w:t>
-      </w:r>
-    </w:p>
-    <w:p>
-      <w:pPr>
-        <w:pStyle w:val="a9"/>
-        <w:numPr>
-          <w:ilvl w:val="0"/>
-          <w:numId w:val="11"/>
-        </w:numPr>
-        <w:rPr>
-          <w:rFonts w:ascii="Times New Roman" w:eastAsia="宋体" w:hAnsi="Times New Roman" w:cs="Times New Roman"/>
-        </w:rPr>
-      </w:pPr>
-      <w:r>
-        <w:rPr>
-          <w:rFonts w:ascii="Times New Roman" w:eastAsia="宋体" w:hAnsi="Times New Roman" w:cs="Times New Roman" w:hint="eastAsia"/>
-        </w:rPr>
-        <w:t>多选模式新增反选功能</w:t>
-      </w:r>
-    </w:p>
-    <w:p>
-      <w:pPr>
-        <w:pStyle w:val="a9"/>
-        <w:numPr>
-          <w:ilvl w:val="0"/>
-          <w:numId w:val="11"/>
-        </w:numPr>
-        <w:rPr>
-          <w:rFonts w:ascii="Times New Roman" w:eastAsia="宋体" w:hAnsi="Times New Roman" w:cs="Times New Roman"/>
-        </w:rPr>
-      </w:pPr>
-      <w:r>
-        <w:rPr>
-          <w:rFonts w:ascii="Times New Roman" w:eastAsia="宋体" w:hAnsi="Times New Roman" w:cs="Times New Roman" w:hint="eastAsia"/>
-        </w:rPr>
-        <w:t>修复渲染地图时会把隐形断桥显示出来的</w:t>
-      </w:r>
-      <w:r>
-        <w:rPr>
-          <w:rFonts w:ascii="Times New Roman" w:eastAsia="宋体" w:hAnsi="Times New Roman" w:cs="Times New Roman" w:hint="eastAsia"/>
-        </w:rPr>
-        <w:t>bug</w:t>
-      </w:r>
-    </w:p>
-    <w:p>
-      <w:pPr>
-        <w:pStyle w:val="a9"/>
-        <w:numPr>
-          <w:ilvl w:val="0"/>
-          <w:numId w:val="11"/>
-        </w:numPr>
-        <w:rPr>
-          <w:rFonts w:ascii="Times New Roman" w:eastAsia="宋体" w:hAnsi="Times New Roman" w:cs="Times New Roman"/>
-        </w:rPr>
-      </w:pPr>
-      <w:r>
-        <w:rPr>
-          <w:rFonts w:ascii="Times New Roman" w:eastAsia="宋体" w:hAnsi="Times New Roman" w:cs="Times New Roman" w:hint="eastAsia"/>
-        </w:rPr>
-        <w:t>修复斜坡工具在地图边缘部分情况下无法正确</w:t>
-      </w:r>
-      <w:r>
-        <w:rPr>
-          <w:rFonts w:ascii="Times New Roman" w:eastAsia="宋体" w:hAnsi="Times New Roman" w:cs="Times New Roman" w:hint="eastAsia"/>
-        </w:rPr>
-        <w:t>应用</w:t>
-      </w:r>
-      <w:r>
-        <w:rPr>
-          <w:rFonts w:ascii="Times New Roman" w:eastAsia="宋体" w:hAnsi="Times New Roman" w:cs="Times New Roman" w:hint="eastAsia"/>
-        </w:rPr>
-        <w:t>的</w:t>
-      </w:r>
-      <w:r>
-        <w:rPr>
-          <w:rFonts w:ascii="Times New Roman" w:eastAsia="宋体" w:hAnsi="Times New Roman" w:cs="Times New Roman" w:hint="eastAsia"/>
-        </w:rPr>
-        <w:t>bug</w:t>
-      </w:r>
-    </w:p>
-    <w:p>
-      <w:pPr>
-        <w:pStyle w:val="a9"/>
-        <w:numPr>
-          <w:ilvl w:val="0"/>
-          <w:numId w:val="11"/>
-        </w:numPr>
-        <w:rPr>
-          <w:rFonts w:ascii="Times New Roman" w:eastAsia="宋体" w:hAnsi="Times New Roman" w:cs="Times New Roman"/>
-        </w:rPr>
-      </w:pPr>
-      <w:r>
-        <w:rPr>
-          <w:rFonts w:ascii="Times New Roman" w:eastAsia="宋体" w:hAnsi="Times New Roman" w:cs="Times New Roman" w:hint="eastAsia"/>
-        </w:rPr>
-        <w:t>在摆放单位的时候，滚动鼠标滚轮调整方向</w:t>
-      </w:r>
-      <w:r>
-        <w:rPr>
-          <w:rFonts w:ascii="Times New Roman" w:eastAsia="宋体" w:hAnsi="Times New Roman" w:cs="Times New Roman" w:hint="eastAsia"/>
-        </w:rPr>
-        <w:t>，且可以控制滚动为</w:t>
-      </w:r>
-      <w:r>
-        <w:rPr>
-          <w:rFonts w:ascii="Times New Roman" w:eastAsia="宋体" w:hAnsi="Times New Roman" w:cs="Times New Roman" w:hint="eastAsia"/>
-        </w:rPr>
-        <w:t>8</w:t>
-      </w:r>
-      <w:r>
-        <w:rPr>
-          <w:rFonts w:ascii="Times New Roman" w:eastAsia="宋体" w:hAnsi="Times New Roman" w:cs="Times New Roman" w:hint="eastAsia"/>
-        </w:rPr>
-        <w:t>向或</w:t>
-      </w:r>
-      <w:r>
-        <w:rPr>
-          <w:rFonts w:ascii="Times New Roman" w:eastAsia="宋体" w:hAnsi="Times New Roman" w:cs="Times New Roman" w:hint="eastAsia"/>
-        </w:rPr>
-        <w:t>32</w:t>
-      </w:r>
-      <w:r>
-        <w:rPr>
-          <w:rFonts w:ascii="Times New Roman" w:eastAsia="宋体" w:hAnsi="Times New Roman" w:cs="Times New Roman" w:hint="eastAsia"/>
-        </w:rPr>
-        <w:t>向，详见</w:t>
-      </w:r>
-      <w:r>
-        <w:rPr>
-          <w:rFonts w:ascii="Times New Roman" w:eastAsia="宋体" w:hAnsi="Times New Roman" w:cs="Times New Roman" w:hint="eastAsia"/>
-        </w:rPr>
-        <w:t>ExtFacings.Scroll</w:t>
-      </w:r>
-    </w:p>
-    <w:p>
-      <w:pPr>
-        <w:pStyle w:val="a9"/>
-        <w:numPr>
-          <w:ilvl w:val="0"/>
-          <w:numId w:val="11"/>
-        </w:numPr>
-        <w:rPr>
-          <w:rFonts w:ascii="Times New Roman" w:eastAsia="宋体" w:hAnsi="Times New Roman" w:cs="Times New Roman"/>
-        </w:rPr>
-      </w:pPr>
-      <w:r>
-        <w:rPr>
-          <w:rFonts w:ascii="Times New Roman" w:eastAsia="宋体" w:hAnsi="Times New Roman" w:cs="Times New Roman" w:hint="eastAsia"/>
-        </w:rPr>
-        <w:t>支持自定义额外的资源目录，详见</w:t>
-      </w:r>
-      <w:r>
-        <w:rPr>
-          <w:rFonts w:ascii="Times New Roman" w:eastAsia="宋体" w:hAnsi="Times New Roman" w:cs="Times New Roman" w:hint="eastAsia"/>
-        </w:rPr>
-        <w:t>[</w:t>
-      </w:r>
-      <w:r>
-        <w:rPr>
-          <w:rFonts w:ascii="Times New Roman" w:eastAsia="宋体" w:hAnsi="Times New Roman" w:cs="Times New Roman" w:hint="eastAsia"/>
-        </w:rPr>
-        <w:t>ExtraDirectories</w:t>
-      </w:r>
-      <w:r>
-        <w:rPr>
-          <w:rFonts w:ascii="Times New Roman" w:eastAsia="宋体" w:hAnsi="Times New Roman" w:cs="Times New Roman" w:hint="eastAsia"/>
-        </w:rPr>
-        <w:t>]</w:t>
-      </w:r>
-    </w:p>
-    <w:p>
-      <w:pPr>
-        <w:pStyle w:val="a9"/>
-        <w:numPr>
-          <w:ilvl w:val="0"/>
-          <w:numId w:val="10"/>
-        </w:numPr>
-        <w:rPr>
-          <w:rFonts w:ascii="Times New Roman" w:eastAsia="宋体" w:hAnsi="Times New Roman" w:cs="Times New Roman"/>
+        <w:t>2</w:t>
+      </w:r>
+      <w:r>
+        <w:rPr>
+          <w:rFonts w:ascii="Times New Roman" w:eastAsia="宋体" w:hAnsi="Times New Roman" w:cs="Times New Roman" w:hint="eastAsia"/>
           <w:b/>
           <w:bCs/>
           <w:sz w:val="28"/>
           <w:szCs w:val="32"/>
         </w:rPr>
-      </w:pPr>
-      <w:r>
-        <w:rPr>
-          <w:rFonts w:ascii="Times New Roman" w:eastAsia="宋体" w:hAnsi="Times New Roman" w:cs="Times New Roman" w:hint="eastAsia"/>
+        <w:t>)</w:t>
+      </w:r>
+    </w:p>
+    <w:p>
+      <w:pPr>
+        <w:pStyle w:val="a9"/>
+        <w:numPr>
+          <w:ilvl w:val="0"/>
+          <w:numId w:val="11"/>
+        </w:numPr>
+        <w:rPr>
+          <w:rFonts w:ascii="Times New Roman" w:eastAsia="宋体" w:hAnsi="Times New Roman" w:cs="Times New Roman"/>
+        </w:rPr>
+      </w:pPr>
+      <w:r>
+        <w:rPr>
+          <w:rFonts w:ascii="Times New Roman" w:eastAsia="宋体" w:hAnsi="Times New Roman" w:cs="Times New Roman" w:hint="eastAsia"/>
+        </w:rPr>
+        <w:t>修复单人游戏设置</w:t>
+      </w:r>
+      <w:r>
+        <w:rPr>
+          <w:rFonts w:ascii="Times New Roman" w:eastAsia="宋体" w:hAnsi="Times New Roman" w:cs="Times New Roman" w:hint="eastAsia"/>
+        </w:rPr>
+        <w:t>-&gt;</w:t>
+      </w:r>
+      <w:r>
+        <w:rPr>
+          <w:rFonts w:ascii="Times New Roman" w:eastAsia="宋体" w:hAnsi="Times New Roman" w:cs="Times New Roman" w:hint="eastAsia"/>
+        </w:rPr>
+        <w:t>幻影伪装树木窗口关闭时的崩溃</w:t>
+      </w:r>
+    </w:p>
+    <w:p>
+      <w:pPr>
+        <w:pStyle w:val="a9"/>
+        <w:numPr>
+          <w:ilvl w:val="0"/>
+          <w:numId w:val="11"/>
+        </w:numPr>
+        <w:rPr>
+          <w:rFonts w:ascii="Times New Roman" w:eastAsia="宋体" w:hAnsi="Times New Roman" w:cs="Times New Roman"/>
+        </w:rPr>
+      </w:pPr>
+      <w:r>
+        <w:rPr>
+          <w:rFonts w:ascii="Times New Roman" w:eastAsia="宋体" w:hAnsi="Times New Roman" w:cs="Times New Roman" w:hint="eastAsia"/>
+        </w:rPr>
+        <w:t>触发编辑器的局部变量参数可以跳转</w:t>
+      </w:r>
+    </w:p>
+    <w:p>
+      <w:pPr>
+        <w:pStyle w:val="a9"/>
+        <w:numPr>
+          <w:ilvl w:val="0"/>
+          <w:numId w:val="11"/>
+        </w:numPr>
+        <w:rPr>
+          <w:rFonts w:ascii="Times New Roman" w:eastAsia="宋体" w:hAnsi="Times New Roman" w:cs="Times New Roman"/>
+        </w:rPr>
+      </w:pPr>
+      <w:r>
+        <w:rPr>
+          <w:rFonts w:ascii="Times New Roman" w:eastAsia="宋体" w:hAnsi="Times New Roman" w:cs="Times New Roman" w:hint="eastAsia"/>
+        </w:rPr>
+        <w:t>修复单位属性窗口的血量调节会产生累计误差的</w:t>
+      </w:r>
+      <w:r>
+        <w:rPr>
+          <w:rFonts w:ascii="Times New Roman" w:eastAsia="宋体" w:hAnsi="Times New Roman" w:cs="Times New Roman" w:hint="eastAsia"/>
+        </w:rPr>
+        <w:t>bug</w:t>
+      </w:r>
+    </w:p>
+    <w:p>
+      <w:pPr>
+        <w:pStyle w:val="a9"/>
+        <w:numPr>
+          <w:ilvl w:val="0"/>
+          <w:numId w:val="11"/>
+        </w:numPr>
+        <w:rPr>
+          <w:rFonts w:ascii="Times New Roman" w:eastAsia="宋体" w:hAnsi="Times New Roman" w:cs="Times New Roman"/>
+        </w:rPr>
+      </w:pPr>
+      <w:r>
+        <w:rPr>
+          <w:rFonts w:ascii="Times New Roman" w:eastAsia="宋体" w:hAnsi="Times New Roman" w:cs="Times New Roman" w:hint="eastAsia"/>
+        </w:rPr>
+        <w:t>可以控制是否在单位属性窗口内显示真实血量或百分比血量，详见</w:t>
+      </w:r>
+      <w:r>
+        <w:rPr>
+          <w:rFonts w:ascii="Times New Roman" w:eastAsia="宋体" w:hAnsi="Times New Roman" w:cs="Times New Roman" w:hint="eastAsia"/>
+        </w:rPr>
+        <w:t>DisplayRealHPinTechnoDlg</w:t>
+      </w:r>
+    </w:p>
+    <w:p>
+      <w:pPr>
+        <w:pStyle w:val="a9"/>
+        <w:numPr>
+          <w:ilvl w:val="0"/>
+          <w:numId w:val="11"/>
+        </w:numPr>
+        <w:rPr>
+          <w:rFonts w:ascii="Times New Roman" w:eastAsia="宋体" w:hAnsi="Times New Roman" w:cs="Times New Roman"/>
+        </w:rPr>
+      </w:pPr>
+      <w:r>
+        <w:rPr>
+          <w:rFonts w:ascii="Times New Roman" w:eastAsia="宋体" w:hAnsi="Times New Roman" w:cs="Times New Roman"/>
+        </w:rPr>
+        <w:t>L</w:t>
+      </w:r>
+      <w:r>
+        <w:rPr>
+          <w:rFonts w:ascii="Times New Roman" w:eastAsia="宋体" w:hAnsi="Times New Roman" w:cs="Times New Roman" w:hint="eastAsia"/>
+        </w:rPr>
+        <w:t>ua</w:t>
+      </w:r>
+      <w:r>
+        <w:rPr>
+          <w:rFonts w:ascii="Times New Roman" w:eastAsia="宋体" w:hAnsi="Times New Roman" w:cs="Times New Roman" w:hint="eastAsia"/>
+        </w:rPr>
+        <w:t>脚本新增打开、保存地图函数</w:t>
+      </w:r>
+    </w:p>
+    <w:p>
+      <w:pPr>
+        <w:pStyle w:val="a9"/>
+        <w:numPr>
+          <w:ilvl w:val="0"/>
+          <w:numId w:val="11"/>
+        </w:numPr>
+        <w:rPr>
+          <w:rFonts w:ascii="Times New Roman" w:eastAsia="宋体" w:hAnsi="Times New Roman" w:cs="Times New Roman"/>
+        </w:rPr>
+      </w:pPr>
+      <w:r>
+        <w:rPr>
+          <w:rFonts w:ascii="Times New Roman" w:eastAsia="宋体" w:hAnsi="Times New Roman" w:cs="Times New Roman" w:hint="eastAsia"/>
+        </w:rPr>
+        <w:t>可以在触发编辑器</w:t>
+      </w:r>
+      <w:r>
+        <w:rPr>
+          <w:rFonts w:ascii="Times New Roman" w:eastAsia="宋体" w:hAnsi="Times New Roman" w:cs="Times New Roman" w:hint="eastAsia"/>
+        </w:rPr>
+        <w:t>、脚本编辑器</w:t>
+      </w:r>
+      <w:r>
+        <w:rPr>
+          <w:rFonts w:ascii="Times New Roman" w:eastAsia="宋体" w:hAnsi="Times New Roman" w:cs="Times New Roman" w:hint="eastAsia"/>
+        </w:rPr>
+        <w:t>中预览音效、</w:t>
+      </w:r>
+      <w:r>
+        <w:rPr>
+          <w:rFonts w:ascii="Times New Roman" w:eastAsia="宋体" w:hAnsi="Times New Roman" w:cs="Times New Roman" w:hint="eastAsia"/>
+        </w:rPr>
+        <w:t>EVA</w:t>
+      </w:r>
+      <w:r>
+        <w:rPr>
+          <w:rFonts w:ascii="Times New Roman" w:eastAsia="宋体" w:hAnsi="Times New Roman" w:cs="Times New Roman" w:hint="eastAsia"/>
+        </w:rPr>
+        <w:t>、背景音乐</w:t>
+      </w:r>
+      <w:r>
+        <w:rPr>
+          <w:rFonts w:ascii="Times New Roman" w:eastAsia="宋体" w:hAnsi="Times New Roman" w:cs="Times New Roman" w:hint="eastAsia"/>
+        </w:rPr>
+        <w:t>、动画</w:t>
+      </w:r>
+    </w:p>
+    <w:p>
+      <w:pPr>
+        <w:pStyle w:val="a9"/>
+        <w:numPr>
+          <w:ilvl w:val="0"/>
+          <w:numId w:val="11"/>
+        </w:numPr>
+        <w:rPr>
+          <w:rFonts w:ascii="Times New Roman" w:eastAsia="宋体" w:hAnsi="Times New Roman" w:cs="Times New Roman"/>
+        </w:rPr>
+      </w:pPr>
+      <w:r>
+        <w:rPr>
+          <w:rFonts w:ascii="Times New Roman" w:eastAsia="宋体" w:hAnsi="Times New Roman" w:cs="Times New Roman" w:hint="eastAsia"/>
+        </w:rPr>
+        <w:t>物品浏览器新增右键菜单，可以展开</w:t>
+      </w:r>
+      <w:r>
+        <w:rPr>
+          <w:rFonts w:ascii="Times New Roman" w:eastAsia="宋体" w:hAnsi="Times New Roman" w:cs="Times New Roman" w:hint="eastAsia"/>
+        </w:rPr>
+        <w:t>/</w:t>
+      </w:r>
+      <w:r>
+        <w:rPr>
+          <w:rFonts w:ascii="Times New Roman" w:eastAsia="宋体" w:hAnsi="Times New Roman" w:cs="Times New Roman" w:hint="eastAsia"/>
+        </w:rPr>
+        <w:t>收起全部节点，或滚动到最上或最下</w:t>
+      </w:r>
+    </w:p>
+    <w:p>
+      <w:pPr>
+        <w:pStyle w:val="a9"/>
+        <w:numPr>
+          <w:ilvl w:val="0"/>
+          <w:numId w:val="11"/>
+        </w:numPr>
+        <w:rPr>
+          <w:rFonts w:ascii="Times New Roman" w:eastAsia="宋体" w:hAnsi="Times New Roman" w:cs="Times New Roman"/>
+        </w:rPr>
+      </w:pPr>
+      <w:r>
+        <w:rPr>
+          <w:rFonts w:ascii="Times New Roman" w:eastAsia="宋体" w:hAnsi="Times New Roman" w:cs="Times New Roman" w:hint="eastAsia"/>
+        </w:rPr>
+        <w:t>作战小队编辑器的小队出现于和运输机起始路径点可以跳转</w:t>
+      </w:r>
+    </w:p>
+    <w:p>
+      <w:pPr>
+        <w:pStyle w:val="a9"/>
+        <w:numPr>
+          <w:ilvl w:val="0"/>
+          <w:numId w:val="11"/>
+        </w:numPr>
+        <w:rPr>
+          <w:rFonts w:ascii="Times New Roman" w:eastAsia="宋体" w:hAnsi="Times New Roman" w:cs="Times New Roman"/>
+        </w:rPr>
+      </w:pPr>
+      <w:r>
+        <w:rPr>
+          <w:rFonts w:ascii="Times New Roman" w:eastAsia="宋体" w:hAnsi="Times New Roman" w:cs="Times New Roman" w:hint="eastAsia"/>
+        </w:rPr>
+        <w:t>自动保存地图时维持已有缩略图</w:t>
+      </w:r>
+      <w:r>
+        <w:rPr>
+          <w:rFonts w:ascii="Times New Roman" w:eastAsia="宋体" w:hAnsi="Times New Roman" w:cs="Times New Roman" w:hint="eastAsia"/>
+        </w:rPr>
+        <w:t>，而不是清空缩略图</w:t>
+      </w:r>
+    </w:p>
+    <w:p>
+      <w:pPr>
+        <w:pStyle w:val="a9"/>
+        <w:numPr>
+          <w:ilvl w:val="0"/>
+          <w:numId w:val="11"/>
+        </w:numPr>
+        <w:rPr>
+          <w:rFonts w:ascii="Times New Roman" w:eastAsia="宋体" w:hAnsi="Times New Roman" w:cs="Times New Roman"/>
+        </w:rPr>
+      </w:pPr>
+      <w:r>
+        <w:rPr>
+          <w:rFonts w:ascii="Times New Roman" w:eastAsia="宋体" w:hAnsi="Times New Roman" w:cs="Times New Roman" w:hint="eastAsia"/>
+        </w:rPr>
+        <w:t>优化顶点高度工具在不可抬升地形边缘使用时的表现</w:t>
+      </w:r>
+    </w:p>
+    <w:p>
+      <w:pPr>
+        <w:pStyle w:val="a9"/>
+        <w:numPr>
+          <w:ilvl w:val="0"/>
+          <w:numId w:val="11"/>
+        </w:numPr>
+        <w:rPr>
+          <w:rFonts w:ascii="Times New Roman" w:eastAsia="宋体" w:hAnsi="Times New Roman" w:cs="Times New Roman"/>
+        </w:rPr>
+      </w:pPr>
+      <w:r>
+        <w:rPr>
+          <w:rFonts w:ascii="Times New Roman" w:eastAsia="宋体" w:hAnsi="Times New Roman" w:cs="Times New Roman" w:hint="eastAsia"/>
+        </w:rPr>
+        <w:t>多选模式新增反选功能</w:t>
+      </w:r>
+    </w:p>
+    <w:p>
+      <w:pPr>
+        <w:pStyle w:val="a9"/>
+        <w:numPr>
+          <w:ilvl w:val="0"/>
+          <w:numId w:val="11"/>
+        </w:numPr>
+        <w:rPr>
+          <w:rFonts w:ascii="Times New Roman" w:eastAsia="宋体" w:hAnsi="Times New Roman" w:cs="Times New Roman"/>
+        </w:rPr>
+      </w:pPr>
+      <w:r>
+        <w:rPr>
+          <w:rFonts w:ascii="Times New Roman" w:eastAsia="宋体" w:hAnsi="Times New Roman" w:cs="Times New Roman" w:hint="eastAsia"/>
+        </w:rPr>
+        <w:t>修复渲染地图时会把隐形断桥显示出来的</w:t>
+      </w:r>
+      <w:r>
+        <w:rPr>
+          <w:rFonts w:ascii="Times New Roman" w:eastAsia="宋体" w:hAnsi="Times New Roman" w:cs="Times New Roman" w:hint="eastAsia"/>
+        </w:rPr>
+        <w:t>bug</w:t>
+      </w:r>
+    </w:p>
+    <w:p>
+      <w:pPr>
+        <w:pStyle w:val="a9"/>
+        <w:numPr>
+          <w:ilvl w:val="0"/>
+          <w:numId w:val="11"/>
+        </w:numPr>
+        <w:rPr>
+          <w:rFonts w:ascii="Times New Roman" w:eastAsia="宋体" w:hAnsi="Times New Roman" w:cs="Times New Roman"/>
+        </w:rPr>
+      </w:pPr>
+      <w:r>
+        <w:rPr>
+          <w:rFonts w:ascii="Times New Roman" w:eastAsia="宋体" w:hAnsi="Times New Roman" w:cs="Times New Roman" w:hint="eastAsia"/>
+        </w:rPr>
+        <w:t>修复斜坡工具在地图边缘部分情况下无法正确</w:t>
+      </w:r>
+      <w:r>
+        <w:rPr>
+          <w:rFonts w:ascii="Times New Roman" w:eastAsia="宋体" w:hAnsi="Times New Roman" w:cs="Times New Roman" w:hint="eastAsia"/>
+        </w:rPr>
+        <w:t>应用</w:t>
+      </w:r>
+      <w:r>
+        <w:rPr>
+          <w:rFonts w:ascii="Times New Roman" w:eastAsia="宋体" w:hAnsi="Times New Roman" w:cs="Times New Roman" w:hint="eastAsia"/>
+        </w:rPr>
+        <w:t>的</w:t>
+      </w:r>
+      <w:r>
+        <w:rPr>
+          <w:rFonts w:ascii="Times New Roman" w:eastAsia="宋体" w:hAnsi="Times New Roman" w:cs="Times New Roman" w:hint="eastAsia"/>
+        </w:rPr>
+        <w:t>bug</w:t>
+      </w:r>
+    </w:p>
+    <w:p>
+      <w:pPr>
+        <w:pStyle w:val="a9"/>
+        <w:numPr>
+          <w:ilvl w:val="0"/>
+          <w:numId w:val="11"/>
+        </w:numPr>
+        <w:rPr>
+          <w:rFonts w:ascii="Times New Roman" w:eastAsia="宋体" w:hAnsi="Times New Roman" w:cs="Times New Roman"/>
+        </w:rPr>
+      </w:pPr>
+      <w:r>
+        <w:rPr>
+          <w:rFonts w:ascii="Times New Roman" w:eastAsia="宋体" w:hAnsi="Times New Roman" w:cs="Times New Roman" w:hint="eastAsia"/>
+        </w:rPr>
+        <w:t>在摆放单位的时候，滚动鼠标滚轮调整方向</w:t>
+      </w:r>
+      <w:r>
+        <w:rPr>
+          <w:rFonts w:ascii="Times New Roman" w:eastAsia="宋体" w:hAnsi="Times New Roman" w:cs="Times New Roman" w:hint="eastAsia"/>
+        </w:rPr>
+        <w:t>，且可以控制滚动为</w:t>
+      </w:r>
+      <w:r>
+        <w:rPr>
+          <w:rFonts w:ascii="Times New Roman" w:eastAsia="宋体" w:hAnsi="Times New Roman" w:cs="Times New Roman" w:hint="eastAsia"/>
+        </w:rPr>
+        <w:t>8</w:t>
+      </w:r>
+      <w:r>
+        <w:rPr>
+          <w:rFonts w:ascii="Times New Roman" w:eastAsia="宋体" w:hAnsi="Times New Roman" w:cs="Times New Roman" w:hint="eastAsia"/>
+        </w:rPr>
+        <w:t>向或</w:t>
+      </w:r>
+      <w:r>
+        <w:rPr>
+          <w:rFonts w:ascii="Times New Roman" w:eastAsia="宋体" w:hAnsi="Times New Roman" w:cs="Times New Roman" w:hint="eastAsia"/>
+        </w:rPr>
+        <w:t>32</w:t>
+      </w:r>
+      <w:r>
+        <w:rPr>
+          <w:rFonts w:ascii="Times New Roman" w:eastAsia="宋体" w:hAnsi="Times New Roman" w:cs="Times New Roman" w:hint="eastAsia"/>
+        </w:rPr>
+        <w:t>向，详见</w:t>
+      </w:r>
+      <w:r>
+        <w:rPr>
+          <w:rFonts w:ascii="Times New Roman" w:eastAsia="宋体" w:hAnsi="Times New Roman" w:cs="Times New Roman" w:hint="eastAsia"/>
+        </w:rPr>
+        <w:t>ExtFacings.Scroll</w:t>
+      </w:r>
+    </w:p>
+    <w:p>
+      <w:pPr>
+        <w:pStyle w:val="a9"/>
+        <w:numPr>
+          <w:ilvl w:val="0"/>
+          <w:numId w:val="11"/>
+        </w:numPr>
+        <w:rPr>
+          <w:rFonts w:ascii="Times New Roman" w:eastAsia="宋体" w:hAnsi="Times New Roman" w:cs="Times New Roman"/>
+        </w:rPr>
+      </w:pPr>
+      <w:r>
+        <w:rPr>
+          <w:rFonts w:ascii="Times New Roman" w:eastAsia="宋体" w:hAnsi="Times New Roman" w:cs="Times New Roman" w:hint="eastAsia"/>
+        </w:rPr>
+        <w:t>支持自定义额外的资源目录，详见</w:t>
+      </w:r>
+      <w:r>
+        <w:rPr>
+          <w:rFonts w:ascii="Times New Roman" w:eastAsia="宋体" w:hAnsi="Times New Roman" w:cs="Times New Roman" w:hint="eastAsia"/>
+        </w:rPr>
+        <w:t>[</w:t>
+      </w:r>
+      <w:r>
+        <w:rPr>
+          <w:rFonts w:ascii="Times New Roman" w:eastAsia="宋体" w:hAnsi="Times New Roman" w:cs="Times New Roman" w:hint="eastAsia"/>
+        </w:rPr>
+        <w:t>ExtraDirectories</w:t>
+      </w:r>
+      <w:r>
+        <w:rPr>
+          <w:rFonts w:ascii="Times New Roman" w:eastAsia="宋体" w:hAnsi="Times New Roman" w:cs="Times New Roman" w:hint="eastAsia"/>
+        </w:rPr>
+        <w:t>]</w:t>
+      </w:r>
+    </w:p>
+    <w:p>
+      <w:pPr>
+        <w:pStyle w:val="a9"/>
+        <w:numPr>
+          <w:ilvl w:val="0"/>
+          <w:numId w:val="11"/>
+        </w:numPr>
+        <w:rPr>
+          <w:rFonts w:ascii="Times New Roman" w:eastAsia="宋体" w:hAnsi="Times New Roman" w:cs="Times New Roman"/>
+        </w:rPr>
+      </w:pPr>
+      <w:r>
+        <w:rPr>
+          <w:rFonts w:ascii="Times New Roman" w:eastAsia="宋体" w:hAnsi="Times New Roman" w:cs="Times New Roman" w:hint="eastAsia"/>
+        </w:rPr>
+        <w:t>修复修改建筑</w:t>
+      </w:r>
+      <w:r>
+        <w:rPr>
+          <w:rFonts w:ascii="Times New Roman" w:eastAsia="宋体" w:hAnsi="Times New Roman" w:cs="Times New Roman" w:hint="eastAsia"/>
+        </w:rPr>
+        <w:t>Image</w:t>
+      </w:r>
+      <w:r>
+        <w:rPr>
+          <w:rFonts w:ascii="Times New Roman" w:eastAsia="宋体" w:hAnsi="Times New Roman" w:cs="Times New Roman" w:hint="eastAsia"/>
+        </w:rPr>
+        <w:t>会导致显示错误的</w:t>
+      </w:r>
+      <w:r>
+        <w:rPr>
+          <w:rFonts w:ascii="Times New Roman" w:eastAsia="宋体" w:hAnsi="Times New Roman" w:cs="Times New Roman" w:hint="eastAsia"/>
+        </w:rPr>
+        <w:t>bug</w:t>
+      </w:r>
+    </w:p>
+    <w:p>
+      <w:pPr>
+        <w:pStyle w:val="a9"/>
+        <w:numPr>
+          <w:ilvl w:val="0"/>
+          <w:numId w:val="10"/>
+        </w:numPr>
+        <w:rPr>
+          <w:rFonts w:ascii="Times New Roman" w:eastAsia="宋体" w:hAnsi="Times New Roman" w:cs="Times New Roman"/>
           <w:b/>
           <w:bCs/>
           <w:sz w:val="28"/>
           <w:szCs w:val="32"/>
         </w:rPr>
-        <w:t>1.5.2 (2026.0</w:t>
-      </w:r>
+      </w:pPr>
       <w:r>
         <w:rPr>
           <w:rFonts w:ascii="Times New Roman" w:eastAsia="宋体" w:hAnsi="Times New Roman" w:cs="Times New Roman" w:hint="eastAsia"/>
@@ -707,7 +750,7 @@
           <w:sz w:val="28"/>
           <w:szCs w:val="32"/>
         </w:rPr>
-        <w:t>9</w:t>
+        <w:t>1.5.2 (2026.0</w:t>
       </w:r>
       <w:r>
         <w:rPr>
@@ -717,7 +760,7 @@
           <w:sz w:val="28"/>
           <w:szCs w:val="32"/>
         </w:rPr>
-        <w:t>.</w:t>
+        <w:t>9</w:t>
       </w:r>
       <w:r>
         <w:rPr>
@@ -727,7 +770,7 @@
           <w:sz w:val="28"/>
           <w:szCs w:val="32"/>
         </w:rPr>
-        <w:t>02</w:t>
+        <w:t>.</w:t>
       </w:r>
       <w:r>
         <w:rPr>
@@ -737,6 +780,16 @@
           <w:sz w:val="28"/>
           <w:szCs w:val="32"/>
         </w:rPr>
+        <w:t>02</w:t>
+      </w:r>
+      <w:r>
+        <w:rPr>
+          <w:rFonts w:ascii="Times New Roman" w:eastAsia="宋体" w:hAnsi="Times New Roman" w:cs="Times New Roman" w:hint="eastAsia"/>
+          <w:b/>
+          <w:bCs/>
+          <w:sz w:val="28"/>
+          <w:szCs w:val="32"/>
+        </w:rPr>
         <w:t>)</w:t>
       </w:r>
     </w:p>
@@ -893,14 +946,8 @@
         <w:rPr>
           <w:rFonts w:ascii="Times New Roman" w:eastAsia="宋体" w:hAnsi="Times New Roman" w:cs="Times New Roman" w:hint="eastAsia"/>
         </w:rPr>
-        <w:t>修复在多人地图中屏蔽不可用所属方开启时，更改所属的平民实际上是治安官</w:t>
-      </w:r>
-      <w:r>
-        <w:rPr>
-          <w:rFonts w:ascii="Times New Roman" w:eastAsia="宋体" w:hAnsi="Times New Roman" w:cs="Times New Roman" w:hint="eastAsia"/>
-        </w:rPr>
         <w:lastRenderedPageBreak/>
-        <w:t>的</w:t>
+        <w:t>修复在多人地图中屏蔽不可用所属方开启时，更改所属的平民实际上是治安官的</w:t>
       </w:r>
       <w:r>
         <w:rPr>
@@ -1941,13 +1988,13 @@
         <w:rPr>
           <w:rFonts w:ascii="Times New Roman" w:eastAsia="宋体" w:hAnsi="Times New Roman" w:cs="Times New Roman" w:hint="eastAsia"/>
         </w:rPr>
+        <w:lastRenderedPageBreak/>
         <w:t>优化单位属性窗口的显示，生命值增加颜色显示块和真实生命值填写，跟随</w:t>
       </w:r>
       <w:r>
         <w:rPr>
           <w:rFonts w:ascii="Times New Roman" w:eastAsia="宋体" w:hAnsi="Times New Roman" w:cs="Times New Roman" w:hint="eastAsia"/>
         </w:rPr>
-        <w:lastRenderedPageBreak/>
         <w:t>ID</w:t>
       </w:r>
       <w:r>
@@ -3027,6 +3074,7 @@
         <w:rPr>
           <w:rFonts w:ascii="Times New Roman" w:eastAsia="宋体" w:hAnsi="Times New Roman" w:cs="Times New Roman" w:hint="eastAsia"/>
         </w:rPr>
+        <w:lastRenderedPageBreak/>
         <w:t>重写单位属性对话框，标签支持搜索，所属方可以显示颜色</w:t>
       </w:r>
     </w:p>
@@ -3045,7 +3093,6 @@
         <w:rPr>
           <w:rFonts w:ascii="Times New Roman" w:eastAsia="宋体" w:hAnsi="Times New Roman" w:cs="Times New Roman" w:hint="eastAsia"/>
         </w:rPr>
-        <w:lastRenderedPageBreak/>
         <w:t>支持将</w:t>
       </w:r>
       <w:r>
@@ -3996,6 +4043,7 @@
         <w:rPr>
           <w:rFonts w:ascii="Times New Roman" w:eastAsia="宋体" w:hAnsi="Times New Roman" w:cs="Times New Roman" w:hint="eastAsia"/>
         </w:rPr>
+        <w:lastRenderedPageBreak/>
         <w:t>修复部分情况下</w:t>
       </w:r>
       <w:r>
@@ -4032,7 +4080,6 @@
         <w:rPr>
           <w:rFonts w:ascii="Times New Roman" w:eastAsia="宋体" w:hAnsi="Times New Roman" w:cs="Times New Roman" w:hint="eastAsia"/>
         </w:rPr>
-        <w:lastRenderedPageBreak/>
         <w:t>新增</w:t>
       </w:r>
       <w:r>
@@ -4987,6 +5034,7 @@
         <w:rPr>
           <w:rFonts w:ascii="Times New Roman" w:eastAsia="宋体" w:hAnsi="Times New Roman" w:cs="Times New Roman" w:hint="eastAsia"/>
         </w:rPr>
+        <w:lastRenderedPageBreak/>
         <w:t>修复触发列表等列表分组错误的</w:t>
       </w:r>
       <w:r>
@@ -5011,7 +5059,6 @@
         <w:rPr>
           <w:rFonts w:ascii="Times New Roman" w:eastAsia="宋体" w:hAnsi="Times New Roman" w:cs="Times New Roman" w:hint="eastAsia"/>
         </w:rPr>
-        <w:lastRenderedPageBreak/>
         <w:t>距离工具箱新增放置自由圆，可以自定义半径</w:t>
       </w:r>
     </w:p>
@@ -5923,6 +5970,7 @@
         <w:rPr>
           <w:rFonts w:ascii="Times New Roman" w:eastAsia="宋体" w:hAnsi="Times New Roman" w:cs="Times New Roman" w:hint="eastAsia"/>
         </w:rPr>
+        <w:lastRenderedPageBreak/>
         <w:t>修复双击触发编辑器行为列表的上移下移按钮时不响应的</w:t>
       </w:r>
       <w:r>
@@ -5947,7 +5995,6 @@
         <w:rPr>
           <w:rFonts w:ascii="Times New Roman" w:eastAsia="宋体" w:hAnsi="Times New Roman" w:cs="Times New Roman" w:hint="eastAsia"/>
         </w:rPr>
-        <w:lastRenderedPageBreak/>
         <w:t>优化覆盖物加载策略，即使素材文件内部标记有误，也会加载前一半图像</w:t>
       </w:r>
     </w:p>
@@ -6802,7 +6849,14 @@
         <w:rPr>
           <w:rFonts w:ascii="Times New Roman" w:eastAsia="宋体" w:hAnsi="Times New Roman" w:cs="Times New Roman" w:hint="eastAsia"/>
         </w:rPr>
-        <w:t>地形生成器新增“忽视地表类型”选项，勾选后不会对任何地表类型进行避让</w:t>
+        <w:t>地形生成器新增“忽视地表类型”选项，勾选后不会对任何地表类型进行避</w:t>
+      </w:r>
+      <w:r>
+        <w:rPr>
+          <w:rFonts w:ascii="Times New Roman" w:eastAsia="宋体" w:hAnsi="Times New Roman" w:cs="Times New Roman" w:hint="eastAsia"/>
+        </w:rPr>
+        <w:lastRenderedPageBreak/>
+        <w:t>让</w:t>
       </w:r>
     </w:p>
     <w:p>
@@ -6820,7 +6874,6 @@
         <w:rPr>
           <w:rFonts w:ascii="Times New Roman" w:eastAsia="宋体" w:hAnsi="Times New Roman" w:cs="Times New Roman" w:hint="eastAsia"/>
         </w:rPr>
-        <w:lastRenderedPageBreak/>
         <w:t>修复部分情况下启动地形生成器时崩溃的</w:t>
       </w:r>
       <w:r>
@@ -7880,6 +7933,7 @@
         <w:rPr>
           <w:rFonts w:ascii="Times New Roman" w:eastAsia="宋体" w:hAnsi="Times New Roman" w:cs="Times New Roman" w:hint="eastAsia"/>
         </w:rPr>
+        <w:lastRenderedPageBreak/>
         <w:t>修复地形浏览器</w:t>
       </w:r>
       <w:r>
@@ -7928,7 +7982,6 @@
         <w:rPr>
           <w:rFonts w:ascii="Times New Roman" w:eastAsia="宋体" w:hAnsi="Times New Roman" w:cs="Times New Roman" w:hint="eastAsia"/>
         </w:rPr>
-        <w:lastRenderedPageBreak/>
         <w:t>在</w:t>
       </w:r>
       <w:r>
@@ -9135,6 +9188,7 @@
         <w:rPr>
           <w:rFonts w:ascii="Times New Roman" w:eastAsia="宋体" w:hAnsi="Times New Roman" w:cs="Times New Roman" w:hint="eastAsia"/>
         </w:rPr>
+        <w:lastRenderedPageBreak/>
         <w:t>优化摆放单位时预览的性能</w:t>
       </w:r>
     </w:p>
@@ -9153,7 +9207,6 @@
         <w:rPr>
           <w:rFonts w:ascii="Times New Roman" w:eastAsia="宋体" w:hAnsi="Times New Roman" w:cs="Times New Roman" w:hint="eastAsia"/>
         </w:rPr>
-        <w:lastRenderedPageBreak/>
         <w:t>修复设置路径点颜色失效的</w:t>
       </w:r>
       <w:r>
@@ -10174,7 +10227,14 @@
         <w:rPr>
           <w:rFonts w:ascii="Times New Roman" w:eastAsia="宋体" w:hAnsi="Times New Roman" w:cs="Times New Roman" w:hint="eastAsia"/>
         </w:rPr>
-        <w:t>，单击绿点可以为地图上的单位设置标签</w:t>
+        <w:t>，单击绿</w:t>
+      </w:r>
+      <w:r>
+        <w:rPr>
+          <w:rFonts w:ascii="Times New Roman" w:eastAsia="宋体" w:hAnsi="Times New Roman" w:cs="Times New Roman" w:hint="eastAsia"/>
+        </w:rPr>
+        <w:lastRenderedPageBreak/>
+        <w:t>点可以为地图上的单位设置标签</w:t>
       </w:r>
     </w:p>
     <w:p>
@@ -10192,7 +10252,6 @@
         <w:rPr>
           <w:rFonts w:ascii="Times New Roman" w:eastAsia="宋体" w:hAnsi="Times New Roman" w:cs="Times New Roman" w:hint="eastAsia"/>
         </w:rPr>
-        <w:lastRenderedPageBreak/>
         <w:t>作战小队、特遣部队、动作脚本编辑器支持通过拖拽</w:t>
       </w:r>
       <w:r>
@@ -11201,6 +11260,7 @@
         <w:rPr>
           <w:rFonts w:ascii="Times New Roman" w:eastAsia="宋体" w:hAnsi="Times New Roman" w:cs="Times New Roman" w:hint="eastAsia"/>
         </w:rPr>
+        <w:lastRenderedPageBreak/>
         <w:t>支持对覆盖物进行分类，详见</w:t>
       </w:r>
       <w:r>
@@ -11225,7 +11285,6 @@
         <w:rPr>
           <w:rFonts w:ascii="Times New Roman" w:eastAsia="宋体" w:hAnsi="Times New Roman" w:cs="Times New Roman" w:hint="eastAsia"/>
         </w:rPr>
-        <w:lastRenderedPageBreak/>
         <w:t>放置铁路时，仅在物品浏览器</w:t>
       </w:r>
       <w:r>
@@ -12280,6 +12339,7 @@
         <w:rPr>
           <w:rFonts w:ascii="Times New Roman" w:eastAsia="宋体" w:hAnsi="Times New Roman" w:cs="Times New Roman" w:hint="eastAsia"/>
         </w:rPr>
+        <w:lastRenderedPageBreak/>
         <w:t>复制粘贴所使用的</w:t>
       </w:r>
       <w:r>
@@ -12298,7 +12358,6 @@
         <w:rPr>
           <w:rFonts w:ascii="Times New Roman" w:eastAsia="宋体" w:hAnsi="Times New Roman" w:cs="Times New Roman" w:hint="eastAsia"/>
         </w:rPr>
-        <w:lastRenderedPageBreak/>
         <w:t>Urb2UbnTileRules</w:t>
       </w:r>
       <w:r>
@@ -13359,6 +13418,7 @@
         <w:rPr>
           <w:rFonts w:ascii="Times New Roman" w:eastAsia="宋体" w:hAnsi="Times New Roman" w:cs="Times New Roman" w:hint="eastAsia"/>
         </w:rPr>
+        <w:lastRenderedPageBreak/>
         <w:t>修复了</w:t>
       </w:r>
       <w:r>
@@ -13401,7 +13461,6 @@
         <w:rPr>
           <w:rFonts w:ascii="Times New Roman" w:eastAsia="宋体" w:hAnsi="Times New Roman" w:cs="Times New Roman" w:hint="eastAsia"/>
         </w:rPr>
-        <w:lastRenderedPageBreak/>
         <w:t>支持在</w:t>
       </w:r>
       <w:r>
@@ -51170,7 +51229,7 @@
         <v:path o:extrusionok="f" gradientshapeok="t" o:connecttype="rect"/>
         <o:lock v:ext="edit" aspectratio="t"/>
       </v:shapetype>
-      <v:shape id="_x0000_i1029" type="#_x0000_t75" style="width:11.55pt;height:11.55pt" o:bullet="t">
+      <v:shape id="_x0000_i1030" type="#_x0000_t75" style="width:11.55pt;height:11.55pt" o:bullet="t">
         <v:imagedata r:id="rId1" o:title="mso9A9A"/>
       </v:shape>
     </w:pict>

</xml_diff>

<commit_message>
fix window bug in second desktop
</commit_message>
<xml_diff>
--- a/Supplementary/文档/FA2SP HDM Edition说明文档.docx
+++ b/Supplementary/文档/FA2SP HDM Edition说明文档.docx
@@ -167,7 +167,14 @@
           <w:rFonts w:ascii="宋体" w:eastAsia="宋体" w:hAnsi="宋体" w:hint="eastAsia"/>
           <w:sz w:val="24"/>
         </w:rPr>
-        <w:t>16</w:t>
+        <w:t>1</w:t>
+      </w:r>
+      <w:r>
+        <w:rPr>
+          <w:rFonts w:ascii="宋体" w:eastAsia="宋体" w:hAnsi="宋体" w:hint="eastAsia"/>
+          <w:sz w:val="24"/>
+        </w:rPr>
+        <w:t>9</w:t>
       </w:r>
     </w:p>
     <w:p>
@@ -229,7 +236,7 @@
           <w:sz w:val="28"/>
           <w:szCs w:val="32"/>
         </w:rPr>
-        <w:t>16</w:t>
+        <w:t>1</w:t>
       </w:r>
       <w:r>
         <w:rPr>
@@ -239,118 +246,142 @@
           <w:sz w:val="28"/>
           <w:szCs w:val="32"/>
         </w:rPr>
-        <w:t>)</w:t>
-      </w:r>
-    </w:p>
-    <w:p>
-      <w:pPr>
-        <w:pStyle w:val="a9"/>
-        <w:numPr>
-          <w:ilvl w:val="0"/>
-          <w:numId w:val="11"/>
-        </w:numPr>
-        <w:rPr>
-          <w:rFonts w:ascii="Times New Roman" w:eastAsia="宋体" w:hAnsi="Times New Roman" w:cs="Times New Roman"/>
-        </w:rPr>
-      </w:pPr>
-      <w:r>
-        <w:rPr>
-          <w:rFonts w:ascii="Times New Roman" w:eastAsia="宋体" w:hAnsi="Times New Roman" w:cs="Times New Roman" w:hint="eastAsia"/>
-        </w:rPr>
-        <w:t>支持最高达</w:t>
-      </w:r>
-      <w:r>
-        <w:rPr>
-          <w:rFonts w:ascii="Times New Roman" w:eastAsia="宋体" w:hAnsi="Times New Roman" w:cs="Times New Roman" w:hint="eastAsia"/>
-        </w:rPr>
-        <w:t>1024*1023</w:t>
-      </w:r>
-      <w:r>
-        <w:rPr>
-          <w:rFonts w:ascii="Times New Roman" w:eastAsia="宋体" w:hAnsi="Times New Roman" w:cs="Times New Roman" w:hint="eastAsia"/>
-        </w:rPr>
-        <w:t>的地图</w:t>
-      </w:r>
-    </w:p>
-    <w:p>
-      <w:pPr>
-        <w:pStyle w:val="a9"/>
-        <w:numPr>
-          <w:ilvl w:val="0"/>
-          <w:numId w:val="11"/>
-        </w:numPr>
-        <w:rPr>
-          <w:rFonts w:ascii="Times New Roman" w:eastAsia="宋体" w:hAnsi="Times New Roman" w:cs="Times New Roman"/>
-        </w:rPr>
-      </w:pPr>
-      <w:r>
-        <w:rPr>
-          <w:rFonts w:ascii="Times New Roman" w:eastAsia="宋体" w:hAnsi="Times New Roman" w:cs="Times New Roman" w:hint="eastAsia"/>
-        </w:rPr>
-        <w:t>优化历史记录的性能和内存占用</w:t>
-      </w:r>
-    </w:p>
-    <w:p>
-      <w:pPr>
-        <w:pStyle w:val="a9"/>
-        <w:numPr>
-          <w:ilvl w:val="0"/>
-          <w:numId w:val="11"/>
-        </w:numPr>
-        <w:rPr>
-          <w:rFonts w:ascii="Times New Roman" w:eastAsia="宋体" w:hAnsi="Times New Roman" w:cs="Times New Roman"/>
-        </w:rPr>
-      </w:pPr>
-      <w:r>
-        <w:rPr>
-          <w:rFonts w:ascii="Times New Roman" w:eastAsia="宋体" w:hAnsi="Times New Roman" w:cs="Times New Roman" w:hint="eastAsia"/>
-        </w:rPr>
-        <w:t>更新了资源包加密方式</w:t>
-      </w:r>
-    </w:p>
-    <w:p>
-      <w:pPr>
-        <w:pStyle w:val="a9"/>
-        <w:numPr>
-          <w:ilvl w:val="0"/>
-          <w:numId w:val="11"/>
-        </w:numPr>
-        <w:rPr>
-          <w:rFonts w:ascii="Times New Roman" w:eastAsia="宋体" w:hAnsi="Times New Roman" w:cs="Times New Roman"/>
-        </w:rPr>
-      </w:pPr>
-      <w:r>
-        <w:rPr>
-          <w:rFonts w:ascii="Times New Roman" w:eastAsia="宋体" w:hAnsi="Times New Roman" w:cs="Times New Roman" w:hint="eastAsia"/>
-        </w:rPr>
-        <w:t>地图检查器内部的触发、小队等条目可以双击跳转</w:t>
-      </w:r>
-    </w:p>
-    <w:p>
-      <w:pPr>
-        <w:pStyle w:val="a9"/>
-        <w:numPr>
-          <w:ilvl w:val="0"/>
-          <w:numId w:val="10"/>
-        </w:numPr>
-        <w:rPr>
-          <w:rFonts w:ascii="Times New Roman" w:eastAsia="宋体" w:hAnsi="Times New Roman" w:cs="Times New Roman"/>
+        <w:t>9</w:t>
+      </w:r>
+      <w:r>
+        <w:rPr>
+          <w:rFonts w:ascii="Times New Roman" w:eastAsia="宋体" w:hAnsi="Times New Roman" w:cs="Times New Roman" w:hint="eastAsia"/>
           <w:b/>
           <w:bCs/>
           <w:sz w:val="28"/>
           <w:szCs w:val="32"/>
         </w:rPr>
-      </w:pPr>
-      <w:r>
-        <w:rPr>
-          <w:rFonts w:ascii="Times New Roman" w:eastAsia="宋体" w:hAnsi="Times New Roman" w:cs="Times New Roman" w:hint="eastAsia"/>
+        <w:t>)</w:t>
+      </w:r>
+    </w:p>
+    <w:p>
+      <w:pPr>
+        <w:pStyle w:val="a9"/>
+        <w:numPr>
+          <w:ilvl w:val="0"/>
+          <w:numId w:val="11"/>
+        </w:numPr>
+        <w:rPr>
+          <w:rFonts w:ascii="Times New Roman" w:eastAsia="宋体" w:hAnsi="Times New Roman" w:cs="Times New Roman"/>
+        </w:rPr>
+      </w:pPr>
+      <w:r>
+        <w:rPr>
+          <w:rFonts w:ascii="Times New Roman" w:eastAsia="宋体" w:hAnsi="Times New Roman" w:cs="Times New Roman" w:hint="eastAsia"/>
+        </w:rPr>
+        <w:t>支持最高达</w:t>
+      </w:r>
+      <w:r>
+        <w:rPr>
+          <w:rFonts w:ascii="Times New Roman" w:eastAsia="宋体" w:hAnsi="Times New Roman" w:cs="Times New Roman" w:hint="eastAsia"/>
+        </w:rPr>
+        <w:t>1024*1023</w:t>
+      </w:r>
+      <w:r>
+        <w:rPr>
+          <w:rFonts w:ascii="Times New Roman" w:eastAsia="宋体" w:hAnsi="Times New Roman" w:cs="Times New Roman" w:hint="eastAsia"/>
+        </w:rPr>
+        <w:t>的地图</w:t>
+      </w:r>
+    </w:p>
+    <w:p>
+      <w:pPr>
+        <w:pStyle w:val="a9"/>
+        <w:numPr>
+          <w:ilvl w:val="0"/>
+          <w:numId w:val="11"/>
+        </w:numPr>
+        <w:rPr>
+          <w:rFonts w:ascii="Times New Roman" w:eastAsia="宋体" w:hAnsi="Times New Roman" w:cs="Times New Roman"/>
+        </w:rPr>
+      </w:pPr>
+      <w:r>
+        <w:rPr>
+          <w:rFonts w:ascii="Times New Roman" w:eastAsia="宋体" w:hAnsi="Times New Roman" w:cs="Times New Roman" w:hint="eastAsia"/>
+        </w:rPr>
+        <w:t>优化历史记录的性能和内存占用</w:t>
+      </w:r>
+    </w:p>
+    <w:p>
+      <w:pPr>
+        <w:pStyle w:val="a9"/>
+        <w:numPr>
+          <w:ilvl w:val="0"/>
+          <w:numId w:val="11"/>
+        </w:numPr>
+        <w:rPr>
+          <w:rFonts w:ascii="Times New Roman" w:eastAsia="宋体" w:hAnsi="Times New Roman" w:cs="Times New Roman"/>
+        </w:rPr>
+      </w:pPr>
+      <w:r>
+        <w:rPr>
+          <w:rFonts w:ascii="Times New Roman" w:eastAsia="宋体" w:hAnsi="Times New Roman" w:cs="Times New Roman" w:hint="eastAsia"/>
+        </w:rPr>
+        <w:t>更新了资源包加密方式</w:t>
+      </w:r>
+    </w:p>
+    <w:p>
+      <w:pPr>
+        <w:pStyle w:val="a9"/>
+        <w:numPr>
+          <w:ilvl w:val="0"/>
+          <w:numId w:val="11"/>
+        </w:numPr>
+        <w:rPr>
+          <w:rFonts w:ascii="Times New Roman" w:eastAsia="宋体" w:hAnsi="Times New Roman" w:cs="Times New Roman"/>
+        </w:rPr>
+      </w:pPr>
+      <w:r>
+        <w:rPr>
+          <w:rFonts w:ascii="Times New Roman" w:eastAsia="宋体" w:hAnsi="Times New Roman" w:cs="Times New Roman" w:hint="eastAsia"/>
+        </w:rPr>
+        <w:t>地图检查器内部的触发、小队等条目可以双击跳转</w:t>
+      </w:r>
+    </w:p>
+    <w:p>
+      <w:pPr>
+        <w:pStyle w:val="a9"/>
+        <w:numPr>
+          <w:ilvl w:val="0"/>
+          <w:numId w:val="11"/>
+        </w:numPr>
+        <w:rPr>
+          <w:rFonts w:ascii="Times New Roman" w:eastAsia="宋体" w:hAnsi="Times New Roman" w:cs="Times New Roman"/>
+        </w:rPr>
+      </w:pPr>
+      <w:r>
+        <w:rPr>
+          <w:rFonts w:ascii="Times New Roman" w:eastAsia="宋体" w:hAnsi="Times New Roman" w:cs="Times New Roman" w:hint="eastAsia"/>
+        </w:rPr>
+        <w:t>修复了切换光照时鼠标当前动作消失的</w:t>
+      </w:r>
+      <w:r>
+        <w:rPr>
+          <w:rFonts w:ascii="Times New Roman" w:eastAsia="宋体" w:hAnsi="Times New Roman" w:cs="Times New Roman" w:hint="eastAsia"/>
+        </w:rPr>
+        <w:t>bug</w:t>
+      </w:r>
+    </w:p>
+    <w:p>
+      <w:pPr>
+        <w:pStyle w:val="a9"/>
+        <w:numPr>
+          <w:ilvl w:val="0"/>
+          <w:numId w:val="10"/>
+        </w:numPr>
+        <w:rPr>
+          <w:rFonts w:ascii="Times New Roman" w:eastAsia="宋体" w:hAnsi="Times New Roman" w:cs="Times New Roman"/>
           <w:b/>
           <w:bCs/>
           <w:sz w:val="28"/>
           <w:szCs w:val="32"/>
         </w:rPr>
-        <w:t>1.5.3 (2026.</w:t>
-      </w:r>
+      </w:pPr>
       <w:r>
         <w:rPr>
           <w:rFonts w:ascii="Times New Roman" w:eastAsia="宋体" w:hAnsi="Times New Roman" w:cs="Times New Roman" w:hint="eastAsia"/>
@@ -359,7 +390,7 @@
           <w:sz w:val="28"/>
           <w:szCs w:val="32"/>
         </w:rPr>
-        <w:t>10</w:t>
+        <w:t>1.5.3 (2026.</w:t>
       </w:r>
       <w:r>
         <w:rPr>
@@ -369,7 +400,7 @@
           <w:sz w:val="28"/>
           <w:szCs w:val="32"/>
         </w:rPr>
-        <w:t>.</w:t>
+        <w:t>10</w:t>
       </w:r>
       <w:r>
         <w:rPr>
@@ -379,7 +410,7 @@
           <w:sz w:val="28"/>
           <w:szCs w:val="32"/>
         </w:rPr>
-        <w:t>01</w:t>
+        <w:t>.</w:t>
       </w:r>
       <w:r>
         <w:rPr>
@@ -389,6 +420,16 @@
           <w:sz w:val="28"/>
           <w:szCs w:val="32"/>
         </w:rPr>
+        <w:t>01</w:t>
+      </w:r>
+      <w:r>
+        <w:rPr>
+          <w:rFonts w:ascii="Times New Roman" w:eastAsia="宋体" w:hAnsi="Times New Roman" w:cs="Times New Roman" w:hint="eastAsia"/>
+          <w:b/>
+          <w:bCs/>
+          <w:sz w:val="28"/>
+          <w:szCs w:val="32"/>
+        </w:rPr>
         <w:t>)</w:t>
       </w:r>
     </w:p>
@@ -923,6 +964,7 @@
         <w:rPr>
           <w:rFonts w:ascii="Times New Roman" w:eastAsia="宋体" w:hAnsi="Times New Roman" w:cs="Times New Roman" w:hint="eastAsia"/>
         </w:rPr>
+        <w:lastRenderedPageBreak/>
         <w:t>修复同时使用增加</w:t>
       </w:r>
       <w:r>
@@ -959,7 +1001,6 @@
         <w:rPr>
           <w:rFonts w:ascii="Times New Roman" w:eastAsia="宋体" w:hAnsi="Times New Roman" w:cs="Times New Roman" w:hint="eastAsia"/>
         </w:rPr>
-        <w:lastRenderedPageBreak/>
         <w:t>隐藏图层时，删除笔刷不会删除掉被隐藏的类型</w:t>
       </w:r>
     </w:p>
@@ -1911,6 +1952,7 @@
         <w:rPr>
           <w:rFonts w:ascii="Times New Roman" w:eastAsia="宋体" w:hAnsi="Times New Roman" w:cs="Times New Roman" w:hint="eastAsia"/>
         </w:rPr>
+        <w:lastRenderedPageBreak/>
         <w:t>资源包打包脚本</w:t>
       </w:r>
       <w:r>
@@ -1947,14 +1989,7 @@
         <w:rPr>
           <w:rFonts w:ascii="Times New Roman" w:eastAsia="宋体" w:hAnsi="Times New Roman" w:cs="Times New Roman" w:hint="eastAsia"/>
         </w:rPr>
-        <w:t>解析后打包其</w:t>
-      </w:r>
-      <w:r>
-        <w:rPr>
-          <w:rFonts w:ascii="Times New Roman" w:eastAsia="宋体" w:hAnsi="Times New Roman" w:cs="Times New Roman" w:hint="eastAsia"/>
-        </w:rPr>
-        <w:lastRenderedPageBreak/>
-        <w:t>内部文件</w:t>
+        <w:t>解析后打包其内部文件</w:t>
       </w:r>
     </w:p>
     <w:p>
@@ -3075,6 +3110,7 @@
         <w:rPr>
           <w:rFonts w:ascii="Times New Roman" w:eastAsia="宋体" w:hAnsi="Times New Roman" w:cs="Times New Roman" w:hint="eastAsia"/>
         </w:rPr>
+        <w:lastRenderedPageBreak/>
         <w:t>修复渲染部分</w:t>
       </w:r>
       <w:r>
@@ -3111,7 +3147,6 @@
         <w:rPr>
           <w:rFonts w:ascii="Times New Roman" w:eastAsia="宋体" w:hAnsi="Times New Roman" w:cs="Times New Roman" w:hint="eastAsia"/>
         </w:rPr>
-        <w:lastRenderedPageBreak/>
         <w:t>基本设置窗口增加背景音乐和载入界面背景音乐选项</w:t>
       </w:r>
     </w:p>
@@ -4008,6 +4043,7 @@
         <w:rPr>
           <w:rFonts w:ascii="Times New Roman" w:eastAsia="宋体" w:hAnsi="Times New Roman" w:cs="Times New Roman" w:hint="eastAsia"/>
         </w:rPr>
+        <w:lastRenderedPageBreak/>
         <w:t>优化地形浏览器其余列表的加载速度</w:t>
       </w:r>
     </w:p>
@@ -4026,7 +4062,6 @@
         <w:rPr>
           <w:rFonts w:ascii="Times New Roman" w:eastAsia="宋体" w:hAnsi="Times New Roman" w:cs="Times New Roman" w:hint="eastAsia"/>
         </w:rPr>
-        <w:lastRenderedPageBreak/>
         <w:t>修复部分索引超过</w:t>
       </w:r>
       <w:r>
@@ -5059,6 +5094,7 @@
         <w:rPr>
           <w:rFonts w:ascii="Times New Roman" w:eastAsia="宋体" w:hAnsi="Times New Roman" w:cs="Times New Roman" w:hint="eastAsia"/>
         </w:rPr>
+        <w:lastRenderedPageBreak/>
         <w:t>LoadObjectsOnInit</w:t>
       </w:r>
     </w:p>
@@ -5077,7 +5113,6 @@
         <w:rPr>
           <w:rFonts w:ascii="Times New Roman" w:eastAsia="宋体" w:hAnsi="Times New Roman" w:cs="Times New Roman" w:hint="eastAsia"/>
         </w:rPr>
-        <w:lastRenderedPageBreak/>
         <w:t>重写所属方编辑器，颜色下拉菜单可以预览颜色，支持</w:t>
       </w:r>
       <w:r>
@@ -5947,6 +5982,7 @@
         <w:rPr>
           <w:rFonts w:ascii="Times New Roman" w:eastAsia="宋体" w:hAnsi="Times New Roman" w:cs="Times New Roman" w:hint="eastAsia"/>
         </w:rPr>
+        <w:lastRenderedPageBreak/>
         <w:t>显著</w:t>
       </w:r>
       <w:r>
@@ -5983,7 +6019,6 @@
         <w:rPr>
           <w:rFonts w:ascii="Times New Roman" w:eastAsia="宋体" w:hAnsi="Times New Roman" w:cs="Times New Roman" w:hint="eastAsia"/>
         </w:rPr>
-        <w:lastRenderedPageBreak/>
         <w:t>显著提升触发编辑器、小队编辑器等编辑器的效率</w:t>
       </w:r>
     </w:p>
@@ -6874,6 +6909,7 @@
         <w:rPr>
           <w:rFonts w:ascii="Times New Roman" w:eastAsia="宋体" w:hAnsi="Times New Roman" w:cs="Times New Roman" w:hint="eastAsia"/>
         </w:rPr>
+        <w:lastRenderedPageBreak/>
         <w:t>GridObjectViewer.LoadObjectBrowserCategory</w:t>
       </w:r>
     </w:p>
@@ -6892,7 +6928,6 @@
         <w:rPr>
           <w:rFonts w:ascii="Times New Roman" w:eastAsia="宋体" w:hAnsi="Times New Roman" w:cs="Times New Roman" w:hint="eastAsia"/>
         </w:rPr>
-        <w:lastRenderedPageBreak/>
         <w:t>修复全局搜索的数个</w:t>
       </w:r>
       <w:r>
@@ -7898,6 +7933,7 @@
         <w:rPr>
           <w:rFonts w:ascii="Times New Roman" w:eastAsia="宋体" w:hAnsi="Times New Roman" w:cs="Times New Roman" w:hint="eastAsia"/>
         </w:rPr>
+        <w:lastRenderedPageBreak/>
         <w:t>可以在</w:t>
       </w:r>
       <w:r>
@@ -7916,7 +7952,6 @@
         <w:rPr>
           <w:rFonts w:ascii="Times New Roman" w:eastAsia="宋体" w:hAnsi="Times New Roman" w:cs="Times New Roman" w:hint="eastAsia"/>
         </w:rPr>
-        <w:lastRenderedPageBreak/>
         <w:t>FA2Ignore</w:t>
       </w:r>
       <w:r>
@@ -9033,6 +9068,7 @@
           <w:kern w:val="0"/>
           <w14:ligatures w14:val="none"/>
         </w:rPr>
+        <w:lastRenderedPageBreak/>
         <w:t>支持为</w:t>
       </w:r>
       <w:r>
@@ -9095,7 +9131,6 @@
           <w:kern w:val="0"/>
           <w14:ligatures w14:val="none"/>
         </w:rPr>
-        <w:lastRenderedPageBreak/>
         <w:t>支持新版本检查，若检查到新版本会在窗口标题上显示</w:t>
       </w:r>
     </w:p>
@@ -10150,7 +10185,14 @@
         <w:rPr>
           <w:rFonts w:ascii="Times New Roman" w:eastAsia="宋体" w:hAnsi="Times New Roman" w:cs="Times New Roman" w:hint="eastAsia"/>
         </w:rPr>
-        <w:t>；由于技术限制，保存时并不能固定已有的</w:t>
+        <w:t>；由于技术限制，保存时并不能</w:t>
+      </w:r>
+      <w:r>
+        <w:rPr>
+          <w:rFonts w:ascii="Times New Roman" w:eastAsia="宋体" w:hAnsi="Times New Roman" w:cs="Times New Roman" w:hint="eastAsia"/>
+        </w:rPr>
+        <w:lastRenderedPageBreak/>
+        <w:t>固定已有的</w:t>
       </w:r>
       <w:r>
         <w:rPr>
@@ -10180,7 +10222,6 @@
         <w:rPr>
           <w:rFonts w:ascii="Times New Roman" w:eastAsia="宋体" w:hAnsi="Times New Roman" w:cs="Times New Roman" w:hint="eastAsia"/>
         </w:rPr>
-        <w:lastRenderedPageBreak/>
         <w:t>小队变更时会即时刷新触发编辑器对应菜单</w:t>
       </w:r>
     </w:p>
@@ -11129,6 +11170,7 @@
         <w:rPr>
           <w:rFonts w:ascii="Times New Roman" w:eastAsia="宋体" w:hAnsi="Times New Roman" w:cs="Times New Roman" w:hint="eastAsia"/>
         </w:rPr>
+        <w:lastRenderedPageBreak/>
         <w:t>支持附加单位及替身显示</w:t>
       </w:r>
     </w:p>
@@ -11147,7 +11189,6 @@
         <w:rPr>
           <w:rFonts w:ascii="Times New Roman" w:eastAsia="宋体" w:hAnsi="Times New Roman" w:cs="Times New Roman" w:hint="eastAsia"/>
         </w:rPr>
-        <w:lastRenderedPageBreak/>
         <w:t>修复继承</w:t>
       </w:r>
       <w:r>
@@ -50620,7 +50661,7 @@
         <v:path o:extrusionok="f" gradientshapeok="t" o:connecttype="rect"/>
         <o:lock v:ext="edit" aspectratio="t"/>
       </v:shapetype>
-      <v:shape id="_x0000_i1030" type="#_x0000_t75" style="width:11.55pt;height:11.55pt" o:bullet="t">
+      <v:shape id="_x0000_i1033" type="#_x0000_t75" style="width:11.25pt;height:11.25pt" o:bullet="t">
         <v:imagedata r:id="rId1" o:title="mso9A9A"/>
       </v:shape>
     </w:pict>

</xml_diff>